<commit_message>
docs: recordatorio, restablecer contraseña y decisiones 18 a 20
- Contrato de API y manuales técnico, de instalación y de usuario con los
  endpoints nuevos y las variables del recordatorio.
- La nota de la página de gestionar cita pasa a ser la decisión 18; se
  agregan la 19 (recordatorio y claves) y la 20 (saltos de línea).
- Pruebas: 117 de 117 correctas.
</commit_message>
<xml_diff>
--- a/docs/para-drive/Contrato de la API.docx
+++ b/docs/para-drive/Contrato de la API.docx
@@ -3094,89 +3094,101 @@
         <w:t xml:space="preserve"> </w:t>
       </w:r>
       <w:r>
-        <w:t xml:space="preserve">- Conviene un contador de pendientes visible en el menú del panel.</w:t>
-      </w:r>
-    </w:p>
-    <w:p>
-      <w:pPr>
-        <w:pStyle w:val="BodyText"/>
-      </w:pPr>
+        <w:t xml:space="preserve">-</w:t>
+      </w:r>
+      <w:r>
+        <w:t xml:space="preserve"> </w:t>
+      </w:r>
       <w:r>
         <w:rPr>
           <w:bCs/>
           <w:b/>
         </w:rPr>
-        <w:t xml:space="preserve">Pacientes</w:t>
-      </w:r>
-      <w:r>
-        <w:t xml:space="preserve"> </w:t>
-      </w:r>
-      <w:r>
-        <w:t xml:space="preserve">-</w:t>
-      </w:r>
-      <w:r>
-        <w:t xml:space="preserve"> </w:t>
-      </w:r>
-      <w:r>
-        <w:rPr>
-          <w:rStyle w:val="VerbatimChar"/>
-        </w:rPr>
-        <w:t xml:space="preserve">POST /pacientes</w:t>
-      </w:r>
-      <w:r>
-        <w:t xml:space="preserve"> </w:t>
-      </w:r>
-      <w:r>
-        <w:rPr>
-          <w:rStyle w:val="VerbatimChar"/>
-        </w:rPr>
-        <w:t xml:space="preserve">{ nombreCompleto, documento, correo, telefono, autorizacionDatos: true }</w:t>
-      </w:r>
-      <w:r>
-        <w:t xml:space="preserve"> </w:t>
-      </w:r>
-      <w:r>
-        <w:t xml:space="preserve">→ 201. La respuesta trae la</w:t>
-      </w:r>
-      <w:r>
-        <w:t xml:space="preserve"> </w:t>
-      </w:r>
-      <w:r>
-        <w:rPr>
-          <w:rStyle w:val="VerbatimChar"/>
-        </w:rPr>
-        <w:t xml:space="preserve">contrasenaTemporal</w:t>
-      </w:r>
-      <w:r>
-        <w:t xml:space="preserve">, que se muestra</w:t>
-      </w:r>
-      <w:r>
-        <w:t xml:space="preserve"> </w:t>
-      </w:r>
+        <w:t xml:space="preserve">Recordatorios del día anterior:</w:t>
+      </w:r>
+      <w:r>
+        <w:t xml:space="preserve"> </w:t>
+      </w:r>
+      <w:r>
+        <w:t xml:space="preserve">el servidor los genera solo cada 30 minutos dentro del horario configurado y aparecen como mensajes pendientes de tipo</w:t>
+      </w:r>
+      <w:r>
+        <w:t xml:space="preserve"> </w:t>
+      </w:r>
+      <w:r>
+        <w:rPr>
+          <w:rStyle w:val="VerbatimChar"/>
+        </w:rPr>
+        <w:t xml:space="preserve">recordatorio</w:t>
+      </w:r>
+      <w:r>
+        <w:t xml:space="preserve"> </w:t>
+      </w:r>
+      <w:r>
+        <w:t xml:space="preserve">(sin enlace). Para generarlos ya:</w:t>
+      </w:r>
+      <w:r>
+        <w:t xml:space="preserve"> </w:t>
+      </w:r>
+      <w:r>
+        <w:rPr>
+          <w:rStyle w:val="VerbatimChar"/>
+        </w:rPr>
+        <w:t xml:space="preserve">POST /admin/recordatorios</w:t>
+      </w:r>
+      <w:r>
+        <w:t xml:space="preserve"> </w:t>
+      </w:r>
+      <w:r>
+        <w:t xml:space="preserve">→</w:t>
+      </w:r>
+      <w:r>
+        <w:t xml:space="preserve"> </w:t>
+      </w:r>
+      <w:r>
+        <w:rPr>
+          <w:rStyle w:val="VerbatimChar"/>
+        </w:rPr>
+        <w:t xml:space="preserve">{ fecha, revisadas, resultados: [{ citaId, estado }] }</w:t>
+      </w:r>
+      <w:r>
+        <w:t xml:space="preserve">. Sugerencia: botón</w:t>
+      </w:r>
+      <w:r>
+        <w:t xml:space="preserve"> </w:t>
+      </w:r>
+      <w:r>
+        <w:t xml:space="preserve">“</w:t>
+      </w:r>
+      <w:r>
+        <w:t xml:space="preserve">Generar recordatorios de mañana</w:t>
+      </w:r>
+      <w:r>
+        <w:t xml:space="preserve">”</w:t>
+      </w:r>
+      <w:r>
+        <w:t xml:space="preserve"> </w:t>
+      </w:r>
+      <w:r>
+        <w:t xml:space="preserve">en la sección de mensajes.</w:t>
+      </w:r>
+      <w:r>
+        <w:t xml:space="preserve"> </w:t>
+      </w:r>
+      <w:r>
+        <w:t xml:space="preserve">- Conviene un contador de pendientes visible en el menú del panel.</w:t>
+      </w:r>
+    </w:p>
+    <w:p>
+      <w:pPr>
+        <w:pStyle w:val="BodyText"/>
+      </w:pPr>
       <w:r>
         <w:rPr>
           <w:bCs/>
           <w:b/>
         </w:rPr>
-        <w:t xml:space="preserve">una sola vez</w:t>
-      </w:r>
-      <w:r>
-        <w:t xml:space="preserve"> </w:t>
-      </w:r>
-      <w:r>
-        <w:t xml:space="preserve">con botón de copiar, y</w:t>
-      </w:r>
-      <w:r>
-        <w:t xml:space="preserve"> </w:t>
-      </w:r>
-      <w:r>
-        <w:rPr>
-          <w:rStyle w:val="VerbatimChar"/>
-        </w:rPr>
-        <w:t xml:space="preserve">citasVinculadas</w:t>
-      </w:r>
-      <w:r>
-        <w:t xml:space="preserve">, que son las citas que pidió antes sin cuenta.</w:t>
+        <w:t xml:space="preserve">Pacientes</w:t>
       </w:r>
       <w:r>
         <w:t xml:space="preserve"> </w:t>
@@ -3191,25 +3203,62 @@
         <w:rPr>
           <w:rStyle w:val="VerbatimChar"/>
         </w:rPr>
-        <w:t xml:space="preserve">GET /pacientes?q=</w:t>
-      </w:r>
-      <w:r>
-        <w:t xml:space="preserve"> </w:t>
-      </w:r>
-      <w:r>
-        <w:t xml:space="preserve">→ búsqueda por nombre, documento o correo.</w:t>
-      </w:r>
-    </w:p>
-    <w:p>
-      <w:pPr>
-        <w:pStyle w:val="BodyText"/>
-      </w:pPr>
+        <w:t xml:space="preserve">POST /pacientes</w:t>
+      </w:r>
+      <w:r>
+        <w:t xml:space="preserve"> </w:t>
+      </w:r>
+      <w:r>
+        <w:rPr>
+          <w:rStyle w:val="VerbatimChar"/>
+        </w:rPr>
+        <w:t xml:space="preserve">{ nombreCompleto, documento, correo, telefono, autorizacionDatos: true }</w:t>
+      </w:r>
+      <w:r>
+        <w:t xml:space="preserve"> </w:t>
+      </w:r>
+      <w:r>
+        <w:t xml:space="preserve">→ 201. La respuesta trae la</w:t>
+      </w:r>
+      <w:r>
+        <w:t xml:space="preserve"> </w:t>
+      </w:r>
+      <w:r>
+        <w:rPr>
+          <w:rStyle w:val="VerbatimChar"/>
+        </w:rPr>
+        <w:t xml:space="preserve">contrasenaTemporal</w:t>
+      </w:r>
+      <w:r>
+        <w:t xml:space="preserve">, que se muestra</w:t>
+      </w:r>
+      <w:r>
+        <w:t xml:space="preserve"> </w:t>
+      </w:r>
       <w:r>
         <w:rPr>
           <w:bCs/>
           <w:b/>
         </w:rPr>
-        <w:t xml:space="preserve">Ficha del paciente e historia clínica</w:t>
+        <w:t xml:space="preserve">una sola vez</w:t>
+      </w:r>
+      <w:r>
+        <w:t xml:space="preserve"> </w:t>
+      </w:r>
+      <w:r>
+        <w:t xml:space="preserve">con botón de copiar, y</w:t>
+      </w:r>
+      <w:r>
+        <w:t xml:space="preserve"> </w:t>
+      </w:r>
+      <w:r>
+        <w:rPr>
+          <w:rStyle w:val="VerbatimChar"/>
+        </w:rPr>
+        <w:t xml:space="preserve">citasVinculadas</w:t>
+      </w:r>
+      <w:r>
+        <w:t xml:space="preserve">, que son las citas que pidió antes sin cuenta.</w:t>
       </w:r>
       <w:r>
         <w:t xml:space="preserve"> </w:t>
@@ -3224,7 +3273,28 @@
         <w:rPr>
           <w:rStyle w:val="VerbatimChar"/>
         </w:rPr>
-        <w:t xml:space="preserve">GET /pacientes/:id</w:t>
+        <w:t xml:space="preserve">GET /pacientes?q=</w:t>
+      </w:r>
+      <w:r>
+        <w:t xml:space="preserve"> </w:t>
+      </w:r>
+      <w:r>
+        <w:t xml:space="preserve">→ búsqueda por nombre, documento o correo.</w:t>
+      </w:r>
+      <w:r>
+        <w:t xml:space="preserve"> </w:t>
+      </w:r>
+      <w:r>
+        <w:t xml:space="preserve">-</w:t>
+      </w:r>
+      <w:r>
+        <w:t xml:space="preserve"> </w:t>
+      </w:r>
+      <w:r>
+        <w:rPr>
+          <w:rStyle w:val="VerbatimChar"/>
+        </w:rPr>
+        <w:t xml:space="preserve">POST /pacientes/:id/restablecer-contrasena</w:t>
       </w:r>
       <w:r>
         <w:t xml:space="preserve"> </w:t>
@@ -3239,142 +3309,25 @@
         <w:rPr>
           <w:rStyle w:val="VerbatimChar"/>
         </w:rPr>
-        <w:t xml:space="preserve">{ paciente: { id, nombreCompleto, documento, correo, telefono, activo, ... }, citas: [...], historia: [...] }</w:t>
-      </w:r>
-      <w:r>
-        <w:t xml:space="preserve"> </w:t>
-      </w:r>
-      <w:r>
-        <w:t xml:space="preserve">— la pantalla de ficha en una sola petición.</w:t>
-      </w:r>
-      <w:r>
-        <w:t xml:space="preserve"> </w:t>
-      </w:r>
-      <w:r>
-        <w:t xml:space="preserve">-</w:t>
-      </w:r>
-      <w:r>
-        <w:t xml:space="preserve"> </w:t>
-      </w:r>
-      <w:r>
-        <w:rPr>
-          <w:rStyle w:val="VerbatimChar"/>
-        </w:rPr>
-        <w:t xml:space="preserve">GET /pacientes/:id/historia</w:t>
-      </w:r>
-      <w:r>
-        <w:t xml:space="preserve"> </w:t>
-      </w:r>
-      <w:r>
-        <w:t xml:space="preserve">→ entradas, la atención más reciente primero:</w:t>
-      </w:r>
-      <w:r>
-        <w:t xml:space="preserve"> </w:t>
-      </w:r>
-      <w:r>
-        <w:rPr>
-          <w:rStyle w:val="VerbatimChar"/>
-        </w:rPr>
-        <w:t xml:space="preserve">[{ id, fechaAtencion, especialidad, especialista, citaId, procedimiento, notas, corrigeA, correcciones: [ids], autor, creadoEn }]</w:t>
-      </w:r>
-      <w:r>
-        <w:t xml:space="preserve">.</w:t>
-      </w:r>
-      <w:r>
-        <w:t xml:space="preserve"> </w:t>
-      </w:r>
-      <w:r>
-        <w:t xml:space="preserve">-</w:t>
-      </w:r>
-      <w:r>
-        <w:t xml:space="preserve"> </w:t>
-      </w:r>
-      <w:r>
-        <w:rPr>
-          <w:rStyle w:val="VerbatimChar"/>
-        </w:rPr>
-        <w:t xml:space="preserve">POST /pacientes/:id/historia</w:t>
-      </w:r>
-      <w:r>
-        <w:t xml:space="preserve"> </w:t>
-      </w:r>
-      <w:r>
-        <w:rPr>
-          <w:rStyle w:val="VerbatimChar"/>
-        </w:rPr>
-        <w:t xml:space="preserve">{ fechaAtencion, procedimiento, notas?, especialidadId?, especialistaId?, citaId? }</w:t>
-      </w:r>
-      <w:r>
-        <w:t xml:space="preserve"> </w:t>
-      </w:r>
-      <w:r>
-        <w:t xml:space="preserve">→ 201. Con</w:t>
-      </w:r>
-      <w:r>
-        <w:t xml:space="preserve"> </w:t>
-      </w:r>
-      <w:r>
-        <w:rPr>
-          <w:rStyle w:val="VerbatimChar"/>
-        </w:rPr>
-        <w:t xml:space="preserve">citaId</w:t>
-      </w:r>
-      <w:r>
-        <w:t xml:space="preserve"> </w:t>
-      </w:r>
-      <w:r>
-        <w:t xml:space="preserve">(de ese paciente) se pueden omitir fecha, especialidad y especialista. Fecha futura → 400.</w:t>
-      </w:r>
-      <w:r>
-        <w:t xml:space="preserve"> </w:t>
-      </w:r>
-      <w:r>
-        <w:t xml:space="preserve">-</w:t>
-      </w:r>
-      <w:r>
-        <w:t xml:space="preserve"> </w:t>
-      </w:r>
-      <w:r>
-        <w:rPr>
-          <w:rStyle w:val="VerbatimChar"/>
-        </w:rPr>
-        <w:t xml:space="preserve">POST /admin/historia/:id/correccion</w:t>
-      </w:r>
-      <w:r>
-        <w:t xml:space="preserve"> </w:t>
-      </w:r>
-      <w:r>
-        <w:rPr>
-          <w:rStyle w:val="VerbatimChar"/>
-        </w:rPr>
-        <w:t xml:space="preserve">{ notas, procedimiento?, fechaAtencion? }</w:t>
-      </w:r>
-      <w:r>
-        <w:t xml:space="preserve"> </w:t>
-      </w:r>
-      <w:r>
-        <w:t xml:space="preserve">→ 201: crea una entrada nueva que corrige a la indicada;</w:t>
-      </w:r>
-      <w:r>
-        <w:t xml:space="preserve"> </w:t>
-      </w:r>
-      <w:r>
-        <w:rPr>
-          <w:rStyle w:val="VerbatimChar"/>
-        </w:rPr>
-        <w:t xml:space="preserve">notas</w:t>
-      </w:r>
-      <w:r>
-        <w:t xml:space="preserve"> </w:t>
-      </w:r>
-      <w:r>
-        <w:t xml:space="preserve">(qué se corrige y por qué) es obligatorio.</w:t>
-      </w:r>
-      <w:r>
-        <w:t xml:space="preserve"> </w:t>
-      </w:r>
-      <w:r>
-        <w:t xml:space="preserve">-</w:t>
+        <w:t xml:space="preserve">{ mensaje, contrasenaTemporal }</w:t>
+      </w:r>
+      <w:r>
+        <w:t xml:space="preserve">:</w:t>
+      </w:r>
+      <w:r>
+        <w:t xml:space="preserve"> </w:t>
+      </w:r>
+      <w:r>
+        <w:t xml:space="preserve">“</w:t>
+      </w:r>
+      <w:r>
+        <w:t xml:space="preserve">olvidé mi contraseña</w:t>
+      </w:r>
+      <w:r>
+        <w:t xml:space="preserve">”</w:t>
+      </w:r>
+      <w:r>
+        <w:t xml:space="preserve">. La clave temporal se muestra</w:t>
       </w:r>
       <w:r>
         <w:t xml:space="preserve"> </w:t>
@@ -3384,6 +3337,199 @@
           <w:bCs/>
           <w:b/>
         </w:rPr>
+        <w:t xml:space="preserve">una sola vez</w:t>
+      </w:r>
+      <w:r>
+        <w:t xml:space="preserve"> </w:t>
+      </w:r>
+      <w:r>
+        <w:t xml:space="preserve">(botón de copiar) y el paciente deberá cambiarla al ingresar. Va como botón en la ficha del paciente, con confirmación.</w:t>
+      </w:r>
+    </w:p>
+    <w:p>
+      <w:pPr>
+        <w:pStyle w:val="BodyText"/>
+      </w:pPr>
+      <w:r>
+        <w:rPr>
+          <w:bCs/>
+          <w:b/>
+        </w:rPr>
+        <w:t xml:space="preserve">Ficha del paciente e historia clínica</w:t>
+      </w:r>
+      <w:r>
+        <w:t xml:space="preserve"> </w:t>
+      </w:r>
+      <w:r>
+        <w:t xml:space="preserve">-</w:t>
+      </w:r>
+      <w:r>
+        <w:t xml:space="preserve"> </w:t>
+      </w:r>
+      <w:r>
+        <w:rPr>
+          <w:rStyle w:val="VerbatimChar"/>
+        </w:rPr>
+        <w:t xml:space="preserve">GET /pacientes/:id</w:t>
+      </w:r>
+      <w:r>
+        <w:t xml:space="preserve"> </w:t>
+      </w:r>
+      <w:r>
+        <w:t xml:space="preserve">→</w:t>
+      </w:r>
+      <w:r>
+        <w:t xml:space="preserve"> </w:t>
+      </w:r>
+      <w:r>
+        <w:rPr>
+          <w:rStyle w:val="VerbatimChar"/>
+        </w:rPr>
+        <w:t xml:space="preserve">{ paciente: { id, nombreCompleto, documento, correo, telefono, activo, ... }, citas: [...], historia: [...] }</w:t>
+      </w:r>
+      <w:r>
+        <w:t xml:space="preserve"> </w:t>
+      </w:r>
+      <w:r>
+        <w:t xml:space="preserve">— la pantalla de ficha en una sola petición.</w:t>
+      </w:r>
+      <w:r>
+        <w:t xml:space="preserve"> </w:t>
+      </w:r>
+      <w:r>
+        <w:t xml:space="preserve">-</w:t>
+      </w:r>
+      <w:r>
+        <w:t xml:space="preserve"> </w:t>
+      </w:r>
+      <w:r>
+        <w:rPr>
+          <w:rStyle w:val="VerbatimChar"/>
+        </w:rPr>
+        <w:t xml:space="preserve">GET /pacientes/:id/historia</w:t>
+      </w:r>
+      <w:r>
+        <w:t xml:space="preserve"> </w:t>
+      </w:r>
+      <w:r>
+        <w:t xml:space="preserve">→ entradas, la atención más reciente primero:</w:t>
+      </w:r>
+      <w:r>
+        <w:t xml:space="preserve"> </w:t>
+      </w:r>
+      <w:r>
+        <w:rPr>
+          <w:rStyle w:val="VerbatimChar"/>
+        </w:rPr>
+        <w:t xml:space="preserve">[{ id, fechaAtencion, especialidad, especialista, citaId, procedimiento, notas, corrigeA, correcciones: [ids], autor, creadoEn }]</w:t>
+      </w:r>
+      <w:r>
+        <w:t xml:space="preserve">.</w:t>
+      </w:r>
+      <w:r>
+        <w:t xml:space="preserve"> </w:t>
+      </w:r>
+      <w:r>
+        <w:t xml:space="preserve">-</w:t>
+      </w:r>
+      <w:r>
+        <w:t xml:space="preserve"> </w:t>
+      </w:r>
+      <w:r>
+        <w:rPr>
+          <w:rStyle w:val="VerbatimChar"/>
+        </w:rPr>
+        <w:t xml:space="preserve">POST /pacientes/:id/historia</w:t>
+      </w:r>
+      <w:r>
+        <w:t xml:space="preserve"> </w:t>
+      </w:r>
+      <w:r>
+        <w:rPr>
+          <w:rStyle w:val="VerbatimChar"/>
+        </w:rPr>
+        <w:t xml:space="preserve">{ fechaAtencion, procedimiento, notas?, especialidadId?, especialistaId?, citaId? }</w:t>
+      </w:r>
+      <w:r>
+        <w:t xml:space="preserve"> </w:t>
+      </w:r>
+      <w:r>
+        <w:t xml:space="preserve">→ 201. Con</w:t>
+      </w:r>
+      <w:r>
+        <w:t xml:space="preserve"> </w:t>
+      </w:r>
+      <w:r>
+        <w:rPr>
+          <w:rStyle w:val="VerbatimChar"/>
+        </w:rPr>
+        <w:t xml:space="preserve">citaId</w:t>
+      </w:r>
+      <w:r>
+        <w:t xml:space="preserve"> </w:t>
+      </w:r>
+      <w:r>
+        <w:t xml:space="preserve">(de ese paciente) se pueden omitir fecha, especialidad y especialista. Fecha futura → 400.</w:t>
+      </w:r>
+      <w:r>
+        <w:t xml:space="preserve"> </w:t>
+      </w:r>
+      <w:r>
+        <w:t xml:space="preserve">-</w:t>
+      </w:r>
+      <w:r>
+        <w:t xml:space="preserve"> </w:t>
+      </w:r>
+      <w:r>
+        <w:rPr>
+          <w:rStyle w:val="VerbatimChar"/>
+        </w:rPr>
+        <w:t xml:space="preserve">POST /admin/historia/:id/correccion</w:t>
+      </w:r>
+      <w:r>
+        <w:t xml:space="preserve"> </w:t>
+      </w:r>
+      <w:r>
+        <w:rPr>
+          <w:rStyle w:val="VerbatimChar"/>
+        </w:rPr>
+        <w:t xml:space="preserve">{ notas, procedimiento?, fechaAtencion? }</w:t>
+      </w:r>
+      <w:r>
+        <w:t xml:space="preserve"> </w:t>
+      </w:r>
+      <w:r>
+        <w:t xml:space="preserve">→ 201: crea una entrada nueva que corrige a la indicada;</w:t>
+      </w:r>
+      <w:r>
+        <w:t xml:space="preserve"> </w:t>
+      </w:r>
+      <w:r>
+        <w:rPr>
+          <w:rStyle w:val="VerbatimChar"/>
+        </w:rPr>
+        <w:t xml:space="preserve">notas</w:t>
+      </w:r>
+      <w:r>
+        <w:t xml:space="preserve"> </w:t>
+      </w:r>
+      <w:r>
+        <w:t xml:space="preserve">(qué se corrige y por qué) es obligatorio.</w:t>
+      </w:r>
+      <w:r>
+        <w:t xml:space="preserve"> </w:t>
+      </w:r>
+      <w:r>
+        <w:t xml:space="preserve">-</w:t>
+      </w:r>
+      <w:r>
+        <w:t xml:space="preserve"> </w:t>
+      </w:r>
+      <w:r>
+        <w:rPr>
+          <w:bCs/>
+          <w:b/>
+        </w:rPr>
         <w:t xml:space="preserve">No hay editar ni borrar</w:t>
       </w:r>
       <w:r>
@@ -3482,18 +3628,6 @@
       </w:pPr>
       <w:r>
         <w:t xml:space="preserve">Aún no existe</w:t>
-      </w:r>
-    </w:p>
-    <w:p>
-      <w:pPr>
-        <w:numPr>
-          <w:ilvl w:val="0"/>
-          <w:numId w:val="1007"/>
-        </w:numPr>
-        <w:pStyle w:val="Compact"/>
-      </w:pPr>
-      <w:r>
-        <w:t xml:space="preserve">Recordatorio del día anterior.</w:t>
       </w:r>
     </w:p>
     <w:p>

</xml_diff>

<commit_message>
docs: ingreso, sesión y límite de intentos (decisión 21)
</commit_message>
<xml_diff>
--- a/docs/para-drive/Contrato de la API.docx
+++ b/docs/para-drive/Contrato de la API.docx
@@ -1418,7 +1418,7 @@
         <w:rPr>
           <w:rStyle w:val="VerbatimChar"/>
         </w:rPr>
-        <w:t xml:space="preserve">{ mensaje, cita: { id, estado, paciente, especialidad, especialista, fecha, hora, sede, direccion, reprogramaciones }, enlaceGestion, whatsapp: "enviado" | "pendiente" }</w:t>
+        <w:t xml:space="preserve">{ mensaje, cita: { id, estado, paciente, especialidad, especialista, fecha, hora, sede, direccion, reprogramaciones }, whatsapp: "enviado" | "pendiente" }</w:t>
       </w:r>
     </w:p>
     <w:p>
@@ -1430,57 +1430,23 @@
         <w:pStyle w:val="Compact"/>
       </w:pPr>
       <w:r>
-        <w:t xml:space="preserve">Muestra el resumen y el</w:t>
-      </w:r>
-      <w:r>
-        <w:t xml:space="preserve"> </w:t>
-      </w:r>
-      <w:r>
-        <w:rPr>
-          <w:rStyle w:val="VerbatimChar"/>
+        <w:t xml:space="preserve">Muestra el resumen. El enlace para reprogramar o cancelar</w:t>
+      </w:r>
+      <w:r>
+        <w:t xml:space="preserve"> </w:t>
+      </w:r>
+      <w:r>
+        <w:rPr>
           <w:bCs/>
           <w:b/>
         </w:rPr>
-        <w:t xml:space="preserve">enlaceGestion</w:t>
-      </w:r>
-      <w:r>
-        <w:t xml:space="preserve"> </w:t>
-      </w:r>
-      <w:r>
-        <w:t xml:space="preserve">con un botón</w:t>
-      </w:r>
-      <w:r>
-        <w:t xml:space="preserve"> </w:t>
-      </w:r>
-      <w:r>
-        <w:t xml:space="preserve">“</w:t>
-      </w:r>
-      <w:r>
-        <w:t xml:space="preserve">Copiar enlace</w:t>
-      </w:r>
-      <w:r>
-        <w:t xml:space="preserve">”</w:t>
-      </w:r>
-      <w:r>
-        <w:t xml:space="preserve"> </w:t>
-      </w:r>
-      <w:r>
-        <w:t xml:space="preserve">y el texto</w:t>
-      </w:r>
-      <w:r>
-        <w:t xml:space="preserve"> </w:t>
-      </w:r>
-      <w:r>
-        <w:t xml:space="preserve">“</w:t>
-      </w:r>
-      <w:r>
-        <w:t xml:space="preserve">Guárdalo: con él puedes reprogramar o cancelar</w:t>
-      </w:r>
-      <w:r>
-        <w:t xml:space="preserve">”</w:t>
-      </w:r>
-      <w:r>
-        <w:t xml:space="preserve">.</w:t>
+        <w:t xml:space="preserve">no</w:t>
+      </w:r>
+      <w:r>
+        <w:t xml:space="preserve"> </w:t>
+      </w:r>
+      <w:r>
+        <w:t xml:space="preserve">viene en la respuesta: solo llega por WhatsApp al teléfono escrito, para que únicamente lo tenga el dueño de ese número.</w:t>
       </w:r>
     </w:p>
     <w:p>
@@ -2091,7 +2057,100 @@
         <w:t xml:space="preserve"> </w:t>
       </w:r>
       <w:r>
-        <w:t xml:space="preserve">para los dos; el rol decide a qué panel va.</w:t>
+        <w:t xml:space="preserve">para los dos; el rol decide a qué panel va:</w:t>
+      </w:r>
+      <w:r>
+        <w:t xml:space="preserve"> </w:t>
+      </w:r>
+      <w:r>
+        <w:rPr>
+          <w:rStyle w:val="VerbatimChar"/>
+        </w:rPr>
+        <w:t xml:space="preserve">administrador</w:t>
+      </w:r>
+      <w:r>
+        <w:t xml:space="preserve"> </w:t>
+      </w:r>
+      <w:r>
+        <w:t xml:space="preserve">→</w:t>
+      </w:r>
+      <w:r>
+        <w:t xml:space="preserve"> </w:t>
+      </w:r>
+      <w:r>
+        <w:rPr>
+          <w:rStyle w:val="VerbatimChar"/>
+        </w:rPr>
+        <w:t xml:space="preserve">panel-secretaria.html</w:t>
+      </w:r>
+      <w:r>
+        <w:t xml:space="preserve">,</w:t>
+      </w:r>
+      <w:r>
+        <w:t xml:space="preserve"> </w:t>
+      </w:r>
+      <w:r>
+        <w:rPr>
+          <w:rStyle w:val="VerbatimChar"/>
+        </w:rPr>
+        <w:t xml:space="preserve">paciente</w:t>
+      </w:r>
+      <w:r>
+        <w:t xml:space="preserve"> </w:t>
+      </w:r>
+      <w:r>
+        <w:t xml:space="preserve">→</w:t>
+      </w:r>
+      <w:r>
+        <w:t xml:space="preserve"> </w:t>
+      </w:r>
+      <w:r>
+        <w:rPr>
+          <w:rStyle w:val="VerbatimChar"/>
+        </w:rPr>
+        <w:t xml:space="preserve">mis-citas.html</w:t>
+      </w:r>
+      <w:r>
+        <w:t xml:space="preserve">. La sesión se guarda en</w:t>
+      </w:r>
+      <w:r>
+        <w:t xml:space="preserve"> </w:t>
+      </w:r>
+      <w:r>
+        <w:rPr>
+          <w:rStyle w:val="VerbatimChar"/>
+        </w:rPr>
+        <w:t xml:space="preserve">sessionStorage</w:t>
+      </w:r>
+      <w:r>
+        <w:t xml:space="preserve"> </w:t>
+      </w:r>
+      <w:r>
+        <w:t xml:space="preserve">(</w:t>
+      </w:r>
+      <w:r>
+        <w:rPr>
+          <w:rStyle w:val="VerbatimChar"/>
+        </w:rPr>
+        <w:t xml:space="preserve">frontend/js/sesion.js</w:t>
+      </w:r>
+      <w:r>
+        <w:t xml:space="preserve">) y</w:t>
+      </w:r>
+      <w:r>
+        <w:t xml:space="preserve"> </w:t>
+      </w:r>
+      <w:r>
+        <w:rPr>
+          <w:rStyle w:val="VerbatimChar"/>
+        </w:rPr>
+        <w:t xml:space="preserve">api()</w:t>
+      </w:r>
+      <w:r>
+        <w:t xml:space="preserve"> </w:t>
+      </w:r>
+      <w:r>
+        <w:t xml:space="preserve">envía el token sola.</w:t>
       </w:r>
     </w:p>
     <w:tbl>
@@ -2185,7 +2244,30 @@
               <w:t xml:space="preserve">debeCambiarContrasena</w:t>
             </w:r>
             <w:r>
-              <w:t xml:space="preserve">, lleva a cambiar la clave antes de todo</w:t>
+              <w:t xml:space="preserve">, lleva a cambiar la clave antes de todo. Correo o clave incorrectos →</w:t>
+            </w:r>
+            <w:r>
+              <w:t xml:space="preserve"> </w:t>
+            </w:r>
+            <w:r>
+              <w:rPr>
+                <w:bCs/>
+                <w:b/>
+              </w:rPr>
+              <w:t xml:space="preserve">401</w:t>
+            </w:r>
+            <w:r>
+              <w:t xml:space="preserve">; más de 10 intentos en 15 minutos desde la misma IP →</w:t>
+            </w:r>
+            <w:r>
+              <w:t xml:space="preserve"> </w:t>
+            </w:r>
+            <w:r>
+              <w:rPr>
+                <w:bCs/>
+                <w:b/>
+              </w:rPr>
+              <w:t xml:space="preserve">429</w:t>
             </w:r>
           </w:p>
         </w:tc>

</xml_diff>

<commit_message>
docs: agenda del panel y respuestas de cancelar y reprogramar
</commit_message>
<xml_diff>
--- a/docs/para-drive/Contrato de la API.docx
+++ b/docs/para-drive/Contrato de la API.docx
@@ -2865,6 +2865,18 @@
         <w:rPr>
           <w:rStyle w:val="VerbatimChar"/>
         </w:rPr>
+        <w:t xml:space="preserve">especialidadId</w:t>
+      </w:r>
+      <w:r>
+        <w:t xml:space="preserve">,</w:t>
+      </w:r>
+      <w:r>
+        <w:t xml:space="preserve"> </w:t>
+      </w:r>
+      <w:r>
+        <w:rPr>
+          <w:rStyle w:val="VerbatimChar"/>
+        </w:rPr>
         <w:t xml:space="preserve">documento</w:t>
       </w:r>
       <w:r>
@@ -3002,7 +3014,167 @@
         <w:t xml:space="preserve">{ franjaId }</w:t>
       </w:r>
       <w:r>
-        <w:t xml:space="preserve">. No tiene límite y puede pasar la cita a otro especialista de la misma especialidad.</w:t>
+        <w:t xml:space="preserve">. No tiene límite y puede pasar la cita a otro especialista de la misma especialidad. Respuesta:</w:t>
+      </w:r>
+      <w:r>
+        <w:t xml:space="preserve"> </w:t>
+      </w:r>
+      <w:r>
+        <w:rPr>
+          <w:rStyle w:val="VerbatimChar"/>
+        </w:rPr>
+        <w:t xml:space="preserve">{ mensaje, cita, notificacion }</w:t>
+      </w:r>
+      <w:r>
+        <w:t xml:space="preserve">.</w:t>
+      </w:r>
+      <w:r>
+        <w:t xml:space="preserve"> </w:t>
+      </w:r>
+      <w:r>
+        <w:t xml:space="preserve">-</w:t>
+      </w:r>
+      <w:r>
+        <w:t xml:space="preserve"> </w:t>
+      </w:r>
+      <w:r>
+        <w:rPr>
+          <w:bCs/>
+          <w:b/>
+        </w:rPr>
+        <w:t xml:space="preserve">Cancelar</w:t>
+      </w:r>
+      <w:r>
+        <w:t xml:space="preserve"> </w:t>
+      </w:r>
+      <w:r>
+        <w:t xml:space="preserve">(</w:t>
+      </w:r>
+      <w:r>
+        <w:rPr>
+          <w:rStyle w:val="VerbatimChar"/>
+        </w:rPr>
+        <w:t xml:space="preserve">PATCH …/estado</w:t>
+      </w:r>
+      <w:r>
+        <w:t xml:space="preserve"> </w:t>
+      </w:r>
+      <w:r>
+        <w:t xml:space="preserve">con</w:t>
+      </w:r>
+      <w:r>
+        <w:t xml:space="preserve"> </w:t>
+      </w:r>
+      <w:r>
+        <w:rPr>
+          <w:rStyle w:val="VerbatimChar"/>
+        </w:rPr>
+        <w:t xml:space="preserve">cancelada</w:t>
+      </w:r>
+      <w:r>
+        <w:t xml:space="preserve">) responde</w:t>
+      </w:r>
+      <w:r>
+        <w:t xml:space="preserve"> </w:t>
+      </w:r>
+      <w:r>
+        <w:rPr>
+          <w:rStyle w:val="VerbatimChar"/>
+        </w:rPr>
+        <w:t xml:space="preserve">{ mensaje, notificacion }</w:t>
+      </w:r>
+      <w:r>
+        <w:t xml:space="preserve">.</w:t>
+      </w:r>
+      <w:r>
+        <w:t xml:space="preserve"> </w:t>
+      </w:r>
+      <w:r>
+        <w:rPr>
+          <w:rStyle w:val="VerbatimChar"/>
+        </w:rPr>
+        <w:t xml:space="preserve">notificacion</w:t>
+      </w:r>
+      <w:r>
+        <w:t xml:space="preserve"> </w:t>
+      </w:r>
+      <w:r>
+        <w:t xml:space="preserve">es</w:t>
+      </w:r>
+      <w:r>
+        <w:t xml:space="preserve"> </w:t>
+      </w:r>
+      <w:r>
+        <w:rPr>
+          <w:rStyle w:val="VerbatimChar"/>
+        </w:rPr>
+        <w:t xml:space="preserve">{ id, estado, enlaceWhatsApp }</w:t>
+      </w:r>
+      <w:r>
+        <w:t xml:space="preserve">: si</w:t>
+      </w:r>
+      <w:r>
+        <w:t xml:space="preserve"> </w:t>
+      </w:r>
+      <w:r>
+        <w:rPr>
+          <w:rStyle w:val="VerbatimChar"/>
+        </w:rPr>
+        <w:t xml:space="preserve">estado</w:t>
+      </w:r>
+      <w:r>
+        <w:t xml:space="preserve"> </w:t>
+      </w:r>
+      <w:r>
+        <w:t xml:space="preserve">es</w:t>
+      </w:r>
+      <w:r>
+        <w:t xml:space="preserve"> </w:t>
+      </w:r>
+      <w:r>
+        <w:rPr>
+          <w:rStyle w:val="VerbatimChar"/>
+        </w:rPr>
+        <w:t xml:space="preserve">pendiente</w:t>
+      </w:r>
+      <w:r>
+        <w:t xml:space="preserve">, el panel ofrece</w:t>
+      </w:r>
+      <w:r>
+        <w:t xml:space="preserve"> </w:t>
+      </w:r>
+      <w:r>
+        <w:t xml:space="preserve">“</w:t>
+      </w:r>
+      <w:r>
+        <w:t xml:space="preserve">Enviar por WhatsApp</w:t>
+      </w:r>
+      <w:r>
+        <w:t xml:space="preserve">”</w:t>
+      </w:r>
+      <w:r>
+        <w:t xml:space="preserve"> </w:t>
+      </w:r>
+      <w:r>
+        <w:t xml:space="preserve">y</w:t>
+      </w:r>
+      <w:r>
+        <w:t xml:space="preserve"> </w:t>
+      </w:r>
+      <w:r>
+        <w:t xml:space="preserve">“</w:t>
+      </w:r>
+      <w:r>
+        <w:t xml:space="preserve">Marcar como enviado</w:t>
+      </w:r>
+      <w:r>
+        <w:t xml:space="preserve">”</w:t>
+      </w:r>
+      <w:r>
+        <w:t xml:space="preserve"> </w:t>
+      </w:r>
+      <w:r>
+        <w:t xml:space="preserve">ahí mismo.</w:t>
       </w:r>
     </w:p>
     <w:p>

</xml_diff>

<commit_message>
docs: Mis citas con reprogramar y cancelar (decisión 23)
</commit_message>
<xml_diff>
--- a/docs/para-drive/Contrato de la API.docx
+++ b/docs/para-drive/Contrato de la API.docx
@@ -2403,1487 +2403,157 @@
               <w:t xml:space="preserve"> </w:t>
             </w:r>
             <w:r>
-              <w:t xml:space="preserve">de arriba, la más reciente primero</w:t>
+              <w:t xml:space="preserve">de arriba, la más reciente primero. Cada una trae además</w:t>
+            </w:r>
+            <w:r>
+              <w:t xml:space="preserve"> </w:t>
+            </w:r>
+            <w:r>
+              <w:rPr>
+                <w:rStyle w:val="VerbatimChar"/>
+              </w:rPr>
+              <w:t xml:space="preserve">puedeReprogramar</w:t>
+            </w:r>
+            <w:r>
+              <w:t xml:space="preserve">,</w:t>
+            </w:r>
+            <w:r>
+              <w:t xml:space="preserve"> </w:t>
+            </w:r>
+            <w:r>
+              <w:rPr>
+                <w:rStyle w:val="VerbatimChar"/>
+              </w:rPr>
+              <w:t xml:space="preserve">puedeCancelar</w:t>
+            </w:r>
+            <w:r>
+              <w:t xml:space="preserve"> </w:t>
+            </w:r>
+            <w:r>
+              <w:t xml:space="preserve">y</w:t>
+            </w:r>
+            <w:r>
+              <w:t xml:space="preserve"> </w:t>
+            </w:r>
+            <w:r>
+              <w:rPr>
+                <w:rStyle w:val="VerbatimChar"/>
+              </w:rPr>
+              <w:t xml:space="preserve">motivo</w:t>
+            </w:r>
+            <w:r>
+              <w:t xml:space="preserve">, como en la sección 2</w:t>
+            </w:r>
+          </w:p>
+        </w:tc>
+      </w:tr>
+      <w:tr>
+        <w:tc>
+          <w:tcPr/>
+          <w:p>
+            <w:pPr>
+              <w:pStyle w:val="Compact"/>
+              <w:jc w:val="left"/>
+            </w:pPr>
+            <w:r>
+              <w:rPr>
+                <w:rStyle w:val="VerbatimChar"/>
+              </w:rPr>
+              <w:t xml:space="preserve">POST /mis-citas/:id/reprogramar</w:t>
+            </w:r>
+            <w:r>
+              <w:t xml:space="preserve"> </w:t>
+            </w:r>
+            <w:r>
+              <w:rPr>
+                <w:rStyle w:val="VerbatimChar"/>
+              </w:rPr>
+              <w:t xml:space="preserve">{ franjaId }</w:t>
+            </w:r>
+            <w:r>
+              <w:t xml:space="preserve"> </w:t>
+            </w:r>
+            <w:r>
+              <w:t xml:space="preserve">(paciente)</w:t>
+            </w:r>
+          </w:p>
+        </w:tc>
+        <w:tc>
+          <w:tcPr/>
+          <w:p>
+            <w:pPr>
+              <w:pStyle w:val="Compact"/>
+              <w:jc w:val="left"/>
+            </w:pPr>
+            <w:r>
+              <w:rPr>
+                <w:rStyle w:val="VerbatimChar"/>
+              </w:rPr>
+              <w:t xml:space="preserve">{ mensaje, cita, whatsapp }</w:t>
+            </w:r>
+            <w:r>
+              <w:t xml:space="preserve">;</w:t>
+            </w:r>
+            <w:r>
+              <w:t xml:space="preserve"> </w:t>
+            </w:r>
+            <w:r>
+              <w:rPr>
+                <w:rStyle w:val="VerbatimChar"/>
+              </w:rPr>
+              <w:t xml:space="preserve">cita</w:t>
+            </w:r>
+            <w:r>
+              <w:t xml:space="preserve"> </w:t>
+            </w:r>
+            <w:r>
+              <w:t xml:space="preserve">trae también las reglas actualizadas. Mismas reglas que el enlace: una vez, hasta 24 h antes, mismo especialista</w:t>
+            </w:r>
+          </w:p>
+        </w:tc>
+      </w:tr>
+      <w:tr>
+        <w:tc>
+          <w:tcPr/>
+          <w:p>
+            <w:pPr>
+              <w:pStyle w:val="Compact"/>
+              <w:jc w:val="left"/>
+            </w:pPr>
+            <w:r>
+              <w:rPr>
+                <w:rStyle w:val="VerbatimChar"/>
+              </w:rPr>
+              <w:t xml:space="preserve">POST /mis-citas/:id/cancelar</w:t>
+            </w:r>
+            <w:r>
+              <w:t xml:space="preserve"> </w:t>
+            </w:r>
+            <w:r>
+              <w:t xml:space="preserve">(paciente)</w:t>
+            </w:r>
+          </w:p>
+        </w:tc>
+        <w:tc>
+          <w:tcPr/>
+          <w:p>
+            <w:pPr>
+              <w:pStyle w:val="Compact"/>
+              <w:jc w:val="left"/>
+            </w:pPr>
+            <w:r>
+              <w:rPr>
+                <w:rStyle w:val="VerbatimChar"/>
+              </w:rPr>
+              <w:t xml:space="preserve">{ mensaje }</w:t>
+            </w:r>
+            <w:r>
+              <w:t xml:space="preserve">. Hasta 24 h antes</w:t>
             </w:r>
           </w:p>
         </w:tc>
       </w:tr>
     </w:tbl>
-    <w:bookmarkEnd w:id="23"/>
-    <w:bookmarkStart w:id="24" w:name="X9f6c278bb6b588260d8a391646e30302db82efa"/>
-    <w:p>
-      <w:pPr>
-        <w:pStyle w:val="Heading2"/>
-      </w:pPr>
-      <w:r>
-        <w:t xml:space="preserve">4. Panel de la secretaria (todo exige rol administrador)</w:t>
-      </w:r>
-    </w:p>
-    <w:p>
-      <w:pPr>
-        <w:pStyle w:val="FirstParagraph"/>
-      </w:pPr>
-      <w:r>
-        <w:rPr>
-          <w:bCs/>
-          <w:b/>
-        </w:rPr>
-        <w:t xml:space="preserve">Especialidades</w:t>
-      </w:r>
-      <w:r>
-        <w:t xml:space="preserve"> </w:t>
-      </w:r>
-      <w:r>
-        <w:t xml:space="preserve">-</w:t>
-      </w:r>
-      <w:r>
-        <w:t xml:space="preserve"> </w:t>
-      </w:r>
-      <w:r>
-        <w:rPr>
-          <w:rStyle w:val="VerbatimChar"/>
-        </w:rPr>
-        <w:t xml:space="preserve">GET /admin/especialidades</w:t>
-      </w:r>
-      <w:r>
-        <w:t xml:space="preserve"> </w:t>
-      </w:r>
-      <w:r>
-        <w:t xml:space="preserve">→</w:t>
-      </w:r>
-      <w:r>
-        <w:t xml:space="preserve"> </w:t>
-      </w:r>
-      <w:r>
-        <w:rPr>
-          <w:rStyle w:val="VerbatimChar"/>
-        </w:rPr>
-        <w:t xml:space="preserve">[{ id, codigo, nombre, descripcion, activo, especialistasActivos }]</w:t>
-      </w:r>
-      <w:r>
-        <w:t xml:space="preserve"> </w:t>
-      </w:r>
-      <w:r>
-        <w:t xml:space="preserve">-</w:t>
-      </w:r>
-      <w:r>
-        <w:t xml:space="preserve"> </w:t>
-      </w:r>
-      <w:r>
-        <w:rPr>
-          <w:rStyle w:val="VerbatimChar"/>
-        </w:rPr>
-        <w:t xml:space="preserve">POST /admin/especialidades</w:t>
-      </w:r>
-      <w:r>
-        <w:t xml:space="preserve"> </w:t>
-      </w:r>
-      <w:r>
-        <w:rPr>
-          <w:rStyle w:val="VerbatimChar"/>
-        </w:rPr>
-        <w:t xml:space="preserve">{ nombre, descripcion? }</w:t>
-      </w:r>
-      <w:r>
-        <w:t xml:space="preserve"> </w:t>
-      </w:r>
-      <w:r>
-        <w:t xml:space="preserve">→ 201</w:t>
-      </w:r>
-      <w:r>
-        <w:t xml:space="preserve"> </w:t>
-      </w:r>
-      <w:r>
-        <w:t xml:space="preserve">-</w:t>
-      </w:r>
-      <w:r>
-        <w:t xml:space="preserve"> </w:t>
-      </w:r>
-      <w:r>
-        <w:rPr>
-          <w:rStyle w:val="VerbatimChar"/>
-        </w:rPr>
-        <w:t xml:space="preserve">PATCH /admin/especialidades/:id</w:t>
-      </w:r>
-      <w:r>
-        <w:t xml:space="preserve"> </w:t>
-      </w:r>
-      <w:r>
-        <w:rPr>
-          <w:rStyle w:val="VerbatimChar"/>
-        </w:rPr>
-        <w:t xml:space="preserve">{ nombre?, descripcion?, activo? }</w:t>
-      </w:r>
-    </w:p>
-    <w:p>
-      <w:pPr>
-        <w:pStyle w:val="BodyText"/>
-      </w:pPr>
-      <w:r>
-        <w:rPr>
-          <w:bCs/>
-          <w:b/>
-        </w:rPr>
-        <w:t xml:space="preserve">Especialistas</w:t>
-      </w:r>
-      <w:r>
-        <w:t xml:space="preserve"> </w:t>
-      </w:r>
-      <w:r>
-        <w:t xml:space="preserve">-</w:t>
-      </w:r>
-      <w:r>
-        <w:t xml:space="preserve"> </w:t>
-      </w:r>
-      <w:r>
-        <w:rPr>
-          <w:rStyle w:val="VerbatimChar"/>
-        </w:rPr>
-        <w:t xml:space="preserve">GET /admin/especialistas</w:t>
-      </w:r>
-      <w:r>
-        <w:t xml:space="preserve"> </w:t>
-      </w:r>
-      <w:r>
-        <w:t xml:space="preserve">→</w:t>
-      </w:r>
-      <w:r>
-        <w:t xml:space="preserve"> </w:t>
-      </w:r>
-      <w:r>
-        <w:rPr>
-          <w:rStyle w:val="VerbatimChar"/>
-        </w:rPr>
-        <w:t xml:space="preserve">[{ id, nombre, activo, especialidades: [{ id, nombre }] }]</w:t>
-      </w:r>
-      <w:r>
-        <w:t xml:space="preserve"> </w:t>
-      </w:r>
-      <w:r>
-        <w:t xml:space="preserve">-</w:t>
-      </w:r>
-      <w:r>
-        <w:t xml:space="preserve"> </w:t>
-      </w:r>
-      <w:r>
-        <w:rPr>
-          <w:rStyle w:val="VerbatimChar"/>
-        </w:rPr>
-        <w:t xml:space="preserve">POST /admin/especialistas</w:t>
-      </w:r>
-      <w:r>
-        <w:t xml:space="preserve"> </w:t>
-      </w:r>
-      <w:r>
-        <w:rPr>
-          <w:rStyle w:val="VerbatimChar"/>
-        </w:rPr>
-        <w:t xml:space="preserve">{ nombre, especialidadIds: [1, 3] }</w:t>
-      </w:r>
-      <w:r>
-        <w:t xml:space="preserve"> </w:t>
-      </w:r>
-      <w:r>
-        <w:t xml:space="preserve">(al menos una) → 201</w:t>
-      </w:r>
-      <w:r>
-        <w:t xml:space="preserve"> </w:t>
-      </w:r>
-      <w:r>
-        <w:t xml:space="preserve">-</w:t>
-      </w:r>
-      <w:r>
-        <w:t xml:space="preserve"> </w:t>
-      </w:r>
-      <w:r>
-        <w:rPr>
-          <w:rStyle w:val="VerbatimChar"/>
-        </w:rPr>
-        <w:t xml:space="preserve">PATCH /admin/especialistas/:id</w:t>
-      </w:r>
-      <w:r>
-        <w:t xml:space="preserve"> </w:t>
-      </w:r>
-      <w:r>
-        <w:rPr>
-          <w:rStyle w:val="VerbatimChar"/>
-        </w:rPr>
-        <w:t xml:space="preserve">{ nombre?, activo?, especialidadIds? }</w:t>
-      </w:r>
-    </w:p>
-    <w:p>
-      <w:pPr>
-        <w:pStyle w:val="BodyText"/>
-      </w:pPr>
-      <w:r>
-        <w:rPr>
-          <w:bCs/>
-          <w:b/>
-        </w:rPr>
-        <w:t xml:space="preserve">Disponibilidad</w:t>
-      </w:r>
-      <w:r>
-        <w:t xml:space="preserve"> </w:t>
-      </w:r>
-      <w:r>
-        <w:t xml:space="preserve">-</w:t>
-      </w:r>
-      <w:r>
-        <w:t xml:space="preserve"> </w:t>
-      </w:r>
-      <w:r>
-        <w:rPr>
-          <w:bCs/>
-          <w:b/>
-        </w:rPr>
-        <w:t xml:space="preserve">Ver:</w:t>
-      </w:r>
-      <w:r>
-        <w:t xml:space="preserve"> </w:t>
-      </w:r>
-      <w:r>
-        <w:rPr>
-          <w:rStyle w:val="VerbatimChar"/>
-        </w:rPr>
-        <w:t xml:space="preserve">GET /admin/especialistas/:id/franjas?desde=&amp;hasta=</w:t>
-      </w:r>
-      <w:r>
-        <w:t xml:space="preserve"> </w:t>
-      </w:r>
-      <w:r>
-        <w:t xml:space="preserve">(por defecto hoy + 30 días) →</w:t>
-      </w:r>
-      <w:r>
-        <w:t xml:space="preserve"> </w:t>
-      </w:r>
-      <w:r>
-        <w:rPr>
-          <w:rStyle w:val="VerbatimChar"/>
-        </w:rPr>
-        <w:t xml:space="preserve">[{ id, fecha, hora, cita: null | { id, paciente, estado } }]</w:t>
-      </w:r>
-      <w:r>
-        <w:t xml:space="preserve">. Pinta cada hora libre u ocupada con el nombre del paciente.</w:t>
-      </w:r>
-      <w:r>
-        <w:t xml:space="preserve"> </w:t>
-      </w:r>
-      <w:r>
-        <w:t xml:space="preserve">-</w:t>
-      </w:r>
-      <w:r>
-        <w:t xml:space="preserve"> </w:t>
-      </w:r>
-      <w:r>
-        <w:rPr>
-          <w:bCs/>
-          <w:b/>
-        </w:rPr>
-        <w:t xml:space="preserve">Publicar:</w:t>
-      </w:r>
-      <w:r>
-        <w:t xml:space="preserve"> </w:t>
-      </w:r>
-      <w:r>
-        <w:rPr>
-          <w:rStyle w:val="VerbatimChar"/>
-        </w:rPr>
-        <w:t xml:space="preserve">POST /admin/especialistas/:id/franjas</w:t>
-      </w:r>
-      <w:r>
-        <w:t xml:space="preserve"> </w:t>
-      </w:r>
-      <w:r>
-        <w:rPr>
-          <w:rStyle w:val="VerbatimChar"/>
-        </w:rPr>
-        <w:t xml:space="preserve">{ fechas: ["2026-10-15", "2026-10-16"], horas: ["08:00", "08:30"] }</w:t>
-      </w:r>
-      <w:r>
-        <w:t xml:space="preserve"> </w:t>
-      </w:r>
-      <w:r>
-        <w:t xml:space="preserve">→ 201</w:t>
-      </w:r>
-      <w:r>
-        <w:t xml:space="preserve"> </w:t>
-      </w:r>
-      <w:r>
-        <w:rPr>
-          <w:rStyle w:val="VerbatimChar"/>
-        </w:rPr>
-        <w:t xml:space="preserve">{ total }</w:t>
-      </w:r>
-      <w:r>
-        <w:t xml:space="preserve">. Publica cada hora en cada fecha; varias fechas sirven de</w:t>
-      </w:r>
-      <w:r>
-        <w:t xml:space="preserve"> </w:t>
-      </w:r>
-      <w:r>
-        <w:t xml:space="preserve">“</w:t>
-      </w:r>
-      <w:r>
-        <w:t xml:space="preserve">copiar a varios días</w:t>
-      </w:r>
-      <w:r>
-        <w:t xml:space="preserve">”</w:t>
-      </w:r>
-      <w:r>
-        <w:t xml:space="preserve">. Sugerencia de UI: cuadrícula de 7:00 a 18:00 cada 30 minutos con casillas.</w:t>
-      </w:r>
-      <w:r>
-        <w:t xml:space="preserve"> </w:t>
-      </w:r>
-      <w:r>
-        <w:t xml:space="preserve">-</w:t>
-      </w:r>
-      <w:r>
-        <w:t xml:space="preserve"> </w:t>
-      </w:r>
-      <w:r>
-        <w:rPr>
-          <w:bCs/>
-          <w:b/>
-        </w:rPr>
-        <w:t xml:space="preserve">Quitar:</w:t>
-      </w:r>
-      <w:r>
-        <w:t xml:space="preserve"> </w:t>
-      </w:r>
-      <w:r>
-        <w:rPr>
-          <w:rStyle w:val="VerbatimChar"/>
-        </w:rPr>
-        <w:t xml:space="preserve">DELETE /admin/franjas/:id</w:t>
-      </w:r>
-      <w:r>
-        <w:t xml:space="preserve">. Si la hora tiene cita →</w:t>
-      </w:r>
-      <w:r>
-        <w:t xml:space="preserve"> </w:t>
-      </w:r>
-      <w:r>
-        <w:rPr>
-          <w:bCs/>
-          <w:b/>
-        </w:rPr>
-        <w:t xml:space="preserve">409</w:t>
-      </w:r>
-      <w:r>
-        <w:t xml:space="preserve"> </w:t>
-      </w:r>
-      <w:r>
-        <w:t xml:space="preserve">con el nombre del paciente; hay que reprogramar o cancelar primero.</w:t>
-      </w:r>
-    </w:p>
-    <w:p>
-      <w:pPr>
-        <w:pStyle w:val="BodyText"/>
-      </w:pPr>
-      <w:r>
-        <w:rPr>
-          <w:bCs/>
-          <w:b/>
-        </w:rPr>
-        <w:t xml:space="preserve">Agenda</w:t>
-      </w:r>
-      <w:r>
-        <w:t xml:space="preserve"> </w:t>
-      </w:r>
-      <w:r>
-        <w:t xml:space="preserve">-</w:t>
-      </w:r>
-      <w:r>
-        <w:t xml:space="preserve"> </w:t>
-      </w:r>
-      <w:r>
-        <w:rPr>
-          <w:bCs/>
-          <w:b/>
-        </w:rPr>
-        <w:t xml:space="preserve">Ver:</w:t>
-      </w:r>
-      <w:r>
-        <w:t xml:space="preserve"> </w:t>
-      </w:r>
-      <w:r>
-        <w:rPr>
-          <w:rStyle w:val="VerbatimChar"/>
-        </w:rPr>
-        <w:t xml:space="preserve">GET /admin/citas?fecha=</w:t>
-      </w:r>
-      <w:r>
-        <w:t xml:space="preserve"> </w:t>
-      </w:r>
-      <w:r>
-        <w:t xml:space="preserve">o</w:t>
-      </w:r>
-      <w:r>
-        <w:t xml:space="preserve"> </w:t>
-      </w:r>
-      <w:r>
-        <w:rPr>
-          <w:rStyle w:val="VerbatimChar"/>
-        </w:rPr>
-        <w:t xml:space="preserve">?desde=&amp;hasta=</w:t>
-      </w:r>
-      <w:r>
-        <w:t xml:space="preserve">, más</w:t>
-      </w:r>
-      <w:r>
-        <w:t xml:space="preserve"> </w:t>
-      </w:r>
-      <w:r>
-        <w:rPr>
-          <w:rStyle w:val="VerbatimChar"/>
-        </w:rPr>
-        <w:t xml:space="preserve">&amp;especialistaId=&amp;estado=&amp;q=</w:t>
-      </w:r>
-      <w:r>
-        <w:t xml:space="preserve"> </w:t>
-      </w:r>
-      <w:r>
-        <w:t xml:space="preserve">(</w:t>
-      </w:r>
-      <w:r>
-        <w:rPr>
-          <w:rStyle w:val="VerbatimChar"/>
-        </w:rPr>
-        <w:t xml:space="preserve">q</w:t>
-      </w:r>
-      <w:r>
-        <w:t xml:space="preserve"> </w:t>
-      </w:r>
-      <w:r>
-        <w:t xml:space="preserve">busca por nombre, documento o teléfono) → citas con</w:t>
-      </w:r>
-      <w:r>
-        <w:t xml:space="preserve"> </w:t>
-      </w:r>
-      <w:r>
-        <w:rPr>
-          <w:rStyle w:val="VerbatimChar"/>
-        </w:rPr>
-        <w:t xml:space="preserve">especialidadId</w:t>
-      </w:r>
-      <w:r>
-        <w:t xml:space="preserve">,</w:t>
-      </w:r>
-      <w:r>
-        <w:t xml:space="preserve"> </w:t>
-      </w:r>
-      <w:r>
-        <w:rPr>
-          <w:rStyle w:val="VerbatimChar"/>
-        </w:rPr>
-        <w:t xml:space="preserve">documento</w:t>
-      </w:r>
-      <w:r>
-        <w:t xml:space="preserve">,</w:t>
-      </w:r>
-      <w:r>
-        <w:t xml:space="preserve"> </w:t>
-      </w:r>
-      <w:r>
-        <w:rPr>
-          <w:rStyle w:val="VerbatimChar"/>
-        </w:rPr>
-        <w:t xml:space="preserve">telefono</w:t>
-      </w:r>
-      <w:r>
-        <w:t xml:space="preserve">,</w:t>
-      </w:r>
-      <w:r>
-        <w:t xml:space="preserve"> </w:t>
-      </w:r>
-      <w:r>
-        <w:rPr>
-          <w:rStyle w:val="VerbatimChar"/>
-        </w:rPr>
-        <w:t xml:space="preserve">correo</w:t>
-      </w:r>
-      <w:r>
-        <w:t xml:space="preserve">,</w:t>
-      </w:r>
-      <w:r>
-        <w:t xml:space="preserve"> </w:t>
-      </w:r>
-      <w:r>
-        <w:rPr>
-          <w:rStyle w:val="VerbatimChar"/>
-        </w:rPr>
-        <w:t xml:space="preserve">pacienteId</w:t>
-      </w:r>
-      <w:r>
-        <w:t xml:space="preserve">,</w:t>
-      </w:r>
-      <w:r>
-        <w:t xml:space="preserve"> </w:t>
-      </w:r>
-      <w:r>
-        <w:rPr>
-          <w:rStyle w:val="VerbatimChar"/>
-        </w:rPr>
-        <w:t xml:space="preserve">canceladaPor</w:t>
-      </w:r>
-      <w:r>
-        <w:t xml:space="preserve">,</w:t>
-      </w:r>
-      <w:r>
-        <w:t xml:space="preserve"> </w:t>
-      </w:r>
-      <w:r>
-        <w:rPr>
-          <w:rStyle w:val="VerbatimChar"/>
-        </w:rPr>
-        <w:t xml:space="preserve">creadoEn</w:t>
-      </w:r>
-      <w:r>
-        <w:t xml:space="preserve">.</w:t>
-      </w:r>
-      <w:r>
-        <w:t xml:space="preserve"> </w:t>
-      </w:r>
-      <w:r>
-        <w:t xml:space="preserve">-</w:t>
-      </w:r>
-      <w:r>
-        <w:t xml:space="preserve"> </w:t>
-      </w:r>
-      <w:r>
-        <w:rPr>
-          <w:bCs/>
-          <w:b/>
-        </w:rPr>
-        <w:t xml:space="preserve">Cambiar estado:</w:t>
-      </w:r>
-      <w:r>
-        <w:t xml:space="preserve"> </w:t>
-      </w:r>
-      <w:r>
-        <w:rPr>
-          <w:rStyle w:val="VerbatimChar"/>
-        </w:rPr>
-        <w:t xml:space="preserve">PATCH /admin/citas/:id/estado</w:t>
-      </w:r>
-      <w:r>
-        <w:t xml:space="preserve"> </w:t>
-      </w:r>
-      <w:r>
-        <w:rPr>
-          <w:rStyle w:val="VerbatimChar"/>
-        </w:rPr>
-        <w:t xml:space="preserve">{ estado: "atendida" | "no_asistio" | "cancelada" }</w:t>
-      </w:r>
-      <w:r>
-        <w:t xml:space="preserve">. Atendida o no asistió solo se permite cuando ya llegó la hora.</w:t>
-      </w:r>
-      <w:r>
-        <w:t xml:space="preserve"> </w:t>
-      </w:r>
-      <w:r>
-        <w:t xml:space="preserve">-</w:t>
-      </w:r>
-      <w:r>
-        <w:t xml:space="preserve"> </w:t>
-      </w:r>
-      <w:r>
-        <w:rPr>
-          <w:bCs/>
-          <w:b/>
-        </w:rPr>
-        <w:t xml:space="preserve">Reprogramar:</w:t>
-      </w:r>
-      <w:r>
-        <w:t xml:space="preserve"> </w:t>
-      </w:r>
-      <w:r>
-        <w:rPr>
-          <w:rStyle w:val="VerbatimChar"/>
-        </w:rPr>
-        <w:t xml:space="preserve">POST /admin/citas/:id/reprogramar</w:t>
-      </w:r>
-      <w:r>
-        <w:t xml:space="preserve"> </w:t>
-      </w:r>
-      <w:r>
-        <w:rPr>
-          <w:rStyle w:val="VerbatimChar"/>
-        </w:rPr>
-        <w:t xml:space="preserve">{ franjaId }</w:t>
-      </w:r>
-      <w:r>
-        <w:t xml:space="preserve">. No tiene límite y puede pasar la cita a otro especialista de la misma especialidad. Respuesta:</w:t>
-      </w:r>
-      <w:r>
-        <w:t xml:space="preserve"> </w:t>
-      </w:r>
-      <w:r>
-        <w:rPr>
-          <w:rStyle w:val="VerbatimChar"/>
-        </w:rPr>
-        <w:t xml:space="preserve">{ mensaje, cita, notificacion }</w:t>
-      </w:r>
-      <w:r>
-        <w:t xml:space="preserve">.</w:t>
-      </w:r>
-      <w:r>
-        <w:t xml:space="preserve"> </w:t>
-      </w:r>
-      <w:r>
-        <w:t xml:space="preserve">-</w:t>
-      </w:r>
-      <w:r>
-        <w:t xml:space="preserve"> </w:t>
-      </w:r>
-      <w:r>
-        <w:rPr>
-          <w:bCs/>
-          <w:b/>
-        </w:rPr>
-        <w:t xml:space="preserve">Cancelar</w:t>
-      </w:r>
-      <w:r>
-        <w:t xml:space="preserve"> </w:t>
-      </w:r>
-      <w:r>
-        <w:t xml:space="preserve">(</w:t>
-      </w:r>
-      <w:r>
-        <w:rPr>
-          <w:rStyle w:val="VerbatimChar"/>
-        </w:rPr>
-        <w:t xml:space="preserve">PATCH …/estado</w:t>
-      </w:r>
-      <w:r>
-        <w:t xml:space="preserve"> </w:t>
-      </w:r>
-      <w:r>
-        <w:t xml:space="preserve">con</w:t>
-      </w:r>
-      <w:r>
-        <w:t xml:space="preserve"> </w:t>
-      </w:r>
-      <w:r>
-        <w:rPr>
-          <w:rStyle w:val="VerbatimChar"/>
-        </w:rPr>
-        <w:t xml:space="preserve">cancelada</w:t>
-      </w:r>
-      <w:r>
-        <w:t xml:space="preserve">) responde</w:t>
-      </w:r>
-      <w:r>
-        <w:t xml:space="preserve"> </w:t>
-      </w:r>
-      <w:r>
-        <w:rPr>
-          <w:rStyle w:val="VerbatimChar"/>
-        </w:rPr>
-        <w:t xml:space="preserve">{ mensaje, notificacion }</w:t>
-      </w:r>
-      <w:r>
-        <w:t xml:space="preserve">.</w:t>
-      </w:r>
-      <w:r>
-        <w:t xml:space="preserve"> </w:t>
-      </w:r>
-      <w:r>
-        <w:rPr>
-          <w:rStyle w:val="VerbatimChar"/>
-        </w:rPr>
-        <w:t xml:space="preserve">notificacion</w:t>
-      </w:r>
-      <w:r>
-        <w:t xml:space="preserve"> </w:t>
-      </w:r>
-      <w:r>
-        <w:t xml:space="preserve">es</w:t>
-      </w:r>
-      <w:r>
-        <w:t xml:space="preserve"> </w:t>
-      </w:r>
-      <w:r>
-        <w:rPr>
-          <w:rStyle w:val="VerbatimChar"/>
-        </w:rPr>
-        <w:t xml:space="preserve">{ id, estado, enlaceWhatsApp }</w:t>
-      </w:r>
-      <w:r>
-        <w:t xml:space="preserve">: si</w:t>
-      </w:r>
-      <w:r>
-        <w:t xml:space="preserve"> </w:t>
-      </w:r>
-      <w:r>
-        <w:rPr>
-          <w:rStyle w:val="VerbatimChar"/>
-        </w:rPr>
-        <w:t xml:space="preserve">estado</w:t>
-      </w:r>
-      <w:r>
-        <w:t xml:space="preserve"> </w:t>
-      </w:r>
-      <w:r>
-        <w:t xml:space="preserve">es</w:t>
-      </w:r>
-      <w:r>
-        <w:t xml:space="preserve"> </w:t>
-      </w:r>
-      <w:r>
-        <w:rPr>
-          <w:rStyle w:val="VerbatimChar"/>
-        </w:rPr>
-        <w:t xml:space="preserve">pendiente</w:t>
-      </w:r>
-      <w:r>
-        <w:t xml:space="preserve">, el panel ofrece</w:t>
-      </w:r>
-      <w:r>
-        <w:t xml:space="preserve"> </w:t>
-      </w:r>
-      <w:r>
-        <w:t xml:space="preserve">“</w:t>
-      </w:r>
-      <w:r>
-        <w:t xml:space="preserve">Enviar por WhatsApp</w:t>
-      </w:r>
-      <w:r>
-        <w:t xml:space="preserve">”</w:t>
-      </w:r>
-      <w:r>
-        <w:t xml:space="preserve"> </w:t>
-      </w:r>
-      <w:r>
-        <w:t xml:space="preserve">y</w:t>
-      </w:r>
-      <w:r>
-        <w:t xml:space="preserve"> </w:t>
-      </w:r>
-      <w:r>
-        <w:t xml:space="preserve">“</w:t>
-      </w:r>
-      <w:r>
-        <w:t xml:space="preserve">Marcar como enviado</w:t>
-      </w:r>
-      <w:r>
-        <w:t xml:space="preserve">”</w:t>
-      </w:r>
-      <w:r>
-        <w:t xml:space="preserve"> </w:t>
-      </w:r>
-      <w:r>
-        <w:t xml:space="preserve">ahí mismo.</w:t>
-      </w:r>
-    </w:p>
-    <w:p>
-      <w:pPr>
-        <w:pStyle w:val="BodyText"/>
-      </w:pPr>
-      <w:r>
-        <w:rPr>
-          <w:bCs/>
-          <w:b/>
-        </w:rPr>
-        <w:t xml:space="preserve">Mensajes de WhatsApp (modo manual)</w:t>
-      </w:r>
-      <w:r>
-        <w:t xml:space="preserve"> </w:t>
-      </w:r>
-      <w:r>
-        <w:t xml:space="preserve">-</w:t>
-      </w:r>
-      <w:r>
-        <w:t xml:space="preserve"> </w:t>
-      </w:r>
-      <w:r>
-        <w:rPr>
-          <w:rStyle w:val="VerbatimChar"/>
-        </w:rPr>
-        <w:t xml:space="preserve">GET /admin/notificaciones?estado=pendiente</w:t>
-      </w:r>
-      <w:r>
-        <w:t xml:space="preserve"> </w:t>
-      </w:r>
-      <w:r>
-        <w:t xml:space="preserve">(o</w:t>
-      </w:r>
-      <w:r>
-        <w:t xml:space="preserve"> </w:t>
-      </w:r>
-      <w:r>
-        <w:rPr>
-          <w:rStyle w:val="VerbatimChar"/>
-        </w:rPr>
-        <w:t xml:space="preserve">fallida</w:t>
-      </w:r>
-      <w:r>
-        <w:t xml:space="preserve">,</w:t>
-      </w:r>
-      <w:r>
-        <w:t xml:space="preserve"> </w:t>
-      </w:r>
-      <w:r>
-        <w:rPr>
-          <w:rStyle w:val="VerbatimChar"/>
-        </w:rPr>
-        <w:t xml:space="preserve">enviada</w:t>
-      </w:r>
-      <w:r>
-        <w:t xml:space="preserve">) →</w:t>
-      </w:r>
-      <w:r>
-        <w:t xml:space="preserve"> </w:t>
-      </w:r>
-      <w:r>
-        <w:rPr>
-          <w:rStyle w:val="VerbatimChar"/>
-        </w:rPr>
-        <w:t xml:space="preserve">[{ id, citaId, paciente, tipo, destino, mensaje, enlaceWhatsApp, creadoEn }]</w:t>
-      </w:r>
-      <w:r>
-        <w:t xml:space="preserve"> </w:t>
-      </w:r>
-      <w:r>
-        <w:t xml:space="preserve">- Botón</w:t>
-      </w:r>
-      <w:r>
-        <w:t xml:space="preserve"> </w:t>
-      </w:r>
-      <w:r>
-        <w:rPr>
-          <w:bCs/>
-          <w:b/>
-        </w:rPr>
-        <w:t xml:space="preserve">“</w:t>
-      </w:r>
-      <w:r>
-        <w:rPr>
-          <w:bCs/>
-          <w:b/>
-        </w:rPr>
-        <w:t xml:space="preserve">Enviar por WhatsApp</w:t>
-      </w:r>
-      <w:r>
-        <w:rPr>
-          <w:bCs/>
-          <w:b/>
-        </w:rPr>
-        <w:t xml:space="preserve">”</w:t>
-      </w:r>
-      <w:r>
-        <w:t xml:space="preserve">: abre</w:t>
-      </w:r>
-      <w:r>
-        <w:t xml:space="preserve"> </w:t>
-      </w:r>
-      <w:r>
-        <w:rPr>
-          <w:rStyle w:val="VerbatimChar"/>
-        </w:rPr>
-        <w:t xml:space="preserve">enlaceWhatsApp</w:t>
-      </w:r>
-      <w:r>
-        <w:t xml:space="preserve"> </w:t>
-      </w:r>
-      <w:r>
-        <w:t xml:space="preserve">en pestaña nueva. Abre la app o WhatsApp Web de la clínica con el texto listo.</w:t>
-      </w:r>
-      <w:r>
-        <w:t xml:space="preserve"> </w:t>
-      </w:r>
-      <w:r>
-        <w:t xml:space="preserve">- Luego, botón</w:t>
-      </w:r>
-      <w:r>
-        <w:t xml:space="preserve"> </w:t>
-      </w:r>
-      <w:r>
-        <w:rPr>
-          <w:bCs/>
-          <w:b/>
-        </w:rPr>
-        <w:t xml:space="preserve">“</w:t>
-      </w:r>
-      <w:r>
-        <w:rPr>
-          <w:bCs/>
-          <w:b/>
-        </w:rPr>
-        <w:t xml:space="preserve">Marcar como enviado</w:t>
-      </w:r>
-      <w:r>
-        <w:rPr>
-          <w:bCs/>
-          <w:b/>
-        </w:rPr>
-        <w:t xml:space="preserve">”</w:t>
-      </w:r>
-      <w:r>
-        <w:t xml:space="preserve">:</w:t>
-      </w:r>
-      <w:r>
-        <w:t xml:space="preserve"> </w:t>
-      </w:r>
-      <w:r>
-        <w:rPr>
-          <w:rStyle w:val="VerbatimChar"/>
-        </w:rPr>
-        <w:t xml:space="preserve">PATCH /admin/notificaciones/:id</w:t>
-      </w:r>
-      <w:r>
-        <w:t xml:space="preserve"> </w:t>
-      </w:r>
-      <w:r>
-        <w:rPr>
-          <w:rStyle w:val="VerbatimChar"/>
-        </w:rPr>
-        <w:t xml:space="preserve">{ estado: "enviada" }</w:t>
-      </w:r>
-      <w:r>
-        <w:t xml:space="preserve">.</w:t>
-      </w:r>
-      <w:r>
-        <w:t xml:space="preserve"> </w:t>
-      </w:r>
-      <w:r>
-        <w:t xml:space="preserve">-</w:t>
-      </w:r>
-      <w:r>
-        <w:t xml:space="preserve"> </w:t>
-      </w:r>
-      <w:r>
-        <w:rPr>
-          <w:bCs/>
-          <w:b/>
-        </w:rPr>
-        <w:t xml:space="preserve">Recordatorios del día anterior:</w:t>
-      </w:r>
-      <w:r>
-        <w:t xml:space="preserve"> </w:t>
-      </w:r>
-      <w:r>
-        <w:t xml:space="preserve">el servidor los genera solo cada 30 minutos dentro del horario configurado y aparecen como mensajes pendientes de tipo</w:t>
-      </w:r>
-      <w:r>
-        <w:t xml:space="preserve"> </w:t>
-      </w:r>
-      <w:r>
-        <w:rPr>
-          <w:rStyle w:val="VerbatimChar"/>
-        </w:rPr>
-        <w:t xml:space="preserve">recordatorio</w:t>
-      </w:r>
-      <w:r>
-        <w:t xml:space="preserve"> </w:t>
-      </w:r>
-      <w:r>
-        <w:t xml:space="preserve">(sin enlace). Para generarlos ya:</w:t>
-      </w:r>
-      <w:r>
-        <w:t xml:space="preserve"> </w:t>
-      </w:r>
-      <w:r>
-        <w:rPr>
-          <w:rStyle w:val="VerbatimChar"/>
-        </w:rPr>
-        <w:t xml:space="preserve">POST /admin/recordatorios</w:t>
-      </w:r>
-      <w:r>
-        <w:t xml:space="preserve"> </w:t>
-      </w:r>
-      <w:r>
-        <w:t xml:space="preserve">→</w:t>
-      </w:r>
-      <w:r>
-        <w:t xml:space="preserve"> </w:t>
-      </w:r>
-      <w:r>
-        <w:rPr>
-          <w:rStyle w:val="VerbatimChar"/>
-        </w:rPr>
-        <w:t xml:space="preserve">{ fecha, revisadas, resultados: [{ citaId, estado }] }</w:t>
-      </w:r>
-      <w:r>
-        <w:t xml:space="preserve">. Sugerencia: botón</w:t>
-      </w:r>
-      <w:r>
-        <w:t xml:space="preserve"> </w:t>
-      </w:r>
-      <w:r>
-        <w:t xml:space="preserve">“</w:t>
-      </w:r>
-      <w:r>
-        <w:t xml:space="preserve">Generar recordatorios de mañana</w:t>
-      </w:r>
-      <w:r>
-        <w:t xml:space="preserve">”</w:t>
-      </w:r>
-      <w:r>
-        <w:t xml:space="preserve"> </w:t>
-      </w:r>
-      <w:r>
-        <w:t xml:space="preserve">en la sección de mensajes.</w:t>
-      </w:r>
-      <w:r>
-        <w:t xml:space="preserve"> </w:t>
-      </w:r>
-      <w:r>
-        <w:t xml:space="preserve">- Conviene un contador de pendientes visible en el menú del panel.</w:t>
-      </w:r>
-    </w:p>
-    <w:p>
-      <w:pPr>
-        <w:pStyle w:val="BodyText"/>
-      </w:pPr>
-      <w:r>
-        <w:rPr>
-          <w:bCs/>
-          <w:b/>
-        </w:rPr>
-        <w:t xml:space="preserve">Pacientes</w:t>
-      </w:r>
-      <w:r>
-        <w:t xml:space="preserve"> </w:t>
-      </w:r>
-      <w:r>
-        <w:t xml:space="preserve">-</w:t>
-      </w:r>
-      <w:r>
-        <w:t xml:space="preserve"> </w:t>
-      </w:r>
-      <w:r>
-        <w:rPr>
-          <w:rStyle w:val="VerbatimChar"/>
-        </w:rPr>
-        <w:t xml:space="preserve">POST /pacientes</w:t>
-      </w:r>
-      <w:r>
-        <w:t xml:space="preserve"> </w:t>
-      </w:r>
-      <w:r>
-        <w:rPr>
-          <w:rStyle w:val="VerbatimChar"/>
-        </w:rPr>
-        <w:t xml:space="preserve">{ nombreCompleto, documento, correo, telefono, autorizacionDatos: true }</w:t>
-      </w:r>
-      <w:r>
-        <w:t xml:space="preserve"> </w:t>
-      </w:r>
-      <w:r>
-        <w:t xml:space="preserve">→ 201. La respuesta trae la</w:t>
-      </w:r>
-      <w:r>
-        <w:t xml:space="preserve"> </w:t>
-      </w:r>
-      <w:r>
-        <w:rPr>
-          <w:rStyle w:val="VerbatimChar"/>
-        </w:rPr>
-        <w:t xml:space="preserve">contrasenaTemporal</w:t>
-      </w:r>
-      <w:r>
-        <w:t xml:space="preserve">, que se muestra</w:t>
-      </w:r>
-      <w:r>
-        <w:t xml:space="preserve"> </w:t>
-      </w:r>
-      <w:r>
-        <w:rPr>
-          <w:bCs/>
-          <w:b/>
-        </w:rPr>
-        <w:t xml:space="preserve">una sola vez</w:t>
-      </w:r>
-      <w:r>
-        <w:t xml:space="preserve"> </w:t>
-      </w:r>
-      <w:r>
-        <w:t xml:space="preserve">con botón de copiar, y</w:t>
-      </w:r>
-      <w:r>
-        <w:t xml:space="preserve"> </w:t>
-      </w:r>
-      <w:r>
-        <w:rPr>
-          <w:rStyle w:val="VerbatimChar"/>
-        </w:rPr>
-        <w:t xml:space="preserve">citasVinculadas</w:t>
-      </w:r>
-      <w:r>
-        <w:t xml:space="preserve">, que son las citas que pidió antes sin cuenta.</w:t>
-      </w:r>
-      <w:r>
-        <w:t xml:space="preserve"> </w:t>
-      </w:r>
-      <w:r>
-        <w:t xml:space="preserve">-</w:t>
-      </w:r>
-      <w:r>
-        <w:t xml:space="preserve"> </w:t>
-      </w:r>
-      <w:r>
-        <w:rPr>
-          <w:rStyle w:val="VerbatimChar"/>
-        </w:rPr>
-        <w:t xml:space="preserve">GET /pacientes?q=</w:t>
-      </w:r>
-      <w:r>
-        <w:t xml:space="preserve"> </w:t>
-      </w:r>
-      <w:r>
-        <w:t xml:space="preserve">→ búsqueda por nombre, documento o correo.</w:t>
-      </w:r>
-      <w:r>
-        <w:t xml:space="preserve"> </w:t>
-      </w:r>
-      <w:r>
-        <w:t xml:space="preserve">-</w:t>
-      </w:r>
-      <w:r>
-        <w:t xml:space="preserve"> </w:t>
-      </w:r>
-      <w:r>
-        <w:rPr>
-          <w:rStyle w:val="VerbatimChar"/>
-        </w:rPr>
-        <w:t xml:space="preserve">POST /pacientes/:id/restablecer-contrasena</w:t>
-      </w:r>
-      <w:r>
-        <w:t xml:space="preserve"> </w:t>
-      </w:r>
-      <w:r>
-        <w:t xml:space="preserve">→</w:t>
-      </w:r>
-      <w:r>
-        <w:t xml:space="preserve"> </w:t>
-      </w:r>
-      <w:r>
-        <w:rPr>
-          <w:rStyle w:val="VerbatimChar"/>
-        </w:rPr>
-        <w:t xml:space="preserve">{ mensaje, contrasenaTemporal }</w:t>
-      </w:r>
-      <w:r>
-        <w:t xml:space="preserve">:</w:t>
-      </w:r>
-      <w:r>
-        <w:t xml:space="preserve"> </w:t>
-      </w:r>
-      <w:r>
-        <w:t xml:space="preserve">“</w:t>
-      </w:r>
-      <w:r>
-        <w:t xml:space="preserve">olvidé mi contraseña</w:t>
-      </w:r>
-      <w:r>
-        <w:t xml:space="preserve">”</w:t>
-      </w:r>
-      <w:r>
-        <w:t xml:space="preserve">. La clave temporal se muestra</w:t>
-      </w:r>
-      <w:r>
-        <w:t xml:space="preserve"> </w:t>
-      </w:r>
-      <w:r>
-        <w:rPr>
-          <w:bCs/>
-          <w:b/>
-        </w:rPr>
-        <w:t xml:space="preserve">una sola vez</w:t>
-      </w:r>
-      <w:r>
-        <w:t xml:space="preserve"> </w:t>
-      </w:r>
-      <w:r>
-        <w:t xml:space="preserve">(botón de copiar) y el paciente deberá cambiarla al ingresar. Va como botón en la ficha del paciente, con confirmación.</w:t>
-      </w:r>
-    </w:p>
-    <w:p>
-      <w:pPr>
-        <w:pStyle w:val="BodyText"/>
-      </w:pPr>
-      <w:r>
-        <w:rPr>
-          <w:bCs/>
-          <w:b/>
-        </w:rPr>
-        <w:t xml:space="preserve">Ficha del paciente e historia clínica</w:t>
-      </w:r>
-      <w:r>
-        <w:t xml:space="preserve"> </w:t>
-      </w:r>
-      <w:r>
-        <w:t xml:space="preserve">-</w:t>
-      </w:r>
-      <w:r>
-        <w:t xml:space="preserve"> </w:t>
-      </w:r>
-      <w:r>
-        <w:rPr>
-          <w:rStyle w:val="VerbatimChar"/>
-        </w:rPr>
-        <w:t xml:space="preserve">GET /pacientes/:id</w:t>
-      </w:r>
-      <w:r>
-        <w:t xml:space="preserve"> </w:t>
-      </w:r>
-      <w:r>
-        <w:t xml:space="preserve">→</w:t>
-      </w:r>
-      <w:r>
-        <w:t xml:space="preserve"> </w:t>
-      </w:r>
-      <w:r>
-        <w:rPr>
-          <w:rStyle w:val="VerbatimChar"/>
-        </w:rPr>
-        <w:t xml:space="preserve">{ paciente: { id, nombreCompleto, documento, correo, telefono, activo, ... }, citas: [...], historia: [...] }</w:t>
-      </w:r>
-      <w:r>
-        <w:t xml:space="preserve"> </w:t>
-      </w:r>
-      <w:r>
-        <w:t xml:space="preserve">— la pantalla de ficha en una sola petición.</w:t>
-      </w:r>
-      <w:r>
-        <w:t xml:space="preserve"> </w:t>
-      </w:r>
-      <w:r>
-        <w:t xml:space="preserve">-</w:t>
-      </w:r>
-      <w:r>
-        <w:t xml:space="preserve"> </w:t>
-      </w:r>
-      <w:r>
-        <w:rPr>
-          <w:rStyle w:val="VerbatimChar"/>
-        </w:rPr>
-        <w:t xml:space="preserve">GET /pacientes/:id/historia</w:t>
-      </w:r>
-      <w:r>
-        <w:t xml:space="preserve"> </w:t>
-      </w:r>
-      <w:r>
-        <w:t xml:space="preserve">→ entradas, la atención más reciente primero:</w:t>
-      </w:r>
-      <w:r>
-        <w:t xml:space="preserve"> </w:t>
-      </w:r>
-      <w:r>
-        <w:rPr>
-          <w:rStyle w:val="VerbatimChar"/>
-        </w:rPr>
-        <w:t xml:space="preserve">[{ id, fechaAtencion, especialidad, especialista, citaId, procedimiento, notas, corrigeA, correcciones: [ids], autor, creadoEn }]</w:t>
-      </w:r>
-      <w:r>
-        <w:t xml:space="preserve">.</w:t>
-      </w:r>
-      <w:r>
-        <w:t xml:space="preserve"> </w:t>
-      </w:r>
-      <w:r>
-        <w:t xml:space="preserve">-</w:t>
-      </w:r>
-      <w:r>
-        <w:t xml:space="preserve"> </w:t>
-      </w:r>
-      <w:r>
-        <w:rPr>
-          <w:rStyle w:val="VerbatimChar"/>
-        </w:rPr>
-        <w:t xml:space="preserve">POST /pacientes/:id/historia</w:t>
-      </w:r>
-      <w:r>
-        <w:t xml:space="preserve"> </w:t>
-      </w:r>
-      <w:r>
-        <w:rPr>
-          <w:rStyle w:val="VerbatimChar"/>
-        </w:rPr>
-        <w:t xml:space="preserve">{ fechaAtencion, procedimiento, notas?, especialidadId?, especialistaId?, citaId? }</w:t>
-      </w:r>
-      <w:r>
-        <w:t xml:space="preserve"> </w:t>
-      </w:r>
-      <w:r>
-        <w:t xml:space="preserve">→ 201. Con</w:t>
-      </w:r>
-      <w:r>
-        <w:t xml:space="preserve"> </w:t>
-      </w:r>
-      <w:r>
-        <w:rPr>
-          <w:rStyle w:val="VerbatimChar"/>
-        </w:rPr>
-        <w:t xml:space="preserve">citaId</w:t>
-      </w:r>
-      <w:r>
-        <w:t xml:space="preserve"> </w:t>
-      </w:r>
-      <w:r>
-        <w:t xml:space="preserve">(de ese paciente) se pueden omitir fecha, especialidad y especialista. Fecha futura → 400.</w:t>
-      </w:r>
-      <w:r>
-        <w:t xml:space="preserve"> </w:t>
-      </w:r>
-      <w:r>
-        <w:t xml:space="preserve">-</w:t>
-      </w:r>
-      <w:r>
-        <w:t xml:space="preserve"> </w:t>
-      </w:r>
-      <w:r>
-        <w:rPr>
-          <w:rStyle w:val="VerbatimChar"/>
-        </w:rPr>
-        <w:t xml:space="preserve">POST /admin/historia/:id/correccion</w:t>
-      </w:r>
-      <w:r>
-        <w:t xml:space="preserve"> </w:t>
-      </w:r>
-      <w:r>
-        <w:rPr>
-          <w:rStyle w:val="VerbatimChar"/>
-        </w:rPr>
-        <w:t xml:space="preserve">{ notas, procedimiento?, fechaAtencion? }</w:t>
-      </w:r>
-      <w:r>
-        <w:t xml:space="preserve"> </w:t>
-      </w:r>
-      <w:r>
-        <w:t xml:space="preserve">→ 201: crea una entrada nueva que corrige a la indicada;</w:t>
-      </w:r>
-      <w:r>
-        <w:t xml:space="preserve"> </w:t>
-      </w:r>
-      <w:r>
-        <w:rPr>
-          <w:rStyle w:val="VerbatimChar"/>
-        </w:rPr>
-        <w:t xml:space="preserve">notas</w:t>
-      </w:r>
-      <w:r>
-        <w:t xml:space="preserve"> </w:t>
-      </w:r>
-      <w:r>
-        <w:t xml:space="preserve">(qué se corrige y por qué) es obligatorio.</w:t>
-      </w:r>
-      <w:r>
-        <w:t xml:space="preserve"> </w:t>
-      </w:r>
-      <w:r>
-        <w:t xml:space="preserve">-</w:t>
-      </w:r>
-      <w:r>
-        <w:t xml:space="preserve"> </w:t>
-      </w:r>
-      <w:r>
-        <w:rPr>
-          <w:bCs/>
-          <w:b/>
-        </w:rPr>
-        <w:t xml:space="preserve">No hay editar ni borrar</w:t>
-      </w:r>
-      <w:r>
-        <w:t xml:space="preserve">: la historia clínica no se modifica (Resolución 1995 de 1999). En pantalla, una entrada con</w:t>
-      </w:r>
-      <w:r>
-        <w:t xml:space="preserve"> </w:t>
-      </w:r>
-      <w:r>
-        <w:rPr>
-          <w:rStyle w:val="VerbatimChar"/>
-        </w:rPr>
-        <w:t xml:space="preserve">correcciones</w:t>
-      </w:r>
-      <w:r>
-        <w:t xml:space="preserve"> </w:t>
-      </w:r>
-      <w:r>
-        <w:t xml:space="preserve">se muestra tachada o marcada</w:t>
-      </w:r>
-      <w:r>
-        <w:t xml:space="preserve"> </w:t>
-      </w:r>
-      <w:r>
-        <w:t xml:space="preserve">“</w:t>
-      </w:r>
-      <w:r>
-        <w:t xml:space="preserve">Corregida</w:t>
-      </w:r>
-      <w:r>
-        <w:t xml:space="preserve">”</w:t>
-      </w:r>
-      <w:r>
-        <w:t xml:space="preserve"> </w:t>
-      </w:r>
-      <w:r>
-        <w:t xml:space="preserve">con enlace a su corrección; la corrección muestra</w:t>
-      </w:r>
-      <w:r>
-        <w:t xml:space="preserve"> </w:t>
-      </w:r>
-      <w:r>
-        <w:t xml:space="preserve">“</w:t>
-      </w:r>
-      <w:r>
-        <w:t xml:space="preserve">Corrige la entrada del</w:t>
-      </w:r>
-      <w:r>
-        <w:t xml:space="preserve"> </w:t>
-      </w:r>
-      <w:r>
-        <w:t xml:space="preserve">”</w:t>
-      </w:r>
-      <w:r>
-        <w:t xml:space="preserve">. Sugerencia: botón</w:t>
-      </w:r>
-      <w:r>
-        <w:t xml:space="preserve"> </w:t>
-      </w:r>
-      <w:r>
-        <w:t xml:space="preserve">“</w:t>
-      </w:r>
-      <w:r>
-        <w:t xml:space="preserve">Agregar a la historia</w:t>
-      </w:r>
-      <w:r>
-        <w:t xml:space="preserve">”</w:t>
-      </w:r>
-      <w:r>
-        <w:t xml:space="preserve"> </w:t>
-      </w:r>
-      <w:r>
-        <w:t xml:space="preserve">junto a cada cita marcada como atendida, con</w:t>
-      </w:r>
-      <w:r>
-        <w:t xml:space="preserve"> </w:t>
-      </w:r>
-      <w:r>
-        <w:rPr>
-          <w:rStyle w:val="VerbatimChar"/>
-        </w:rPr>
-        <w:t xml:space="preserve">citaId</w:t>
-      </w:r>
-      <w:r>
-        <w:t xml:space="preserve"> </w:t>
-      </w:r>
-      <w:r>
-        <w:t xml:space="preserve">ya puesto.</w:t>
-      </w:r>
-    </w:p>
-    <w:bookmarkEnd w:id="24"/>
-    <w:bookmarkStart w:id="25" w:name="aún-no-existe"/>
-    <w:p>
-      <w:pPr>
-        <w:pStyle w:val="Heading2"/>
-      </w:pPr>
-      <w:r>
-        <w:t xml:space="preserve">Aún no existe</w:t>
-      </w:r>
-    </w:p>
     <w:p>
       <w:pPr>
         <w:numPr>
@@ -3893,7 +2563,36 @@
         <w:pStyle w:val="Compact"/>
       </w:pPr>
       <w:r>
-        <w:t xml:space="preserve">Importación desde Excel.</w:t>
+        <w:rPr>
+          <w:bCs/>
+          <w:b/>
+        </w:rPr>
+        <w:t xml:space="preserve">Cita de otra persona o inexistente:</w:t>
+      </w:r>
+      <w:r>
+        <w:t xml:space="preserve"> </w:t>
+      </w:r>
+      <w:r>
+        <w:rPr>
+          <w:bCs/>
+          <w:b/>
+        </w:rPr>
+        <w:t xml:space="preserve">404</w:t>
+      </w:r>
+      <w:r>
+        <w:t xml:space="preserve"> </w:t>
+      </w:r>
+      <w:r>
+        <w:t xml:space="preserve">“</w:t>
+      </w:r>
+      <w:r>
+        <w:t xml:space="preserve">Cita no encontrada.</w:t>
+      </w:r>
+      <w:r>
+        <w:t xml:space="preserve">”</w:t>
+      </w:r>
+      <w:r>
+        <w:t xml:space="preserve">, para no revelar qué citas existen.</w:t>
       </w:r>
     </w:p>
     <w:p>
@@ -3905,7 +2604,83 @@
         <w:pStyle w:val="Compact"/>
       </w:pPr>
       <w:r>
-        <w:t xml:space="preserve">Reprogramar o cancelar desde</w:t>
+        <w:rPr>
+          <w:bCs/>
+          <w:b/>
+        </w:rPr>
+        <w:t xml:space="preserve">Regla incumplida</w:t>
+      </w:r>
+      <w:r>
+        <w:t xml:space="preserve"> </w:t>
+      </w:r>
+      <w:r>
+        <w:t xml:space="preserve">(ya reprogramó, menos de 24 h, cancelada o pasada):</w:t>
+      </w:r>
+      <w:r>
+        <w:t xml:space="preserve"> </w:t>
+      </w:r>
+      <w:r>
+        <w:rPr>
+          <w:bCs/>
+          <w:b/>
+        </w:rPr>
+        <w:t xml:space="preserve">409</w:t>
+      </w:r>
+      <w:r>
+        <w:t xml:space="preserve"> </w:t>
+      </w:r>
+      <w:r>
+        <w:t xml:space="preserve">con el</w:t>
+      </w:r>
+      <w:r>
+        <w:t xml:space="preserve"> </w:t>
+      </w:r>
+      <w:r>
+        <w:rPr>
+          <w:rStyle w:val="VerbatimChar"/>
+        </w:rPr>
+        <w:t xml:space="preserve">motivo</w:t>
+      </w:r>
+      <w:r>
+        <w:t xml:space="preserve"> </w:t>
+      </w:r>
+      <w:r>
+        <w:t xml:space="preserve">como mensaje. Hora tomada por otra persona:</w:t>
+      </w:r>
+      <w:r>
+        <w:t xml:space="preserve"> </w:t>
+      </w:r>
+      <w:r>
+        <w:rPr>
+          <w:bCs/>
+          <w:b/>
+        </w:rPr>
+        <w:t xml:space="preserve">409</w:t>
+      </w:r>
+      <w:r>
+        <w:t xml:space="preserve">.</w:t>
+      </w:r>
+    </w:p>
+    <w:p>
+      <w:pPr>
+        <w:numPr>
+          <w:ilvl w:val="0"/>
+          <w:numId w:val="1007"/>
+        </w:numPr>
+        <w:pStyle w:val="Compact"/>
+      </w:pPr>
+      <w:r>
+        <w:rPr>
+          <w:bCs/>
+          <w:b/>
+        </w:rPr>
+        <w:t xml:space="preserve">Enlace de WhatsApp:</w:t>
+      </w:r>
+      <w:r>
+        <w:t xml:space="preserve"> </w:t>
+      </w:r>
+      <w:r>
+        <w:t xml:space="preserve">al reprogramar desde</w:t>
       </w:r>
       <w:r>
         <w:t xml:space="preserve"> </w:t>
@@ -3923,7 +2698,1528 @@
         <w:t xml:space="preserve"> </w:t>
       </w:r>
       <w:r>
-        <w:t xml:space="preserve">con sesión. Por ahora el paciente usa el enlace del WhatsApp.</w:t>
+        <w:t xml:space="preserve">el mensaje lleva un enlace nuevo y el anterior deja de servir, igual que cuando reprograma la secretaria.</w:t>
+      </w:r>
+    </w:p>
+    <w:p>
+      <w:pPr>
+        <w:numPr>
+          <w:ilvl w:val="0"/>
+          <w:numId w:val="1007"/>
+        </w:numPr>
+        <w:pStyle w:val="Compact"/>
+      </w:pPr>
+      <w:r>
+        <w:rPr>
+          <w:bCs/>
+          <w:b/>
+        </w:rPr>
+        <w:t xml:space="preserve">Agendar con sesión:</w:t>
+      </w:r>
+      <w:r>
+        <w:t xml:space="preserve"> </w:t>
+      </w:r>
+      <w:r>
+        <w:t xml:space="preserve">el formulario se llena con</w:t>
+      </w:r>
+      <w:r>
+        <w:t xml:space="preserve"> </w:t>
+      </w:r>
+      <w:r>
+        <w:rPr>
+          <w:rStyle w:val="VerbatimChar"/>
+        </w:rPr>
+        <w:t xml:space="preserve">GET /auth/perfil</w:t>
+      </w:r>
+      <w:r>
+        <w:t xml:space="preserve">; el paciente solo confirma la autorización de datos.</w:t>
+      </w:r>
+    </w:p>
+    <w:bookmarkEnd w:id="23"/>
+    <w:bookmarkStart w:id="24" w:name="X9f6c278bb6b588260d8a391646e30302db82efa"/>
+    <w:p>
+      <w:pPr>
+        <w:pStyle w:val="Heading2"/>
+      </w:pPr>
+      <w:r>
+        <w:t xml:space="preserve">4. Panel de la secretaria (todo exige rol administrador)</w:t>
+      </w:r>
+    </w:p>
+    <w:p>
+      <w:pPr>
+        <w:pStyle w:val="FirstParagraph"/>
+      </w:pPr>
+      <w:r>
+        <w:rPr>
+          <w:bCs/>
+          <w:b/>
+        </w:rPr>
+        <w:t xml:space="preserve">Especialidades</w:t>
+      </w:r>
+      <w:r>
+        <w:t xml:space="preserve"> </w:t>
+      </w:r>
+      <w:r>
+        <w:t xml:space="preserve">-</w:t>
+      </w:r>
+      <w:r>
+        <w:t xml:space="preserve"> </w:t>
+      </w:r>
+      <w:r>
+        <w:rPr>
+          <w:rStyle w:val="VerbatimChar"/>
+        </w:rPr>
+        <w:t xml:space="preserve">GET /admin/especialidades</w:t>
+      </w:r>
+      <w:r>
+        <w:t xml:space="preserve"> </w:t>
+      </w:r>
+      <w:r>
+        <w:t xml:space="preserve">→</w:t>
+      </w:r>
+      <w:r>
+        <w:t xml:space="preserve"> </w:t>
+      </w:r>
+      <w:r>
+        <w:rPr>
+          <w:rStyle w:val="VerbatimChar"/>
+        </w:rPr>
+        <w:t xml:space="preserve">[{ id, codigo, nombre, descripcion, activo, especialistasActivos }]</w:t>
+      </w:r>
+      <w:r>
+        <w:t xml:space="preserve"> </w:t>
+      </w:r>
+      <w:r>
+        <w:t xml:space="preserve">-</w:t>
+      </w:r>
+      <w:r>
+        <w:t xml:space="preserve"> </w:t>
+      </w:r>
+      <w:r>
+        <w:rPr>
+          <w:rStyle w:val="VerbatimChar"/>
+        </w:rPr>
+        <w:t xml:space="preserve">POST /admin/especialidades</w:t>
+      </w:r>
+      <w:r>
+        <w:t xml:space="preserve"> </w:t>
+      </w:r>
+      <w:r>
+        <w:rPr>
+          <w:rStyle w:val="VerbatimChar"/>
+        </w:rPr>
+        <w:t xml:space="preserve">{ nombre, descripcion? }</w:t>
+      </w:r>
+      <w:r>
+        <w:t xml:space="preserve"> </w:t>
+      </w:r>
+      <w:r>
+        <w:t xml:space="preserve">→ 201</w:t>
+      </w:r>
+      <w:r>
+        <w:t xml:space="preserve"> </w:t>
+      </w:r>
+      <w:r>
+        <w:t xml:space="preserve">-</w:t>
+      </w:r>
+      <w:r>
+        <w:t xml:space="preserve"> </w:t>
+      </w:r>
+      <w:r>
+        <w:rPr>
+          <w:rStyle w:val="VerbatimChar"/>
+        </w:rPr>
+        <w:t xml:space="preserve">PATCH /admin/especialidades/:id</w:t>
+      </w:r>
+      <w:r>
+        <w:t xml:space="preserve"> </w:t>
+      </w:r>
+      <w:r>
+        <w:rPr>
+          <w:rStyle w:val="VerbatimChar"/>
+        </w:rPr>
+        <w:t xml:space="preserve">{ nombre?, descripcion?, activo? }</w:t>
+      </w:r>
+    </w:p>
+    <w:p>
+      <w:pPr>
+        <w:pStyle w:val="BodyText"/>
+      </w:pPr>
+      <w:r>
+        <w:rPr>
+          <w:bCs/>
+          <w:b/>
+        </w:rPr>
+        <w:t xml:space="preserve">Especialistas</w:t>
+      </w:r>
+      <w:r>
+        <w:t xml:space="preserve"> </w:t>
+      </w:r>
+      <w:r>
+        <w:t xml:space="preserve">-</w:t>
+      </w:r>
+      <w:r>
+        <w:t xml:space="preserve"> </w:t>
+      </w:r>
+      <w:r>
+        <w:rPr>
+          <w:rStyle w:val="VerbatimChar"/>
+        </w:rPr>
+        <w:t xml:space="preserve">GET /admin/especialistas</w:t>
+      </w:r>
+      <w:r>
+        <w:t xml:space="preserve"> </w:t>
+      </w:r>
+      <w:r>
+        <w:t xml:space="preserve">→</w:t>
+      </w:r>
+      <w:r>
+        <w:t xml:space="preserve"> </w:t>
+      </w:r>
+      <w:r>
+        <w:rPr>
+          <w:rStyle w:val="VerbatimChar"/>
+        </w:rPr>
+        <w:t xml:space="preserve">[{ id, nombre, activo, especialidades: [{ id, nombre }] }]</w:t>
+      </w:r>
+      <w:r>
+        <w:t xml:space="preserve"> </w:t>
+      </w:r>
+      <w:r>
+        <w:t xml:space="preserve">-</w:t>
+      </w:r>
+      <w:r>
+        <w:t xml:space="preserve"> </w:t>
+      </w:r>
+      <w:r>
+        <w:rPr>
+          <w:rStyle w:val="VerbatimChar"/>
+        </w:rPr>
+        <w:t xml:space="preserve">POST /admin/especialistas</w:t>
+      </w:r>
+      <w:r>
+        <w:t xml:space="preserve"> </w:t>
+      </w:r>
+      <w:r>
+        <w:rPr>
+          <w:rStyle w:val="VerbatimChar"/>
+        </w:rPr>
+        <w:t xml:space="preserve">{ nombre, especialidadIds: [1, 3] }</w:t>
+      </w:r>
+      <w:r>
+        <w:t xml:space="preserve"> </w:t>
+      </w:r>
+      <w:r>
+        <w:t xml:space="preserve">(al menos una) → 201</w:t>
+      </w:r>
+      <w:r>
+        <w:t xml:space="preserve"> </w:t>
+      </w:r>
+      <w:r>
+        <w:t xml:space="preserve">-</w:t>
+      </w:r>
+      <w:r>
+        <w:t xml:space="preserve"> </w:t>
+      </w:r>
+      <w:r>
+        <w:rPr>
+          <w:rStyle w:val="VerbatimChar"/>
+        </w:rPr>
+        <w:t xml:space="preserve">PATCH /admin/especialistas/:id</w:t>
+      </w:r>
+      <w:r>
+        <w:t xml:space="preserve"> </w:t>
+      </w:r>
+      <w:r>
+        <w:rPr>
+          <w:rStyle w:val="VerbatimChar"/>
+        </w:rPr>
+        <w:t xml:space="preserve">{ nombre?, activo?, especialidadIds? }</w:t>
+      </w:r>
+    </w:p>
+    <w:p>
+      <w:pPr>
+        <w:pStyle w:val="BodyText"/>
+      </w:pPr>
+      <w:r>
+        <w:rPr>
+          <w:bCs/>
+          <w:b/>
+        </w:rPr>
+        <w:t xml:space="preserve">Disponibilidad</w:t>
+      </w:r>
+      <w:r>
+        <w:t xml:space="preserve"> </w:t>
+      </w:r>
+      <w:r>
+        <w:t xml:space="preserve">-</w:t>
+      </w:r>
+      <w:r>
+        <w:t xml:space="preserve"> </w:t>
+      </w:r>
+      <w:r>
+        <w:rPr>
+          <w:bCs/>
+          <w:b/>
+        </w:rPr>
+        <w:t xml:space="preserve">Ver:</w:t>
+      </w:r>
+      <w:r>
+        <w:t xml:space="preserve"> </w:t>
+      </w:r>
+      <w:r>
+        <w:rPr>
+          <w:rStyle w:val="VerbatimChar"/>
+        </w:rPr>
+        <w:t xml:space="preserve">GET /admin/especialistas/:id/franjas?desde=&amp;hasta=</w:t>
+      </w:r>
+      <w:r>
+        <w:t xml:space="preserve"> </w:t>
+      </w:r>
+      <w:r>
+        <w:t xml:space="preserve">(por defecto hoy + 30 días) →</w:t>
+      </w:r>
+      <w:r>
+        <w:t xml:space="preserve"> </w:t>
+      </w:r>
+      <w:r>
+        <w:rPr>
+          <w:rStyle w:val="VerbatimChar"/>
+        </w:rPr>
+        <w:t xml:space="preserve">[{ id, fecha, hora, cita: null | { id, paciente, estado } }]</w:t>
+      </w:r>
+      <w:r>
+        <w:t xml:space="preserve">. Pinta cada hora libre u ocupada con el nombre del paciente.</w:t>
+      </w:r>
+      <w:r>
+        <w:t xml:space="preserve"> </w:t>
+      </w:r>
+      <w:r>
+        <w:t xml:space="preserve">-</w:t>
+      </w:r>
+      <w:r>
+        <w:t xml:space="preserve"> </w:t>
+      </w:r>
+      <w:r>
+        <w:rPr>
+          <w:bCs/>
+          <w:b/>
+        </w:rPr>
+        <w:t xml:space="preserve">Publicar:</w:t>
+      </w:r>
+      <w:r>
+        <w:t xml:space="preserve"> </w:t>
+      </w:r>
+      <w:r>
+        <w:rPr>
+          <w:rStyle w:val="VerbatimChar"/>
+        </w:rPr>
+        <w:t xml:space="preserve">POST /admin/especialistas/:id/franjas</w:t>
+      </w:r>
+      <w:r>
+        <w:t xml:space="preserve"> </w:t>
+      </w:r>
+      <w:r>
+        <w:rPr>
+          <w:rStyle w:val="VerbatimChar"/>
+        </w:rPr>
+        <w:t xml:space="preserve">{ fechas: ["2026-10-15", "2026-10-16"], horas: ["08:00", "08:30"] }</w:t>
+      </w:r>
+      <w:r>
+        <w:t xml:space="preserve"> </w:t>
+      </w:r>
+      <w:r>
+        <w:t xml:space="preserve">→ 201</w:t>
+      </w:r>
+      <w:r>
+        <w:t xml:space="preserve"> </w:t>
+      </w:r>
+      <w:r>
+        <w:rPr>
+          <w:rStyle w:val="VerbatimChar"/>
+        </w:rPr>
+        <w:t xml:space="preserve">{ total }</w:t>
+      </w:r>
+      <w:r>
+        <w:t xml:space="preserve">. Publica cada hora en cada fecha; varias fechas sirven de</w:t>
+      </w:r>
+      <w:r>
+        <w:t xml:space="preserve"> </w:t>
+      </w:r>
+      <w:r>
+        <w:t xml:space="preserve">“</w:t>
+      </w:r>
+      <w:r>
+        <w:t xml:space="preserve">copiar a varios días</w:t>
+      </w:r>
+      <w:r>
+        <w:t xml:space="preserve">”</w:t>
+      </w:r>
+      <w:r>
+        <w:t xml:space="preserve">. Sugerencia de UI: cuadrícula de 7:00 a 18:00 cada 30 minutos con casillas.</w:t>
+      </w:r>
+      <w:r>
+        <w:t xml:space="preserve"> </w:t>
+      </w:r>
+      <w:r>
+        <w:t xml:space="preserve">-</w:t>
+      </w:r>
+      <w:r>
+        <w:t xml:space="preserve"> </w:t>
+      </w:r>
+      <w:r>
+        <w:rPr>
+          <w:bCs/>
+          <w:b/>
+        </w:rPr>
+        <w:t xml:space="preserve">Quitar:</w:t>
+      </w:r>
+      <w:r>
+        <w:t xml:space="preserve"> </w:t>
+      </w:r>
+      <w:r>
+        <w:rPr>
+          <w:rStyle w:val="VerbatimChar"/>
+        </w:rPr>
+        <w:t xml:space="preserve">DELETE /admin/franjas/:id</w:t>
+      </w:r>
+      <w:r>
+        <w:t xml:space="preserve">. Si la hora tiene cita →</w:t>
+      </w:r>
+      <w:r>
+        <w:t xml:space="preserve"> </w:t>
+      </w:r>
+      <w:r>
+        <w:rPr>
+          <w:bCs/>
+          <w:b/>
+        </w:rPr>
+        <w:t xml:space="preserve">409</w:t>
+      </w:r>
+      <w:r>
+        <w:t xml:space="preserve"> </w:t>
+      </w:r>
+      <w:r>
+        <w:t xml:space="preserve">con el nombre del paciente; hay que reprogramar o cancelar primero.</w:t>
+      </w:r>
+    </w:p>
+    <w:p>
+      <w:pPr>
+        <w:pStyle w:val="BodyText"/>
+      </w:pPr>
+      <w:r>
+        <w:rPr>
+          <w:bCs/>
+          <w:b/>
+        </w:rPr>
+        <w:t xml:space="preserve">Agenda</w:t>
+      </w:r>
+      <w:r>
+        <w:t xml:space="preserve"> </w:t>
+      </w:r>
+      <w:r>
+        <w:t xml:space="preserve">-</w:t>
+      </w:r>
+      <w:r>
+        <w:t xml:space="preserve"> </w:t>
+      </w:r>
+      <w:r>
+        <w:rPr>
+          <w:bCs/>
+          <w:b/>
+        </w:rPr>
+        <w:t xml:space="preserve">Ver:</w:t>
+      </w:r>
+      <w:r>
+        <w:t xml:space="preserve"> </w:t>
+      </w:r>
+      <w:r>
+        <w:rPr>
+          <w:rStyle w:val="VerbatimChar"/>
+        </w:rPr>
+        <w:t xml:space="preserve">GET /admin/citas?fecha=</w:t>
+      </w:r>
+      <w:r>
+        <w:t xml:space="preserve"> </w:t>
+      </w:r>
+      <w:r>
+        <w:t xml:space="preserve">o</w:t>
+      </w:r>
+      <w:r>
+        <w:t xml:space="preserve"> </w:t>
+      </w:r>
+      <w:r>
+        <w:rPr>
+          <w:rStyle w:val="VerbatimChar"/>
+        </w:rPr>
+        <w:t xml:space="preserve">?desde=&amp;hasta=</w:t>
+      </w:r>
+      <w:r>
+        <w:t xml:space="preserve">, más</w:t>
+      </w:r>
+      <w:r>
+        <w:t xml:space="preserve"> </w:t>
+      </w:r>
+      <w:r>
+        <w:rPr>
+          <w:rStyle w:val="VerbatimChar"/>
+        </w:rPr>
+        <w:t xml:space="preserve">&amp;especialistaId=&amp;estado=&amp;q=</w:t>
+      </w:r>
+      <w:r>
+        <w:t xml:space="preserve"> </w:t>
+      </w:r>
+      <w:r>
+        <w:t xml:space="preserve">(</w:t>
+      </w:r>
+      <w:r>
+        <w:rPr>
+          <w:rStyle w:val="VerbatimChar"/>
+        </w:rPr>
+        <w:t xml:space="preserve">q</w:t>
+      </w:r>
+      <w:r>
+        <w:t xml:space="preserve"> </w:t>
+      </w:r>
+      <w:r>
+        <w:t xml:space="preserve">busca por nombre, documento o teléfono) → citas con</w:t>
+      </w:r>
+      <w:r>
+        <w:t xml:space="preserve"> </w:t>
+      </w:r>
+      <w:r>
+        <w:rPr>
+          <w:rStyle w:val="VerbatimChar"/>
+        </w:rPr>
+        <w:t xml:space="preserve">especialidadId</w:t>
+      </w:r>
+      <w:r>
+        <w:t xml:space="preserve">,</w:t>
+      </w:r>
+      <w:r>
+        <w:t xml:space="preserve"> </w:t>
+      </w:r>
+      <w:r>
+        <w:rPr>
+          <w:rStyle w:val="VerbatimChar"/>
+        </w:rPr>
+        <w:t xml:space="preserve">documento</w:t>
+      </w:r>
+      <w:r>
+        <w:t xml:space="preserve">,</w:t>
+      </w:r>
+      <w:r>
+        <w:t xml:space="preserve"> </w:t>
+      </w:r>
+      <w:r>
+        <w:rPr>
+          <w:rStyle w:val="VerbatimChar"/>
+        </w:rPr>
+        <w:t xml:space="preserve">telefono</w:t>
+      </w:r>
+      <w:r>
+        <w:t xml:space="preserve">,</w:t>
+      </w:r>
+      <w:r>
+        <w:t xml:space="preserve"> </w:t>
+      </w:r>
+      <w:r>
+        <w:rPr>
+          <w:rStyle w:val="VerbatimChar"/>
+        </w:rPr>
+        <w:t xml:space="preserve">correo</w:t>
+      </w:r>
+      <w:r>
+        <w:t xml:space="preserve">,</w:t>
+      </w:r>
+      <w:r>
+        <w:t xml:space="preserve"> </w:t>
+      </w:r>
+      <w:r>
+        <w:rPr>
+          <w:rStyle w:val="VerbatimChar"/>
+        </w:rPr>
+        <w:t xml:space="preserve">pacienteId</w:t>
+      </w:r>
+      <w:r>
+        <w:t xml:space="preserve">,</w:t>
+      </w:r>
+      <w:r>
+        <w:t xml:space="preserve"> </w:t>
+      </w:r>
+      <w:r>
+        <w:rPr>
+          <w:rStyle w:val="VerbatimChar"/>
+        </w:rPr>
+        <w:t xml:space="preserve">canceladaPor</w:t>
+      </w:r>
+      <w:r>
+        <w:t xml:space="preserve">,</w:t>
+      </w:r>
+      <w:r>
+        <w:t xml:space="preserve"> </w:t>
+      </w:r>
+      <w:r>
+        <w:rPr>
+          <w:rStyle w:val="VerbatimChar"/>
+        </w:rPr>
+        <w:t xml:space="preserve">creadoEn</w:t>
+      </w:r>
+      <w:r>
+        <w:t xml:space="preserve">.</w:t>
+      </w:r>
+      <w:r>
+        <w:t xml:space="preserve"> </w:t>
+      </w:r>
+      <w:r>
+        <w:t xml:space="preserve">-</w:t>
+      </w:r>
+      <w:r>
+        <w:t xml:space="preserve"> </w:t>
+      </w:r>
+      <w:r>
+        <w:rPr>
+          <w:bCs/>
+          <w:b/>
+        </w:rPr>
+        <w:t xml:space="preserve">Cambiar estado:</w:t>
+      </w:r>
+      <w:r>
+        <w:t xml:space="preserve"> </w:t>
+      </w:r>
+      <w:r>
+        <w:rPr>
+          <w:rStyle w:val="VerbatimChar"/>
+        </w:rPr>
+        <w:t xml:space="preserve">PATCH /admin/citas/:id/estado</w:t>
+      </w:r>
+      <w:r>
+        <w:t xml:space="preserve"> </w:t>
+      </w:r>
+      <w:r>
+        <w:rPr>
+          <w:rStyle w:val="VerbatimChar"/>
+        </w:rPr>
+        <w:t xml:space="preserve">{ estado: "atendida" | "no_asistio" | "cancelada" }</w:t>
+      </w:r>
+      <w:r>
+        <w:t xml:space="preserve">. Atendida o no asistió solo se permite cuando ya llegó la hora.</w:t>
+      </w:r>
+      <w:r>
+        <w:t xml:space="preserve"> </w:t>
+      </w:r>
+      <w:r>
+        <w:t xml:space="preserve">-</w:t>
+      </w:r>
+      <w:r>
+        <w:t xml:space="preserve"> </w:t>
+      </w:r>
+      <w:r>
+        <w:rPr>
+          <w:bCs/>
+          <w:b/>
+        </w:rPr>
+        <w:t xml:space="preserve">Reprogramar:</w:t>
+      </w:r>
+      <w:r>
+        <w:t xml:space="preserve"> </w:t>
+      </w:r>
+      <w:r>
+        <w:rPr>
+          <w:rStyle w:val="VerbatimChar"/>
+        </w:rPr>
+        <w:t xml:space="preserve">POST /admin/citas/:id/reprogramar</w:t>
+      </w:r>
+      <w:r>
+        <w:t xml:space="preserve"> </w:t>
+      </w:r>
+      <w:r>
+        <w:rPr>
+          <w:rStyle w:val="VerbatimChar"/>
+        </w:rPr>
+        <w:t xml:space="preserve">{ franjaId }</w:t>
+      </w:r>
+      <w:r>
+        <w:t xml:space="preserve">. No tiene límite y puede pasar la cita a otro especialista de la misma especialidad. Respuesta:</w:t>
+      </w:r>
+      <w:r>
+        <w:t xml:space="preserve"> </w:t>
+      </w:r>
+      <w:r>
+        <w:rPr>
+          <w:rStyle w:val="VerbatimChar"/>
+        </w:rPr>
+        <w:t xml:space="preserve">{ mensaje, cita, notificacion }</w:t>
+      </w:r>
+      <w:r>
+        <w:t xml:space="preserve">.</w:t>
+      </w:r>
+      <w:r>
+        <w:t xml:space="preserve"> </w:t>
+      </w:r>
+      <w:r>
+        <w:t xml:space="preserve">-</w:t>
+      </w:r>
+      <w:r>
+        <w:t xml:space="preserve"> </w:t>
+      </w:r>
+      <w:r>
+        <w:rPr>
+          <w:bCs/>
+          <w:b/>
+        </w:rPr>
+        <w:t xml:space="preserve">Cancelar</w:t>
+      </w:r>
+      <w:r>
+        <w:t xml:space="preserve"> </w:t>
+      </w:r>
+      <w:r>
+        <w:t xml:space="preserve">(</w:t>
+      </w:r>
+      <w:r>
+        <w:rPr>
+          <w:rStyle w:val="VerbatimChar"/>
+        </w:rPr>
+        <w:t xml:space="preserve">PATCH …/estado</w:t>
+      </w:r>
+      <w:r>
+        <w:t xml:space="preserve"> </w:t>
+      </w:r>
+      <w:r>
+        <w:t xml:space="preserve">con</w:t>
+      </w:r>
+      <w:r>
+        <w:t xml:space="preserve"> </w:t>
+      </w:r>
+      <w:r>
+        <w:rPr>
+          <w:rStyle w:val="VerbatimChar"/>
+        </w:rPr>
+        <w:t xml:space="preserve">cancelada</w:t>
+      </w:r>
+      <w:r>
+        <w:t xml:space="preserve">) responde</w:t>
+      </w:r>
+      <w:r>
+        <w:t xml:space="preserve"> </w:t>
+      </w:r>
+      <w:r>
+        <w:rPr>
+          <w:rStyle w:val="VerbatimChar"/>
+        </w:rPr>
+        <w:t xml:space="preserve">{ mensaje, notificacion }</w:t>
+      </w:r>
+      <w:r>
+        <w:t xml:space="preserve">.</w:t>
+      </w:r>
+      <w:r>
+        <w:t xml:space="preserve"> </w:t>
+      </w:r>
+      <w:r>
+        <w:rPr>
+          <w:rStyle w:val="VerbatimChar"/>
+        </w:rPr>
+        <w:t xml:space="preserve">notificacion</w:t>
+      </w:r>
+      <w:r>
+        <w:t xml:space="preserve"> </w:t>
+      </w:r>
+      <w:r>
+        <w:t xml:space="preserve">es</w:t>
+      </w:r>
+      <w:r>
+        <w:t xml:space="preserve"> </w:t>
+      </w:r>
+      <w:r>
+        <w:rPr>
+          <w:rStyle w:val="VerbatimChar"/>
+        </w:rPr>
+        <w:t xml:space="preserve">{ id, estado, enlaceWhatsApp }</w:t>
+      </w:r>
+      <w:r>
+        <w:t xml:space="preserve">: si</w:t>
+      </w:r>
+      <w:r>
+        <w:t xml:space="preserve"> </w:t>
+      </w:r>
+      <w:r>
+        <w:rPr>
+          <w:rStyle w:val="VerbatimChar"/>
+        </w:rPr>
+        <w:t xml:space="preserve">estado</w:t>
+      </w:r>
+      <w:r>
+        <w:t xml:space="preserve"> </w:t>
+      </w:r>
+      <w:r>
+        <w:t xml:space="preserve">es</w:t>
+      </w:r>
+      <w:r>
+        <w:t xml:space="preserve"> </w:t>
+      </w:r>
+      <w:r>
+        <w:rPr>
+          <w:rStyle w:val="VerbatimChar"/>
+        </w:rPr>
+        <w:t xml:space="preserve">pendiente</w:t>
+      </w:r>
+      <w:r>
+        <w:t xml:space="preserve">, el panel ofrece</w:t>
+      </w:r>
+      <w:r>
+        <w:t xml:space="preserve"> </w:t>
+      </w:r>
+      <w:r>
+        <w:t xml:space="preserve">“</w:t>
+      </w:r>
+      <w:r>
+        <w:t xml:space="preserve">Enviar por WhatsApp</w:t>
+      </w:r>
+      <w:r>
+        <w:t xml:space="preserve">”</w:t>
+      </w:r>
+      <w:r>
+        <w:t xml:space="preserve"> </w:t>
+      </w:r>
+      <w:r>
+        <w:t xml:space="preserve">y</w:t>
+      </w:r>
+      <w:r>
+        <w:t xml:space="preserve"> </w:t>
+      </w:r>
+      <w:r>
+        <w:t xml:space="preserve">“</w:t>
+      </w:r>
+      <w:r>
+        <w:t xml:space="preserve">Marcar como enviado</w:t>
+      </w:r>
+      <w:r>
+        <w:t xml:space="preserve">”</w:t>
+      </w:r>
+      <w:r>
+        <w:t xml:space="preserve"> </w:t>
+      </w:r>
+      <w:r>
+        <w:t xml:space="preserve">ahí mismo.</w:t>
+      </w:r>
+    </w:p>
+    <w:p>
+      <w:pPr>
+        <w:pStyle w:val="BodyText"/>
+      </w:pPr>
+      <w:r>
+        <w:rPr>
+          <w:bCs/>
+          <w:b/>
+        </w:rPr>
+        <w:t xml:space="preserve">Mensajes de WhatsApp (modo manual)</w:t>
+      </w:r>
+      <w:r>
+        <w:t xml:space="preserve"> </w:t>
+      </w:r>
+      <w:r>
+        <w:t xml:space="preserve">-</w:t>
+      </w:r>
+      <w:r>
+        <w:t xml:space="preserve"> </w:t>
+      </w:r>
+      <w:r>
+        <w:rPr>
+          <w:rStyle w:val="VerbatimChar"/>
+        </w:rPr>
+        <w:t xml:space="preserve">GET /admin/notificaciones?estado=pendiente</w:t>
+      </w:r>
+      <w:r>
+        <w:t xml:space="preserve"> </w:t>
+      </w:r>
+      <w:r>
+        <w:t xml:space="preserve">(o</w:t>
+      </w:r>
+      <w:r>
+        <w:t xml:space="preserve"> </w:t>
+      </w:r>
+      <w:r>
+        <w:rPr>
+          <w:rStyle w:val="VerbatimChar"/>
+        </w:rPr>
+        <w:t xml:space="preserve">fallida</w:t>
+      </w:r>
+      <w:r>
+        <w:t xml:space="preserve">,</w:t>
+      </w:r>
+      <w:r>
+        <w:t xml:space="preserve"> </w:t>
+      </w:r>
+      <w:r>
+        <w:rPr>
+          <w:rStyle w:val="VerbatimChar"/>
+        </w:rPr>
+        <w:t xml:space="preserve">enviada</w:t>
+      </w:r>
+      <w:r>
+        <w:t xml:space="preserve">) →</w:t>
+      </w:r>
+      <w:r>
+        <w:t xml:space="preserve"> </w:t>
+      </w:r>
+      <w:r>
+        <w:rPr>
+          <w:rStyle w:val="VerbatimChar"/>
+        </w:rPr>
+        <w:t xml:space="preserve">[{ id, citaId, paciente, tipo, destino, mensaje, enlaceWhatsApp, creadoEn }]</w:t>
+      </w:r>
+      <w:r>
+        <w:t xml:space="preserve"> </w:t>
+      </w:r>
+      <w:r>
+        <w:t xml:space="preserve">- Botón</w:t>
+      </w:r>
+      <w:r>
+        <w:t xml:space="preserve"> </w:t>
+      </w:r>
+      <w:r>
+        <w:rPr>
+          <w:bCs/>
+          <w:b/>
+        </w:rPr>
+        <w:t xml:space="preserve">“</w:t>
+      </w:r>
+      <w:r>
+        <w:rPr>
+          <w:bCs/>
+          <w:b/>
+        </w:rPr>
+        <w:t xml:space="preserve">Enviar por WhatsApp</w:t>
+      </w:r>
+      <w:r>
+        <w:rPr>
+          <w:bCs/>
+          <w:b/>
+        </w:rPr>
+        <w:t xml:space="preserve">”</w:t>
+      </w:r>
+      <w:r>
+        <w:t xml:space="preserve">: abre</w:t>
+      </w:r>
+      <w:r>
+        <w:t xml:space="preserve"> </w:t>
+      </w:r>
+      <w:r>
+        <w:rPr>
+          <w:rStyle w:val="VerbatimChar"/>
+        </w:rPr>
+        <w:t xml:space="preserve">enlaceWhatsApp</w:t>
+      </w:r>
+      <w:r>
+        <w:t xml:space="preserve"> </w:t>
+      </w:r>
+      <w:r>
+        <w:t xml:space="preserve">en pestaña nueva. Abre la app o WhatsApp Web de la clínica con el texto listo.</w:t>
+      </w:r>
+      <w:r>
+        <w:t xml:space="preserve"> </w:t>
+      </w:r>
+      <w:r>
+        <w:t xml:space="preserve">- Luego, botón</w:t>
+      </w:r>
+      <w:r>
+        <w:t xml:space="preserve"> </w:t>
+      </w:r>
+      <w:r>
+        <w:rPr>
+          <w:bCs/>
+          <w:b/>
+        </w:rPr>
+        <w:t xml:space="preserve">“</w:t>
+      </w:r>
+      <w:r>
+        <w:rPr>
+          <w:bCs/>
+          <w:b/>
+        </w:rPr>
+        <w:t xml:space="preserve">Marcar como enviado</w:t>
+      </w:r>
+      <w:r>
+        <w:rPr>
+          <w:bCs/>
+          <w:b/>
+        </w:rPr>
+        <w:t xml:space="preserve">”</w:t>
+      </w:r>
+      <w:r>
+        <w:t xml:space="preserve">:</w:t>
+      </w:r>
+      <w:r>
+        <w:t xml:space="preserve"> </w:t>
+      </w:r>
+      <w:r>
+        <w:rPr>
+          <w:rStyle w:val="VerbatimChar"/>
+        </w:rPr>
+        <w:t xml:space="preserve">PATCH /admin/notificaciones/:id</w:t>
+      </w:r>
+      <w:r>
+        <w:t xml:space="preserve"> </w:t>
+      </w:r>
+      <w:r>
+        <w:rPr>
+          <w:rStyle w:val="VerbatimChar"/>
+        </w:rPr>
+        <w:t xml:space="preserve">{ estado: "enviada" }</w:t>
+      </w:r>
+      <w:r>
+        <w:t xml:space="preserve">.</w:t>
+      </w:r>
+      <w:r>
+        <w:t xml:space="preserve"> </w:t>
+      </w:r>
+      <w:r>
+        <w:t xml:space="preserve">-</w:t>
+      </w:r>
+      <w:r>
+        <w:t xml:space="preserve"> </w:t>
+      </w:r>
+      <w:r>
+        <w:rPr>
+          <w:bCs/>
+          <w:b/>
+        </w:rPr>
+        <w:t xml:space="preserve">Recordatorios del día anterior:</w:t>
+      </w:r>
+      <w:r>
+        <w:t xml:space="preserve"> </w:t>
+      </w:r>
+      <w:r>
+        <w:t xml:space="preserve">el servidor los genera solo cada 30 minutos dentro del horario configurado y aparecen como mensajes pendientes de tipo</w:t>
+      </w:r>
+      <w:r>
+        <w:t xml:space="preserve"> </w:t>
+      </w:r>
+      <w:r>
+        <w:rPr>
+          <w:rStyle w:val="VerbatimChar"/>
+        </w:rPr>
+        <w:t xml:space="preserve">recordatorio</w:t>
+      </w:r>
+      <w:r>
+        <w:t xml:space="preserve"> </w:t>
+      </w:r>
+      <w:r>
+        <w:t xml:space="preserve">(sin enlace). Para generarlos ya:</w:t>
+      </w:r>
+      <w:r>
+        <w:t xml:space="preserve"> </w:t>
+      </w:r>
+      <w:r>
+        <w:rPr>
+          <w:rStyle w:val="VerbatimChar"/>
+        </w:rPr>
+        <w:t xml:space="preserve">POST /admin/recordatorios</w:t>
+      </w:r>
+      <w:r>
+        <w:t xml:space="preserve"> </w:t>
+      </w:r>
+      <w:r>
+        <w:t xml:space="preserve">→</w:t>
+      </w:r>
+      <w:r>
+        <w:t xml:space="preserve"> </w:t>
+      </w:r>
+      <w:r>
+        <w:rPr>
+          <w:rStyle w:val="VerbatimChar"/>
+        </w:rPr>
+        <w:t xml:space="preserve">{ fecha, revisadas, resultados: [{ citaId, estado }] }</w:t>
+      </w:r>
+      <w:r>
+        <w:t xml:space="preserve">. Sugerencia: botón</w:t>
+      </w:r>
+      <w:r>
+        <w:t xml:space="preserve"> </w:t>
+      </w:r>
+      <w:r>
+        <w:t xml:space="preserve">“</w:t>
+      </w:r>
+      <w:r>
+        <w:t xml:space="preserve">Generar recordatorios de mañana</w:t>
+      </w:r>
+      <w:r>
+        <w:t xml:space="preserve">”</w:t>
+      </w:r>
+      <w:r>
+        <w:t xml:space="preserve"> </w:t>
+      </w:r>
+      <w:r>
+        <w:t xml:space="preserve">en la sección de mensajes.</w:t>
+      </w:r>
+      <w:r>
+        <w:t xml:space="preserve"> </w:t>
+      </w:r>
+      <w:r>
+        <w:t xml:space="preserve">- Conviene un contador de pendientes visible en el menú del panel.</w:t>
+      </w:r>
+    </w:p>
+    <w:p>
+      <w:pPr>
+        <w:pStyle w:val="BodyText"/>
+      </w:pPr>
+      <w:r>
+        <w:rPr>
+          <w:bCs/>
+          <w:b/>
+        </w:rPr>
+        <w:t xml:space="preserve">Pacientes</w:t>
+      </w:r>
+      <w:r>
+        <w:t xml:space="preserve"> </w:t>
+      </w:r>
+      <w:r>
+        <w:t xml:space="preserve">-</w:t>
+      </w:r>
+      <w:r>
+        <w:t xml:space="preserve"> </w:t>
+      </w:r>
+      <w:r>
+        <w:rPr>
+          <w:rStyle w:val="VerbatimChar"/>
+        </w:rPr>
+        <w:t xml:space="preserve">POST /pacientes</w:t>
+      </w:r>
+      <w:r>
+        <w:t xml:space="preserve"> </w:t>
+      </w:r>
+      <w:r>
+        <w:rPr>
+          <w:rStyle w:val="VerbatimChar"/>
+        </w:rPr>
+        <w:t xml:space="preserve">{ nombreCompleto, documento, correo, telefono, autorizacionDatos: true }</w:t>
+      </w:r>
+      <w:r>
+        <w:t xml:space="preserve"> </w:t>
+      </w:r>
+      <w:r>
+        <w:t xml:space="preserve">→ 201. La respuesta trae la</w:t>
+      </w:r>
+      <w:r>
+        <w:t xml:space="preserve"> </w:t>
+      </w:r>
+      <w:r>
+        <w:rPr>
+          <w:rStyle w:val="VerbatimChar"/>
+        </w:rPr>
+        <w:t xml:space="preserve">contrasenaTemporal</w:t>
+      </w:r>
+      <w:r>
+        <w:t xml:space="preserve">, que se muestra</w:t>
+      </w:r>
+      <w:r>
+        <w:t xml:space="preserve"> </w:t>
+      </w:r>
+      <w:r>
+        <w:rPr>
+          <w:bCs/>
+          <w:b/>
+        </w:rPr>
+        <w:t xml:space="preserve">una sola vez</w:t>
+      </w:r>
+      <w:r>
+        <w:t xml:space="preserve"> </w:t>
+      </w:r>
+      <w:r>
+        <w:t xml:space="preserve">con botón de copiar, y</w:t>
+      </w:r>
+      <w:r>
+        <w:t xml:space="preserve"> </w:t>
+      </w:r>
+      <w:r>
+        <w:rPr>
+          <w:rStyle w:val="VerbatimChar"/>
+        </w:rPr>
+        <w:t xml:space="preserve">citasVinculadas</w:t>
+      </w:r>
+      <w:r>
+        <w:t xml:space="preserve">, que son las citas que pidió antes sin cuenta.</w:t>
+      </w:r>
+      <w:r>
+        <w:t xml:space="preserve"> </w:t>
+      </w:r>
+      <w:r>
+        <w:t xml:space="preserve">-</w:t>
+      </w:r>
+      <w:r>
+        <w:t xml:space="preserve"> </w:t>
+      </w:r>
+      <w:r>
+        <w:rPr>
+          <w:rStyle w:val="VerbatimChar"/>
+        </w:rPr>
+        <w:t xml:space="preserve">GET /pacientes?q=</w:t>
+      </w:r>
+      <w:r>
+        <w:t xml:space="preserve"> </w:t>
+      </w:r>
+      <w:r>
+        <w:t xml:space="preserve">→ búsqueda por nombre, documento o correo.</w:t>
+      </w:r>
+      <w:r>
+        <w:t xml:space="preserve"> </w:t>
+      </w:r>
+      <w:r>
+        <w:t xml:space="preserve">-</w:t>
+      </w:r>
+      <w:r>
+        <w:t xml:space="preserve"> </w:t>
+      </w:r>
+      <w:r>
+        <w:rPr>
+          <w:rStyle w:val="VerbatimChar"/>
+        </w:rPr>
+        <w:t xml:space="preserve">POST /pacientes/:id/restablecer-contrasena</w:t>
+      </w:r>
+      <w:r>
+        <w:t xml:space="preserve"> </w:t>
+      </w:r>
+      <w:r>
+        <w:t xml:space="preserve">→</w:t>
+      </w:r>
+      <w:r>
+        <w:t xml:space="preserve"> </w:t>
+      </w:r>
+      <w:r>
+        <w:rPr>
+          <w:rStyle w:val="VerbatimChar"/>
+        </w:rPr>
+        <w:t xml:space="preserve">{ mensaje, contrasenaTemporal }</w:t>
+      </w:r>
+      <w:r>
+        <w:t xml:space="preserve">:</w:t>
+      </w:r>
+      <w:r>
+        <w:t xml:space="preserve"> </w:t>
+      </w:r>
+      <w:r>
+        <w:t xml:space="preserve">“</w:t>
+      </w:r>
+      <w:r>
+        <w:t xml:space="preserve">olvidé mi contraseña</w:t>
+      </w:r>
+      <w:r>
+        <w:t xml:space="preserve">”</w:t>
+      </w:r>
+      <w:r>
+        <w:t xml:space="preserve">. La clave temporal se muestra</w:t>
+      </w:r>
+      <w:r>
+        <w:t xml:space="preserve"> </w:t>
+      </w:r>
+      <w:r>
+        <w:rPr>
+          <w:bCs/>
+          <w:b/>
+        </w:rPr>
+        <w:t xml:space="preserve">una sola vez</w:t>
+      </w:r>
+      <w:r>
+        <w:t xml:space="preserve"> </w:t>
+      </w:r>
+      <w:r>
+        <w:t xml:space="preserve">(botón de copiar) y el paciente deberá cambiarla al ingresar. Va como botón en la ficha del paciente, con confirmación.</w:t>
+      </w:r>
+    </w:p>
+    <w:p>
+      <w:pPr>
+        <w:pStyle w:val="BodyText"/>
+      </w:pPr>
+      <w:r>
+        <w:rPr>
+          <w:bCs/>
+          <w:b/>
+        </w:rPr>
+        <w:t xml:space="preserve">Ficha del paciente e historia clínica</w:t>
+      </w:r>
+      <w:r>
+        <w:t xml:space="preserve"> </w:t>
+      </w:r>
+      <w:r>
+        <w:t xml:space="preserve">-</w:t>
+      </w:r>
+      <w:r>
+        <w:t xml:space="preserve"> </w:t>
+      </w:r>
+      <w:r>
+        <w:rPr>
+          <w:rStyle w:val="VerbatimChar"/>
+        </w:rPr>
+        <w:t xml:space="preserve">GET /pacientes/:id</w:t>
+      </w:r>
+      <w:r>
+        <w:t xml:space="preserve"> </w:t>
+      </w:r>
+      <w:r>
+        <w:t xml:space="preserve">→</w:t>
+      </w:r>
+      <w:r>
+        <w:t xml:space="preserve"> </w:t>
+      </w:r>
+      <w:r>
+        <w:rPr>
+          <w:rStyle w:val="VerbatimChar"/>
+        </w:rPr>
+        <w:t xml:space="preserve">{ paciente: { id, nombreCompleto, documento, correo, telefono, activo, ... }, citas: [...], historia: [...] }</w:t>
+      </w:r>
+      <w:r>
+        <w:t xml:space="preserve"> </w:t>
+      </w:r>
+      <w:r>
+        <w:t xml:space="preserve">— la pantalla de ficha en una sola petición.</w:t>
+      </w:r>
+      <w:r>
+        <w:t xml:space="preserve"> </w:t>
+      </w:r>
+      <w:r>
+        <w:t xml:space="preserve">-</w:t>
+      </w:r>
+      <w:r>
+        <w:t xml:space="preserve"> </w:t>
+      </w:r>
+      <w:r>
+        <w:rPr>
+          <w:rStyle w:val="VerbatimChar"/>
+        </w:rPr>
+        <w:t xml:space="preserve">GET /pacientes/:id/historia</w:t>
+      </w:r>
+      <w:r>
+        <w:t xml:space="preserve"> </w:t>
+      </w:r>
+      <w:r>
+        <w:t xml:space="preserve">→ entradas, la atención más reciente primero:</w:t>
+      </w:r>
+      <w:r>
+        <w:t xml:space="preserve"> </w:t>
+      </w:r>
+      <w:r>
+        <w:rPr>
+          <w:rStyle w:val="VerbatimChar"/>
+        </w:rPr>
+        <w:t xml:space="preserve">[{ id, fechaAtencion, especialidad, especialista, citaId, procedimiento, notas, corrigeA, correcciones: [ids], autor, creadoEn }]</w:t>
+      </w:r>
+      <w:r>
+        <w:t xml:space="preserve">.</w:t>
+      </w:r>
+      <w:r>
+        <w:t xml:space="preserve"> </w:t>
+      </w:r>
+      <w:r>
+        <w:t xml:space="preserve">-</w:t>
+      </w:r>
+      <w:r>
+        <w:t xml:space="preserve"> </w:t>
+      </w:r>
+      <w:r>
+        <w:rPr>
+          <w:rStyle w:val="VerbatimChar"/>
+        </w:rPr>
+        <w:t xml:space="preserve">POST /pacientes/:id/historia</w:t>
+      </w:r>
+      <w:r>
+        <w:t xml:space="preserve"> </w:t>
+      </w:r>
+      <w:r>
+        <w:rPr>
+          <w:rStyle w:val="VerbatimChar"/>
+        </w:rPr>
+        <w:t xml:space="preserve">{ fechaAtencion, procedimiento, notas?, especialidadId?, especialistaId?, citaId? }</w:t>
+      </w:r>
+      <w:r>
+        <w:t xml:space="preserve"> </w:t>
+      </w:r>
+      <w:r>
+        <w:t xml:space="preserve">→ 201. Con</w:t>
+      </w:r>
+      <w:r>
+        <w:t xml:space="preserve"> </w:t>
+      </w:r>
+      <w:r>
+        <w:rPr>
+          <w:rStyle w:val="VerbatimChar"/>
+        </w:rPr>
+        <w:t xml:space="preserve">citaId</w:t>
+      </w:r>
+      <w:r>
+        <w:t xml:space="preserve"> </w:t>
+      </w:r>
+      <w:r>
+        <w:t xml:space="preserve">(de ese paciente) se pueden omitir fecha, especialidad y especialista. Fecha futura → 400.</w:t>
+      </w:r>
+      <w:r>
+        <w:t xml:space="preserve"> </w:t>
+      </w:r>
+      <w:r>
+        <w:t xml:space="preserve">-</w:t>
+      </w:r>
+      <w:r>
+        <w:t xml:space="preserve"> </w:t>
+      </w:r>
+      <w:r>
+        <w:rPr>
+          <w:rStyle w:val="VerbatimChar"/>
+        </w:rPr>
+        <w:t xml:space="preserve">POST /admin/historia/:id/correccion</w:t>
+      </w:r>
+      <w:r>
+        <w:t xml:space="preserve"> </w:t>
+      </w:r>
+      <w:r>
+        <w:rPr>
+          <w:rStyle w:val="VerbatimChar"/>
+        </w:rPr>
+        <w:t xml:space="preserve">{ notas, procedimiento?, fechaAtencion? }</w:t>
+      </w:r>
+      <w:r>
+        <w:t xml:space="preserve"> </w:t>
+      </w:r>
+      <w:r>
+        <w:t xml:space="preserve">→ 201: crea una entrada nueva que corrige a la indicada;</w:t>
+      </w:r>
+      <w:r>
+        <w:t xml:space="preserve"> </w:t>
+      </w:r>
+      <w:r>
+        <w:rPr>
+          <w:rStyle w:val="VerbatimChar"/>
+        </w:rPr>
+        <w:t xml:space="preserve">notas</w:t>
+      </w:r>
+      <w:r>
+        <w:t xml:space="preserve"> </w:t>
+      </w:r>
+      <w:r>
+        <w:t xml:space="preserve">(qué se corrige y por qué) es obligatorio.</w:t>
+      </w:r>
+      <w:r>
+        <w:t xml:space="preserve"> </w:t>
+      </w:r>
+      <w:r>
+        <w:t xml:space="preserve">-</w:t>
+      </w:r>
+      <w:r>
+        <w:t xml:space="preserve"> </w:t>
+      </w:r>
+      <w:r>
+        <w:rPr>
+          <w:bCs/>
+          <w:b/>
+        </w:rPr>
+        <w:t xml:space="preserve">No hay editar ni borrar</w:t>
+      </w:r>
+      <w:r>
+        <w:t xml:space="preserve">: la historia clínica no se modifica (Resolución 1995 de 1999). En pantalla, una entrada con</w:t>
+      </w:r>
+      <w:r>
+        <w:t xml:space="preserve"> </w:t>
+      </w:r>
+      <w:r>
+        <w:rPr>
+          <w:rStyle w:val="VerbatimChar"/>
+        </w:rPr>
+        <w:t xml:space="preserve">correcciones</w:t>
+      </w:r>
+      <w:r>
+        <w:t xml:space="preserve"> </w:t>
+      </w:r>
+      <w:r>
+        <w:t xml:space="preserve">se muestra tachada o marcada</w:t>
+      </w:r>
+      <w:r>
+        <w:t xml:space="preserve"> </w:t>
+      </w:r>
+      <w:r>
+        <w:t xml:space="preserve">“</w:t>
+      </w:r>
+      <w:r>
+        <w:t xml:space="preserve">Corregida</w:t>
+      </w:r>
+      <w:r>
+        <w:t xml:space="preserve">”</w:t>
+      </w:r>
+      <w:r>
+        <w:t xml:space="preserve"> </w:t>
+      </w:r>
+      <w:r>
+        <w:t xml:space="preserve">con enlace a su corrección; la corrección muestra</w:t>
+      </w:r>
+      <w:r>
+        <w:t xml:space="preserve"> </w:t>
+      </w:r>
+      <w:r>
+        <w:t xml:space="preserve">“</w:t>
+      </w:r>
+      <w:r>
+        <w:t xml:space="preserve">Corrige la entrada del</w:t>
+      </w:r>
+      <w:r>
+        <w:t xml:space="preserve"> </w:t>
+      </w:r>
+      <w:r>
+        <w:t xml:space="preserve">”</w:t>
+      </w:r>
+      <w:r>
+        <w:t xml:space="preserve">. Sugerencia: botón</w:t>
+      </w:r>
+      <w:r>
+        <w:t xml:space="preserve"> </w:t>
+      </w:r>
+      <w:r>
+        <w:t xml:space="preserve">“</w:t>
+      </w:r>
+      <w:r>
+        <w:t xml:space="preserve">Agregar a la historia</w:t>
+      </w:r>
+      <w:r>
+        <w:t xml:space="preserve">”</w:t>
+      </w:r>
+      <w:r>
+        <w:t xml:space="preserve"> </w:t>
+      </w:r>
+      <w:r>
+        <w:t xml:space="preserve">junto a cada cita marcada como atendida, con</w:t>
+      </w:r>
+      <w:r>
+        <w:t xml:space="preserve"> </w:t>
+      </w:r>
+      <w:r>
+        <w:rPr>
+          <w:rStyle w:val="VerbatimChar"/>
+        </w:rPr>
+        <w:t xml:space="preserve">citaId</w:t>
+      </w:r>
+      <w:r>
+        <w:t xml:space="preserve"> </w:t>
+      </w:r>
+      <w:r>
+        <w:t xml:space="preserve">ya puesto.</w:t>
+      </w:r>
+    </w:p>
+    <w:bookmarkEnd w:id="24"/>
+    <w:bookmarkStart w:id="25" w:name="aún-no-existe"/>
+    <w:p>
+      <w:pPr>
+        <w:pStyle w:val="Heading2"/>
+      </w:pPr>
+      <w:r>
+        <w:t xml:space="preserve">Aún no existe</w:t>
+      </w:r>
+    </w:p>
+    <w:p>
+      <w:pPr>
+        <w:numPr>
+          <w:ilvl w:val="0"/>
+          <w:numId w:val="1008"/>
+        </w:numPr>
+        <w:pStyle w:val="Compact"/>
+      </w:pPr>
+      <w:r>
+        <w:t xml:space="preserve">Importación desde Excel.</w:t>
       </w:r>
     </w:p>
     <w:bookmarkEnd w:id="25"/>
@@ -4132,6 +4428,9 @@
     <w:abstractNumId w:val="991"/>
   </w:num>
   <w:num w:numId="1007">
+    <w:abstractNumId w:val="991"/>
+  </w:num>
+  <w:num w:numId="1008">
     <w:abstractNumId w:val="991"/>
   </w:num>
 </w:numbering>

</xml_diff>

<commit_message>
docs: datos del paciente, cambio de hora y modo oscuro (decisión 25)
Contrato de la API, modelo de datos y diagrama entidad-relación, manuales,
guía de pruebas de pacientes rehecha para el flujo sin login, resultados de
las pruebas del 9 de octubre y Word regenerados.
</commit_message>
<xml_diff>
--- a/docs/para-drive/Contrato de la API.docx
+++ b/docs/para-drive/Contrato de la API.docx
@@ -1140,7 +1140,7 @@
         <w:rPr>
           <w:rStyle w:val="DataTypeTok"/>
         </w:rPr>
-        <w:t xml:space="preserve">"nombreCompleto"</w:t>
+        <w:t xml:space="preserve">"nombres"</w:t>
       </w:r>
       <w:r>
         <w:rPr>
@@ -1158,7 +1158,7 @@
         <w:rPr>
           <w:rStyle w:val="StringTok"/>
         </w:rPr>
-        <w:t xml:space="preserve">"Ana Pérez"</w:t>
+        <w:t xml:space="preserve">"Ana María"</w:t>
       </w:r>
       <w:r>
         <w:rPr>
@@ -1167,6 +1167,42 @@
         <w:t xml:space="preserve">,</w:t>
       </w:r>
       <w:r>
+        <w:rPr>
+          <w:rStyle w:val="NormalTok"/>
+        </w:rPr>
+        <w:t xml:space="preserve"> </w:t>
+      </w:r>
+      <w:r>
+        <w:rPr>
+          <w:rStyle w:val="DataTypeTok"/>
+        </w:rPr>
+        <w:t xml:space="preserve">"apellidos"</w:t>
+      </w:r>
+      <w:r>
+        <w:rPr>
+          <w:rStyle w:val="FunctionTok"/>
+        </w:rPr>
+        <w:t xml:space="preserve">:</w:t>
+      </w:r>
+      <w:r>
+        <w:rPr>
+          <w:rStyle w:val="NormalTok"/>
+        </w:rPr>
+        <w:t xml:space="preserve"> </w:t>
+      </w:r>
+      <w:r>
+        <w:rPr>
+          <w:rStyle w:val="StringTok"/>
+        </w:rPr>
+        <w:t xml:space="preserve">"Pérez Gómez"</w:t>
+      </w:r>
+      <w:r>
+        <w:rPr>
+          <w:rStyle w:val="FunctionTok"/>
+        </w:rPr>
+        <w:t xml:space="preserve">,</w:t>
+      </w:r>
+      <w:r>
         <w:br/>
       </w:r>
       <w:r>
@@ -1179,6 +1215,42 @@
         <w:rPr>
           <w:rStyle w:val="DataTypeTok"/>
         </w:rPr>
+        <w:t xml:space="preserve">"tipoDocumento"</w:t>
+      </w:r>
+      <w:r>
+        <w:rPr>
+          <w:rStyle w:val="FunctionTok"/>
+        </w:rPr>
+        <w:t xml:space="preserve">:</w:t>
+      </w:r>
+      <w:r>
+        <w:rPr>
+          <w:rStyle w:val="NormalTok"/>
+        </w:rPr>
+        <w:t xml:space="preserve"> </w:t>
+      </w:r>
+      <w:r>
+        <w:rPr>
+          <w:rStyle w:val="StringTok"/>
+        </w:rPr>
+        <w:t xml:space="preserve">"CC"</w:t>
+      </w:r>
+      <w:r>
+        <w:rPr>
+          <w:rStyle w:val="FunctionTok"/>
+        </w:rPr>
+        <w:t xml:space="preserve">,</w:t>
+      </w:r>
+      <w:r>
+        <w:rPr>
+          <w:rStyle w:val="NormalTok"/>
+        </w:rPr>
+        <w:t xml:space="preserve"> </w:t>
+      </w:r>
+      <w:r>
+        <w:rPr>
+          <w:rStyle w:val="DataTypeTok"/>
+        </w:rPr>
         <w:t xml:space="preserve">"documento"</w:t>
       </w:r>
       <w:r>
@@ -1249,6 +1321,42 @@
           <w:rStyle w:val="NormalTok"/>
         </w:rPr>
         <w:t xml:space="preserve">  </w:t>
+      </w:r>
+      <w:r>
+        <w:rPr>
+          <w:rStyle w:val="DataTypeTok"/>
+        </w:rPr>
+        <w:t xml:space="preserve">"telefonoFijo"</w:t>
+      </w:r>
+      <w:r>
+        <w:rPr>
+          <w:rStyle w:val="FunctionTok"/>
+        </w:rPr>
+        <w:t xml:space="preserve">:</w:t>
+      </w:r>
+      <w:r>
+        <w:rPr>
+          <w:rStyle w:val="NormalTok"/>
+        </w:rPr>
+        <w:t xml:space="preserve"> </w:t>
+      </w:r>
+      <w:r>
+        <w:rPr>
+          <w:rStyle w:val="StringTok"/>
+        </w:rPr>
+        <w:t xml:space="preserve">""</w:t>
+      </w:r>
+      <w:r>
+        <w:rPr>
+          <w:rStyle w:val="FunctionTok"/>
+        </w:rPr>
+        <w:t xml:space="preserve">,</w:t>
+      </w:r>
+      <w:r>
+        <w:rPr>
+          <w:rStyle w:val="NormalTok"/>
+        </w:rPr>
+        <w:t xml:space="preserve"> </w:t>
       </w:r>
       <w:r>
         <w:rPr>
@@ -1414,7 +1522,7 @@
         <w:pStyle w:val="Compact"/>
       </w:pPr>
       <w:r>
-        <w:t xml:space="preserve">Nombre, documento, teléfono y</w:t>
+        <w:t xml:space="preserve">Nombres, apellidos, tipo y número de documento, celular y</w:t>
       </w:r>
       <w:r>
         <w:t xml:space="preserve"> </w:t>
@@ -1430,7 +1538,22 @@
         <w:t xml:space="preserve"> </w:t>
       </w:r>
       <w:r>
-        <w:t xml:space="preserve">son obligatorios. Si falta o viene mal escrito → 400 con el mensaje en</w:t>
+        <w:t xml:space="preserve">son obligatorios;</w:t>
+      </w:r>
+      <w:r>
+        <w:t xml:space="preserve"> </w:t>
+      </w:r>
+      <w:r>
+        <w:rPr>
+          <w:rStyle w:val="VerbatimChar"/>
+        </w:rPr>
+        <w:t xml:space="preserve">telefonoFijo</w:t>
+      </w:r>
+      <w:r>
+        <w:t xml:space="preserve"> </w:t>
+      </w:r>
+      <w:r>
+        <w:t xml:space="preserve">es opcional. Si falta o viene mal escrito → 400 con el mensaje en</w:t>
       </w:r>
       <w:r>
         <w:t xml:space="preserve"> </w:t>
@@ -1457,50 +1580,100 @@
         <w:rPr>
           <w:rStyle w:val="VerbatimChar"/>
         </w:rPr>
-        <w:t xml:space="preserve">autorizacionDatos</w:t>
-      </w:r>
-      <w:r>
-        <w:t xml:space="preserve">: casilla</w:t>
-      </w:r>
-      <w:r>
-        <w:t xml:space="preserve"> </w:t>
-      </w:r>
-      <w:r>
-        <w:rPr>
-          <w:bCs/>
-          <w:b/>
-        </w:rPr>
-        <w:t xml:space="preserve">sin marcar por defecto</w:t>
-      </w:r>
-      <w:r>
-        <w:t xml:space="preserve"> </w:t>
-      </w:r>
-      <w:r>
-        <w:t xml:space="preserve">con enlace a</w:t>
-      </w:r>
-      <w:r>
-        <w:t xml:space="preserve"> </w:t>
-      </w:r>
-      <w:r>
-        <w:rPr>
-          <w:rStyle w:val="VerbatimChar"/>
-        </w:rPr>
-        <w:t xml:space="preserve">politica-datos.html</w:t>
-      </w:r>
-      <w:r>
-        <w:t xml:space="preserve">. Sin ella → 400 con</w:t>
-      </w:r>
-      <w:r>
-        <w:t xml:space="preserve"> </w:t>
-      </w:r>
-      <w:r>
-        <w:rPr>
-          <w:rStyle w:val="VerbatimChar"/>
-        </w:rPr>
-        <w:t xml:space="preserve">campos.autorizacionDatos</w:t>
-      </w:r>
-      <w:r>
-        <w:t xml:space="preserve">.</w:t>
+        <w:t xml:space="preserve">tipoDocumento</w:t>
+      </w:r>
+      <w:r>
+        <w:t xml:space="preserve">:</w:t>
+      </w:r>
+      <w:r>
+        <w:t xml:space="preserve"> </w:t>
+      </w:r>
+      <w:r>
+        <w:rPr>
+          <w:rStyle w:val="VerbatimChar"/>
+        </w:rPr>
+        <w:t xml:space="preserve">CC</w:t>
+      </w:r>
+      <w:r>
+        <w:t xml:space="preserve"> </w:t>
+      </w:r>
+      <w:r>
+        <w:t xml:space="preserve">(cédula de ciudadanía),</w:t>
+      </w:r>
+      <w:r>
+        <w:t xml:space="preserve"> </w:t>
+      </w:r>
+      <w:r>
+        <w:rPr>
+          <w:rStyle w:val="VerbatimChar"/>
+        </w:rPr>
+        <w:t xml:space="preserve">TI</w:t>
+      </w:r>
+      <w:r>
+        <w:t xml:space="preserve"> </w:t>
+      </w:r>
+      <w:r>
+        <w:t xml:space="preserve">(tarjeta de identidad),</w:t>
+      </w:r>
+      <w:r>
+        <w:t xml:space="preserve"> </w:t>
+      </w:r>
+      <w:r>
+        <w:rPr>
+          <w:rStyle w:val="VerbatimChar"/>
+        </w:rPr>
+        <w:t xml:space="preserve">RC</w:t>
+      </w:r>
+      <w:r>
+        <w:t xml:space="preserve"> </w:t>
+      </w:r>
+      <w:r>
+        <w:t xml:space="preserve">(registro civil),</w:t>
+      </w:r>
+      <w:r>
+        <w:t xml:space="preserve"> </w:t>
+      </w:r>
+      <w:r>
+        <w:rPr>
+          <w:rStyle w:val="VerbatimChar"/>
+        </w:rPr>
+        <w:t xml:space="preserve">CE</w:t>
+      </w:r>
+      <w:r>
+        <w:t xml:space="preserve"> </w:t>
+      </w:r>
+      <w:r>
+        <w:t xml:space="preserve">(cédula de extranjería),</w:t>
+      </w:r>
+      <w:r>
+        <w:t xml:space="preserve"> </w:t>
+      </w:r>
+      <w:r>
+        <w:rPr>
+          <w:rStyle w:val="VerbatimChar"/>
+        </w:rPr>
+        <w:t xml:space="preserve">PA</w:t>
+      </w:r>
+      <w:r>
+        <w:t xml:space="preserve"> </w:t>
+      </w:r>
+      <w:r>
+        <w:t xml:space="preserve">(pasaporte) o</w:t>
+      </w:r>
+      <w:r>
+        <w:t xml:space="preserve"> </w:t>
+      </w:r>
+      <w:r>
+        <w:rPr>
+          <w:rStyle w:val="VerbatimChar"/>
+        </w:rPr>
+        <w:t xml:space="preserve">PPT</w:t>
+      </w:r>
+      <w:r>
+        <w:t xml:space="preserve"> </w:t>
+      </w:r>
+      <w:r>
+        <w:t xml:space="preserve">(permiso por protección temporal). El pasaporte acepta letras y números; los demás, solo números (5 a 20). Puntos, espacios y guiones se quitan.</w:t>
       </w:r>
     </w:p>
     <w:p>
@@ -1515,44 +1688,7 @@
         <w:rPr>
           <w:rStyle w:val="VerbatimChar"/>
         </w:rPr>
-        <w:t xml:space="preserve">sitioWeb</w:t>
-      </w:r>
-      <w:r>
-        <w:t xml:space="preserve">:</w:t>
-      </w:r>
-      <w:r>
-        <w:t xml:space="preserve"> </w:t>
-      </w:r>
-      <w:r>
-        <w:rPr>
-          <w:bCs/>
-          <w:b/>
-        </w:rPr>
-        <w:t xml:space="preserve">campo trampa contra bots</w:t>
-      </w:r>
-      <w:r>
-        <w:t xml:space="preserve">. Inclúyelo en el formulario oculto con CSS (no con</w:t>
-      </w:r>
-      <w:r>
-        <w:t xml:space="preserve"> </w:t>
-      </w:r>
-      <w:r>
-        <w:rPr>
-          <w:rStyle w:val="VerbatimChar"/>
-        </w:rPr>
-        <w:t xml:space="preserve">type="hidden"</w:t>
-      </w:r>
-      <w:r>
-        <w:t xml:space="preserve">), con</w:t>
-      </w:r>
-      <w:r>
-        <w:t xml:space="preserve"> </w:t>
-      </w:r>
-      <w:r>
-        <w:rPr>
-          <w:rStyle w:val="VerbatimChar"/>
-        </w:rPr>
-        <w:t xml:space="preserve">tabindex="-1"</w:t>
+        <w:t xml:space="preserve">nombres</w:t>
       </w:r>
       <w:r>
         <w:t xml:space="preserve"> </w:t>
@@ -1567,10 +1703,25 @@
         <w:rPr>
           <w:rStyle w:val="VerbatimChar"/>
         </w:rPr>
-        <w:t xml:space="preserve">autocomplete="off"</w:t>
-      </w:r>
-      <w:r>
-        <w:t xml:space="preserve">, y envíalo vacío.</w:t>
+        <w:t xml:space="preserve">apellidos</w:t>
+      </w:r>
+      <w:r>
+        <w:t xml:space="preserve">: 2 a 60 caracteres cada uno, sin números. En las respuestas,</w:t>
+      </w:r>
+      <w:r>
+        <w:t xml:space="preserve"> </w:t>
+      </w:r>
+      <w:r>
+        <w:rPr>
+          <w:rStyle w:val="VerbatimChar"/>
+        </w:rPr>
+        <w:t xml:space="preserve">paciente</w:t>
+      </w:r>
+      <w:r>
+        <w:t xml:space="preserve"> </w:t>
+      </w:r>
+      <w:r>
+        <w:t xml:space="preserve">sigue siendo el nombre completo.</w:t>
       </w:r>
     </w:p>
     <w:p>
@@ -1583,6 +1734,134 @@
       </w:pPr>
       <w:r>
         <w:rPr>
+          <w:rStyle w:val="VerbatimChar"/>
+        </w:rPr>
+        <w:t xml:space="preserve">autorizacionDatos</w:t>
+      </w:r>
+      <w:r>
+        <w:t xml:space="preserve">: casilla</w:t>
+      </w:r>
+      <w:r>
+        <w:t xml:space="preserve"> </w:t>
+      </w:r>
+      <w:r>
+        <w:rPr>
+          <w:bCs/>
+          <w:b/>
+        </w:rPr>
+        <w:t xml:space="preserve">sin marcar por defecto</w:t>
+      </w:r>
+      <w:r>
+        <w:t xml:space="preserve"> </w:t>
+      </w:r>
+      <w:r>
+        <w:t xml:space="preserve">con enlace a</w:t>
+      </w:r>
+      <w:r>
+        <w:t xml:space="preserve"> </w:t>
+      </w:r>
+      <w:r>
+        <w:rPr>
+          <w:rStyle w:val="VerbatimChar"/>
+        </w:rPr>
+        <w:t xml:space="preserve">politica-datos.html</w:t>
+      </w:r>
+      <w:r>
+        <w:t xml:space="preserve">. Sin ella → 400 con</w:t>
+      </w:r>
+      <w:r>
+        <w:t xml:space="preserve"> </w:t>
+      </w:r>
+      <w:r>
+        <w:rPr>
+          <w:rStyle w:val="VerbatimChar"/>
+        </w:rPr>
+        <w:t xml:space="preserve">campos.autorizacionDatos</w:t>
+      </w:r>
+      <w:r>
+        <w:t xml:space="preserve">.</w:t>
+      </w:r>
+    </w:p>
+    <w:p>
+      <w:pPr>
+        <w:numPr>
+          <w:ilvl w:val="0"/>
+          <w:numId w:val="1004"/>
+        </w:numPr>
+        <w:pStyle w:val="Compact"/>
+      </w:pPr>
+      <w:r>
+        <w:rPr>
+          <w:rStyle w:val="VerbatimChar"/>
+        </w:rPr>
+        <w:t xml:space="preserve">sitioWeb</w:t>
+      </w:r>
+      <w:r>
+        <w:t xml:space="preserve">:</w:t>
+      </w:r>
+      <w:r>
+        <w:t xml:space="preserve"> </w:t>
+      </w:r>
+      <w:r>
+        <w:rPr>
+          <w:bCs/>
+          <w:b/>
+        </w:rPr>
+        <w:t xml:space="preserve">campo trampa contra bots</w:t>
+      </w:r>
+      <w:r>
+        <w:t xml:space="preserve">. Inclúyelo en el formulario oculto con CSS (no con</w:t>
+      </w:r>
+      <w:r>
+        <w:t xml:space="preserve"> </w:t>
+      </w:r>
+      <w:r>
+        <w:rPr>
+          <w:rStyle w:val="VerbatimChar"/>
+        </w:rPr>
+        <w:t xml:space="preserve">type="hidden"</w:t>
+      </w:r>
+      <w:r>
+        <w:t xml:space="preserve">), con</w:t>
+      </w:r>
+      <w:r>
+        <w:t xml:space="preserve"> </w:t>
+      </w:r>
+      <w:r>
+        <w:rPr>
+          <w:rStyle w:val="VerbatimChar"/>
+        </w:rPr>
+        <w:t xml:space="preserve">tabindex="-1"</w:t>
+      </w:r>
+      <w:r>
+        <w:t xml:space="preserve"> </w:t>
+      </w:r>
+      <w:r>
+        <w:t xml:space="preserve">y</w:t>
+      </w:r>
+      <w:r>
+        <w:t xml:space="preserve"> </w:t>
+      </w:r>
+      <w:r>
+        <w:rPr>
+          <w:rStyle w:val="VerbatimChar"/>
+        </w:rPr>
+        <w:t xml:space="preserve">autocomplete="off"</w:t>
+      </w:r>
+      <w:r>
+        <w:t xml:space="preserve">, y envíalo vacío.</w:t>
+      </w:r>
+    </w:p>
+    <w:p>
+      <w:pPr>
+        <w:numPr>
+          <w:ilvl w:val="0"/>
+          <w:numId w:val="1004"/>
+        </w:numPr>
+        <w:pStyle w:val="Compact"/>
+      </w:pPr>
+      <w:r>
+        <w:rPr>
           <w:bCs/>
           <w:b/>
         </w:rPr>
@@ -1711,7 +1990,33 @@
         <w:t xml:space="preserve">LIMITE_CITAS_ACTIVAS_POR_DOCUMENTO</w:t>
       </w:r>
       <w:r>
-        <w:t xml:space="preserve">, por defecto 1).</w:t>
+        <w:t xml:space="preserve">, por defecto 1). El mensaje distingue los dos casos: si la que tiene está</w:t>
+      </w:r>
+      <w:r>
+        <w:t xml:space="preserve"> </w:t>
+      </w:r>
+      <w:r>
+        <w:rPr>
+          <w:bCs/>
+          <w:b/>
+        </w:rPr>
+        <w:t xml:space="preserve">pendiente</w:t>
+      </w:r>
+      <w:r>
+        <w:t xml:space="preserve">, explica que se le avisará por WhatsApp cuando la confirmen (todavía no tiene enlace); si está</w:t>
+      </w:r>
+      <w:r>
+        <w:t xml:space="preserve"> </w:t>
+      </w:r>
+      <w:r>
+        <w:rPr>
+          <w:bCs/>
+          <w:b/>
+        </w:rPr>
+        <w:t xml:space="preserve">confirmada</w:t>
+      </w:r>
+      <w:r>
+        <w:t xml:space="preserve">, que la cancele desde el enlace del WhatsApp.</w:t>
       </w:r>
     </w:p>
     <w:bookmarkEnd w:id="22"/>
@@ -3168,6 +3473,18 @@
         <w:rPr>
           <w:rStyle w:val="VerbatimChar"/>
         </w:rPr>
+        <w:t xml:space="preserve">tipoDocumento</w:t>
+      </w:r>
+      <w:r>
+        <w:t xml:space="preserve">,</w:t>
+      </w:r>
+      <w:r>
+        <w:t xml:space="preserve"> </w:t>
+      </w:r>
+      <w:r>
+        <w:rPr>
+          <w:rStyle w:val="VerbatimChar"/>
+        </w:rPr>
         <w:t xml:space="preserve">documento</w:t>
       </w:r>
       <w:r>
@@ -3192,6 +3509,18 @@
         <w:rPr>
           <w:rStyle w:val="VerbatimChar"/>
         </w:rPr>
+        <w:t xml:space="preserve">telefonoFijo</w:t>
+      </w:r>
+      <w:r>
+        <w:t xml:space="preserve">,</w:t>
+      </w:r>
+      <w:r>
+        <w:t xml:space="preserve"> </w:t>
+      </w:r>
+      <w:r>
+        <w:rPr>
+          <w:rStyle w:val="VerbatimChar"/>
+        </w:rPr>
         <w:t xml:space="preserve">correo</w:t>
       </w:r>
       <w:r>
@@ -3231,13 +3560,34 @@
         <w:t xml:space="preserve">creadoEn</w:t>
       </w:r>
       <w:r>
-        <w:t xml:space="preserve">.</w:t>
-      </w:r>
-      <w:r>
-        <w:t xml:space="preserve"> </w:t>
-      </w:r>
-      <w:r>
-        <w:t xml:space="preserve">-</w:t>
+        <w:t xml:space="preserve">,</w:t>
+      </w:r>
+      <w:r>
+        <w:t xml:space="preserve"> </w:t>
+      </w:r>
+      <w:r>
+        <w:rPr>
+          <w:rStyle w:val="VerbatimChar"/>
+        </w:rPr>
+        <w:t xml:space="preserve">fechaAnterior</w:t>
+      </w:r>
+      <w:r>
+        <w:t xml:space="preserve"> </w:t>
+      </w:r>
+      <w:r>
+        <w:t xml:space="preserve">y</w:t>
+      </w:r>
+      <w:r>
+        <w:t xml:space="preserve"> </w:t>
+      </w:r>
+      <w:r>
+        <w:rPr>
+          <w:rStyle w:val="VerbatimChar"/>
+        </w:rPr>
+        <w:t xml:space="preserve">horaAnterior</w:t>
+      </w:r>
+      <w:r>
+        <w:t xml:space="preserve">. Las dos últimas traen la hora que tenía la cita antes de que</w:t>
       </w:r>
       <w:r>
         <w:t xml:space="preserve"> </w:t>
@@ -3247,28 +3597,43 @@
           <w:bCs/>
           <w:b/>
         </w:rPr>
-        <w:t xml:space="preserve">Cambiar estado:</w:t>
-      </w:r>
-      <w:r>
-        <w:t xml:space="preserve"> </w:t>
-      </w:r>
-      <w:r>
-        <w:rPr>
-          <w:rStyle w:val="VerbatimChar"/>
-        </w:rPr>
-        <w:t xml:space="preserve">PATCH /admin/citas/:id/estado</w:t>
-      </w:r>
-      <w:r>
-        <w:t xml:space="preserve"> </w:t>
-      </w:r>
-      <w:r>
-        <w:rPr>
-          <w:rStyle w:val="VerbatimChar"/>
-        </w:rPr>
-        <w:t xml:space="preserve">{ estado: "atendida" | "no_asistio" | "cancelada" }</w:t>
-      </w:r>
-      <w:r>
-        <w:t xml:space="preserve">. Solo para citas confirmadas (una pendiente se acepta o se rechaza). Atendida o no asistió solo se permite cuando ya llegó la hora.</w:t>
+        <w:t xml:space="preserve">el paciente</w:t>
+      </w:r>
+      <w:r>
+        <w:t xml:space="preserve"> </w:t>
+      </w:r>
+      <w:r>
+        <w:t xml:space="preserve">la reprogramara (o</w:t>
+      </w:r>
+      <w:r>
+        <w:t xml:space="preserve"> </w:t>
+      </w:r>
+      <w:r>
+        <w:rPr>
+          <w:rStyle w:val="VerbatimChar"/>
+        </w:rPr>
+        <w:t xml:space="preserve">null</w:t>
+      </w:r>
+      <w:r>
+        <w:t xml:space="preserve">): el panel muestra</w:t>
+      </w:r>
+      <w:r>
+        <w:t xml:space="preserve"> </w:t>
+      </w:r>
+      <w:r>
+        <w:t xml:space="preserve">“</w:t>
+      </w:r>
+      <w:r>
+        <w:t xml:space="preserve">Cambio de hora · antes: …</w:t>
+      </w:r>
+      <w:r>
+        <w:t xml:space="preserve">”</w:t>
+      </w:r>
+      <w:r>
+        <w:t xml:space="preserve"> </w:t>
+      </w:r>
+      <w:r>
+        <w:t xml:space="preserve">en las solicitudes pendientes, para que la secretaria sepa qué cambio está aprobando.</w:t>
       </w:r>
       <w:r>
         <w:t xml:space="preserve"> </w:t>
@@ -3284,70 +3649,28 @@
           <w:bCs/>
           <w:b/>
         </w:rPr>
-        <w:t xml:space="preserve">Reprogramar:</w:t>
-      </w:r>
-      <w:r>
-        <w:t xml:space="preserve"> </w:t>
-      </w:r>
-      <w:r>
-        <w:rPr>
-          <w:rStyle w:val="VerbatimChar"/>
-        </w:rPr>
-        <w:t xml:space="preserve">POST /admin/citas/:id/reprogramar</w:t>
-      </w:r>
-      <w:r>
-        <w:t xml:space="preserve"> </w:t>
-      </w:r>
-      <w:r>
-        <w:rPr>
-          <w:rStyle w:val="VerbatimChar"/>
-        </w:rPr>
-        <w:t xml:space="preserve">{ franjaId }</w:t>
-      </w:r>
-      <w:r>
-        <w:t xml:space="preserve">. Para citas pendientes o confirmadas; no tiene límite y puede pasar la cita a otro especialista de la misma especialidad. Respuesta:</w:t>
-      </w:r>
-      <w:r>
-        <w:t xml:space="preserve"> </w:t>
-      </w:r>
-      <w:r>
-        <w:rPr>
-          <w:rStyle w:val="VerbatimChar"/>
-        </w:rPr>
-        <w:t xml:space="preserve">{ mensaje, cita, notificacion }</w:t>
-      </w:r>
-      <w:r>
-        <w:t xml:space="preserve">;</w:t>
-      </w:r>
-      <w:r>
-        <w:t xml:space="preserve"> </w:t>
-      </w:r>
-      <w:r>
-        <w:rPr>
-          <w:rStyle w:val="VerbatimChar"/>
-        </w:rPr>
-        <w:t xml:space="preserve">notificacion</w:t>
-      </w:r>
-      <w:r>
-        <w:t xml:space="preserve"> </w:t>
-      </w:r>
-      <w:r>
-        <w:t xml:space="preserve">es</w:t>
-      </w:r>
-      <w:r>
-        <w:t xml:space="preserve"> </w:t>
-      </w:r>
-      <w:r>
-        <w:rPr>
-          <w:rStyle w:val="VerbatimChar"/>
-        </w:rPr>
-        <w:t xml:space="preserve">null</w:t>
-      </w:r>
-      <w:r>
-        <w:t xml:space="preserve"> </w:t>
-      </w:r>
-      <w:r>
-        <w:t xml:space="preserve">si la cita estaba pendiente (el paciente se entera al aceptarla).</w:t>
+        <w:t xml:space="preserve">Cambiar estado:</w:t>
+      </w:r>
+      <w:r>
+        <w:t xml:space="preserve"> </w:t>
+      </w:r>
+      <w:r>
+        <w:rPr>
+          <w:rStyle w:val="VerbatimChar"/>
+        </w:rPr>
+        <w:t xml:space="preserve">PATCH /admin/citas/:id/estado</w:t>
+      </w:r>
+      <w:r>
+        <w:t xml:space="preserve"> </w:t>
+      </w:r>
+      <w:r>
+        <w:rPr>
+          <w:rStyle w:val="VerbatimChar"/>
+        </w:rPr>
+        <w:t xml:space="preserve">{ estado: "atendida" | "no_asistio" | "cancelada" }</w:t>
+      </w:r>
+      <w:r>
+        <w:t xml:space="preserve">. Solo para citas confirmadas (una pendiente se acepta o se rechaza). Atendida o no asistió solo se permite cuando ya llegó la hora.</w:t>
       </w:r>
       <w:r>
         <w:t xml:space="preserve"> </w:t>
@@ -3363,49 +3686,40 @@
           <w:bCs/>
           <w:b/>
         </w:rPr>
-        <w:t xml:space="preserve">Cancelar</w:t>
-      </w:r>
-      <w:r>
-        <w:t xml:space="preserve"> </w:t>
-      </w:r>
-      <w:r>
-        <w:t xml:space="preserve">(</w:t>
-      </w:r>
-      <w:r>
-        <w:rPr>
-          <w:rStyle w:val="VerbatimChar"/>
-        </w:rPr>
-        <w:t xml:space="preserve">PATCH …/estado</w:t>
-      </w:r>
-      <w:r>
-        <w:t xml:space="preserve"> </w:t>
-      </w:r>
-      <w:r>
-        <w:t xml:space="preserve">con</w:t>
-      </w:r>
-      <w:r>
-        <w:t xml:space="preserve"> </w:t>
-      </w:r>
-      <w:r>
-        <w:rPr>
-          <w:rStyle w:val="VerbatimChar"/>
-        </w:rPr>
-        <w:t xml:space="preserve">cancelada</w:t>
-      </w:r>
-      <w:r>
-        <w:t xml:space="preserve">) responde</w:t>
-      </w:r>
-      <w:r>
-        <w:t xml:space="preserve"> </w:t>
-      </w:r>
-      <w:r>
-        <w:rPr>
-          <w:rStyle w:val="VerbatimChar"/>
-        </w:rPr>
-        <w:t xml:space="preserve">{ mensaje, notificacion }</w:t>
-      </w:r>
-      <w:r>
-        <w:t xml:space="preserve">.</w:t>
+        <w:t xml:space="preserve">Reprogramar:</w:t>
+      </w:r>
+      <w:r>
+        <w:t xml:space="preserve"> </w:t>
+      </w:r>
+      <w:r>
+        <w:rPr>
+          <w:rStyle w:val="VerbatimChar"/>
+        </w:rPr>
+        <w:t xml:space="preserve">POST /admin/citas/:id/reprogramar</w:t>
+      </w:r>
+      <w:r>
+        <w:t xml:space="preserve"> </w:t>
+      </w:r>
+      <w:r>
+        <w:rPr>
+          <w:rStyle w:val="VerbatimChar"/>
+        </w:rPr>
+        <w:t xml:space="preserve">{ franjaId }</w:t>
+      </w:r>
+      <w:r>
+        <w:t xml:space="preserve">. Para citas pendientes o confirmadas; no tiene límite y puede pasar la cita a otro especialista de la misma especialidad. Respuesta:</w:t>
+      </w:r>
+      <w:r>
+        <w:t xml:space="preserve"> </w:t>
+      </w:r>
+      <w:r>
+        <w:rPr>
+          <w:rStyle w:val="VerbatimChar"/>
+        </w:rPr>
+        <w:t xml:space="preserve">{ mensaje, cita, notificacion }</w:t>
+      </w:r>
+      <w:r>
+        <w:t xml:space="preserve">;</w:t>
       </w:r>
       <w:r>
         <w:t xml:space="preserve"> </w:t>
@@ -3429,317 +3743,326 @@
         <w:rPr>
           <w:rStyle w:val="VerbatimChar"/>
         </w:rPr>
-        <w:t xml:space="preserve">{ id, estado, enlaceWhatsApp }</w:t>
-      </w:r>
-      <w:r>
-        <w:t xml:space="preserve">: si</w:t>
-      </w:r>
-      <w:r>
-        <w:t xml:space="preserve"> </w:t>
-      </w:r>
-      <w:r>
-        <w:rPr>
-          <w:rStyle w:val="VerbatimChar"/>
-        </w:rPr>
-        <w:t xml:space="preserve">estado</w:t>
-      </w:r>
-      <w:r>
-        <w:t xml:space="preserve"> </w:t>
-      </w:r>
-      <w:r>
-        <w:t xml:space="preserve">es</w:t>
-      </w:r>
-      <w:r>
-        <w:t xml:space="preserve"> </w:t>
-      </w:r>
-      <w:r>
-        <w:rPr>
-          <w:rStyle w:val="VerbatimChar"/>
-        </w:rPr>
-        <w:t xml:space="preserve">pendiente</w:t>
-      </w:r>
-      <w:r>
-        <w:t xml:space="preserve">, el panel ofrece</w:t>
-      </w:r>
-      <w:r>
-        <w:t xml:space="preserve"> </w:t>
-      </w:r>
-      <w:r>
-        <w:t xml:space="preserve">“</w:t>
-      </w:r>
-      <w:r>
-        <w:t xml:space="preserve">Enviar por WhatsApp</w:t>
-      </w:r>
-      <w:r>
-        <w:t xml:space="preserve">”</w:t>
-      </w:r>
-      <w:r>
-        <w:t xml:space="preserve"> </w:t>
-      </w:r>
-      <w:r>
-        <w:t xml:space="preserve">y</w:t>
-      </w:r>
-      <w:r>
-        <w:t xml:space="preserve"> </w:t>
-      </w:r>
-      <w:r>
-        <w:t xml:space="preserve">“</w:t>
-      </w:r>
-      <w:r>
-        <w:t xml:space="preserve">Marcar como enviado</w:t>
-      </w:r>
-      <w:r>
-        <w:t xml:space="preserve">”</w:t>
-      </w:r>
-      <w:r>
-        <w:t xml:space="preserve"> </w:t>
-      </w:r>
-      <w:r>
-        <w:t xml:space="preserve">ahí mismo.</w:t>
-      </w:r>
-    </w:p>
-    <w:p>
-      <w:pPr>
-        <w:pStyle w:val="BodyText"/>
-      </w:pPr>
+        <w:t xml:space="preserve">null</w:t>
+      </w:r>
+      <w:r>
+        <w:t xml:space="preserve"> </w:t>
+      </w:r>
+      <w:r>
+        <w:t xml:space="preserve">si la cita estaba pendiente (el paciente se entera al aceptarla).</w:t>
+      </w:r>
+      <w:r>
+        <w:t xml:space="preserve"> </w:t>
+      </w:r>
+      <w:r>
+        <w:t xml:space="preserve">-</w:t>
+      </w:r>
+      <w:r>
+        <w:t xml:space="preserve"> </w:t>
+      </w:r>
       <w:r>
         <w:rPr>
           <w:bCs/>
           <w:b/>
         </w:rPr>
-        <w:t xml:space="preserve">Mensajes de WhatsApp (modo manual)</w:t>
-      </w:r>
-      <w:r>
-        <w:t xml:space="preserve"> </w:t>
-      </w:r>
-      <w:r>
-        <w:t xml:space="preserve">-</w:t>
-      </w:r>
-      <w:r>
-        <w:t xml:space="preserve"> </w:t>
-      </w:r>
-      <w:r>
-        <w:rPr>
-          <w:rStyle w:val="VerbatimChar"/>
-        </w:rPr>
-        <w:t xml:space="preserve">GET /admin/notificaciones?estado=pendiente</w:t>
-      </w:r>
-      <w:r>
-        <w:t xml:space="preserve"> </w:t>
-      </w:r>
-      <w:r>
-        <w:t xml:space="preserve">(o</w:t>
-      </w:r>
-      <w:r>
-        <w:t xml:space="preserve"> </w:t>
-      </w:r>
-      <w:r>
-        <w:rPr>
-          <w:rStyle w:val="VerbatimChar"/>
-        </w:rPr>
-        <w:t xml:space="preserve">fallida</w:t>
-      </w:r>
-      <w:r>
-        <w:t xml:space="preserve">,</w:t>
-      </w:r>
-      <w:r>
-        <w:t xml:space="preserve"> </w:t>
-      </w:r>
-      <w:r>
-        <w:rPr>
-          <w:rStyle w:val="VerbatimChar"/>
-        </w:rPr>
-        <w:t xml:space="preserve">enviada</w:t>
-      </w:r>
-      <w:r>
-        <w:t xml:space="preserve">) →</w:t>
-      </w:r>
-      <w:r>
-        <w:t xml:space="preserve"> </w:t>
-      </w:r>
-      <w:r>
-        <w:rPr>
-          <w:rStyle w:val="VerbatimChar"/>
-        </w:rPr>
-        <w:t xml:space="preserve">[{ id, citaId, paciente, tipo, destino, mensaje, enlaceWhatsApp, creadoEn }]</w:t>
-      </w:r>
-      <w:r>
-        <w:t xml:space="preserve"> </w:t>
-      </w:r>
-      <w:r>
-        <w:t xml:space="preserve">- Botón</w:t>
-      </w:r>
-      <w:r>
-        <w:t xml:space="preserve"> </w:t>
-      </w:r>
+        <w:t xml:space="preserve">Cancelar</w:t>
+      </w:r>
+      <w:r>
+        <w:t xml:space="preserve"> </w:t>
+      </w:r>
+      <w:r>
+        <w:t xml:space="preserve">(</w:t>
+      </w:r>
+      <w:r>
+        <w:rPr>
+          <w:rStyle w:val="VerbatimChar"/>
+        </w:rPr>
+        <w:t xml:space="preserve">PATCH …/estado</w:t>
+      </w:r>
+      <w:r>
+        <w:t xml:space="preserve"> </w:t>
+      </w:r>
+      <w:r>
+        <w:t xml:space="preserve">con</w:t>
+      </w:r>
+      <w:r>
+        <w:t xml:space="preserve"> </w:t>
+      </w:r>
+      <w:r>
+        <w:rPr>
+          <w:rStyle w:val="VerbatimChar"/>
+        </w:rPr>
+        <w:t xml:space="preserve">cancelada</w:t>
+      </w:r>
+      <w:r>
+        <w:t xml:space="preserve">) responde</w:t>
+      </w:r>
+      <w:r>
+        <w:t xml:space="preserve"> </w:t>
+      </w:r>
+      <w:r>
+        <w:rPr>
+          <w:rStyle w:val="VerbatimChar"/>
+        </w:rPr>
+        <w:t xml:space="preserve">{ mensaje, notificacion }</w:t>
+      </w:r>
+      <w:r>
+        <w:t xml:space="preserve">.</w:t>
+      </w:r>
+      <w:r>
+        <w:t xml:space="preserve"> </w:t>
+      </w:r>
+      <w:r>
+        <w:rPr>
+          <w:rStyle w:val="VerbatimChar"/>
+        </w:rPr>
+        <w:t xml:space="preserve">notificacion</w:t>
+      </w:r>
+      <w:r>
+        <w:t xml:space="preserve"> </w:t>
+      </w:r>
+      <w:r>
+        <w:t xml:space="preserve">es</w:t>
+      </w:r>
+      <w:r>
+        <w:t xml:space="preserve"> </w:t>
+      </w:r>
+      <w:r>
+        <w:rPr>
+          <w:rStyle w:val="VerbatimChar"/>
+        </w:rPr>
+        <w:t xml:space="preserve">{ id, estado, enlaceWhatsApp }</w:t>
+      </w:r>
+      <w:r>
+        <w:t xml:space="preserve">: si</w:t>
+      </w:r>
+      <w:r>
+        <w:t xml:space="preserve"> </w:t>
+      </w:r>
+      <w:r>
+        <w:rPr>
+          <w:rStyle w:val="VerbatimChar"/>
+        </w:rPr>
+        <w:t xml:space="preserve">estado</w:t>
+      </w:r>
+      <w:r>
+        <w:t xml:space="preserve"> </w:t>
+      </w:r>
+      <w:r>
+        <w:t xml:space="preserve">es</w:t>
+      </w:r>
+      <w:r>
+        <w:t xml:space="preserve"> </w:t>
+      </w:r>
+      <w:r>
+        <w:rPr>
+          <w:rStyle w:val="VerbatimChar"/>
+        </w:rPr>
+        <w:t xml:space="preserve">pendiente</w:t>
+      </w:r>
+      <w:r>
+        <w:t xml:space="preserve">, el panel ofrece</w:t>
+      </w:r>
+      <w:r>
+        <w:t xml:space="preserve"> </w:t>
+      </w:r>
+      <w:r>
+        <w:t xml:space="preserve">“</w:t>
+      </w:r>
+      <w:r>
+        <w:t xml:space="preserve">Enviar por WhatsApp</w:t>
+      </w:r>
+      <w:r>
+        <w:t xml:space="preserve">”</w:t>
+      </w:r>
+      <w:r>
+        <w:t xml:space="preserve"> </w:t>
+      </w:r>
+      <w:r>
+        <w:t xml:space="preserve">y</w:t>
+      </w:r>
+      <w:r>
+        <w:t xml:space="preserve"> </w:t>
+      </w:r>
+      <w:r>
+        <w:t xml:space="preserve">“</w:t>
+      </w:r>
+      <w:r>
+        <w:t xml:space="preserve">Marcar como enviado</w:t>
+      </w:r>
+      <w:r>
+        <w:t xml:space="preserve">”</w:t>
+      </w:r>
+      <w:r>
+        <w:t xml:space="preserve"> </w:t>
+      </w:r>
+      <w:r>
+        <w:t xml:space="preserve">ahí mismo.</w:t>
+      </w:r>
+    </w:p>
+    <w:p>
+      <w:pPr>
+        <w:pStyle w:val="BodyText"/>
+      </w:pPr>
       <w:r>
         <w:rPr>
           <w:bCs/>
           <w:b/>
         </w:rPr>
-        <w:t xml:space="preserve">“</w:t>
+        <w:t xml:space="preserve">Mensajes de WhatsApp (modo manual)</w:t>
+      </w:r>
+      <w:r>
+        <w:t xml:space="preserve"> </w:t>
+      </w:r>
+      <w:r>
+        <w:t xml:space="preserve">-</w:t>
+      </w:r>
+      <w:r>
+        <w:t xml:space="preserve"> </w:t>
+      </w:r>
+      <w:r>
+        <w:rPr>
+          <w:rStyle w:val="VerbatimChar"/>
+        </w:rPr>
+        <w:t xml:space="preserve">GET /admin/notificaciones?estado=pendiente</w:t>
+      </w:r>
+      <w:r>
+        <w:t xml:space="preserve"> </w:t>
+      </w:r>
+      <w:r>
+        <w:t xml:space="preserve">(o</w:t>
+      </w:r>
+      <w:r>
+        <w:t xml:space="preserve"> </w:t>
+      </w:r>
+      <w:r>
+        <w:rPr>
+          <w:rStyle w:val="VerbatimChar"/>
+        </w:rPr>
+        <w:t xml:space="preserve">fallida</w:t>
+      </w:r>
+      <w:r>
+        <w:t xml:space="preserve">,</w:t>
+      </w:r>
+      <w:r>
+        <w:t xml:space="preserve"> </w:t>
+      </w:r>
+      <w:r>
+        <w:rPr>
+          <w:rStyle w:val="VerbatimChar"/>
+        </w:rPr>
+        <w:t xml:space="preserve">enviada</w:t>
+      </w:r>
+      <w:r>
+        <w:t xml:space="preserve">) →</w:t>
+      </w:r>
+      <w:r>
+        <w:t xml:space="preserve"> </w:t>
+      </w:r>
+      <w:r>
+        <w:rPr>
+          <w:rStyle w:val="VerbatimChar"/>
+        </w:rPr>
+        <w:t xml:space="preserve">[{ id, citaId, paciente, tipo, destino, mensaje, enlaceWhatsApp, creadoEn }]</w:t>
+      </w:r>
+      <w:r>
+        <w:t xml:space="preserve"> </w:t>
+      </w:r>
+      <w:r>
+        <w:t xml:space="preserve">- Botón</w:t>
+      </w:r>
+      <w:r>
+        <w:t xml:space="preserve"> </w:t>
       </w:r>
       <w:r>
         <w:rPr>
           <w:bCs/>
           <w:b/>
         </w:rPr>
-        <w:t xml:space="preserve">Enviar por WhatsApp</w:t>
+        <w:t xml:space="preserve">“</w:t>
       </w:r>
       <w:r>
         <w:rPr>
           <w:bCs/>
           <w:b/>
         </w:rPr>
-        <w:t xml:space="preserve">”</w:t>
-      </w:r>
-      <w:r>
-        <w:t xml:space="preserve">: abre</w:t>
-      </w:r>
-      <w:r>
-        <w:t xml:space="preserve"> </w:t>
-      </w:r>
-      <w:r>
-        <w:rPr>
-          <w:rStyle w:val="VerbatimChar"/>
-        </w:rPr>
-        <w:t xml:space="preserve">enlaceWhatsApp</w:t>
-      </w:r>
-      <w:r>
-        <w:t xml:space="preserve"> </w:t>
-      </w:r>
-      <w:r>
-        <w:t xml:space="preserve">en pestaña nueva. Abre la app o WhatsApp Web de la clínica con el texto listo.</w:t>
-      </w:r>
-      <w:r>
-        <w:t xml:space="preserve"> </w:t>
-      </w:r>
-      <w:r>
-        <w:t xml:space="preserve">- Luego, botón</w:t>
-      </w:r>
-      <w:r>
-        <w:t xml:space="preserve"> </w:t>
+        <w:t xml:space="preserve">Enviar por WhatsApp</w:t>
       </w:r>
       <w:r>
         <w:rPr>
           <w:bCs/>
           <w:b/>
         </w:rPr>
-        <w:t xml:space="preserve">“</w:t>
+        <w:t xml:space="preserve">”</w:t>
+      </w:r>
+      <w:r>
+        <w:t xml:space="preserve">: abre</w:t>
+      </w:r>
+      <w:r>
+        <w:t xml:space="preserve"> </w:t>
+      </w:r>
+      <w:r>
+        <w:rPr>
+          <w:rStyle w:val="VerbatimChar"/>
+        </w:rPr>
+        <w:t xml:space="preserve">enlaceWhatsApp</w:t>
+      </w:r>
+      <w:r>
+        <w:t xml:space="preserve"> </w:t>
+      </w:r>
+      <w:r>
+        <w:t xml:space="preserve">en pestaña nueva. Abre la app o WhatsApp Web de la clínica con el texto listo.</w:t>
+      </w:r>
+      <w:r>
+        <w:t xml:space="preserve"> </w:t>
+      </w:r>
+      <w:r>
+        <w:t xml:space="preserve">- Luego, botón</w:t>
+      </w:r>
+      <w:r>
+        <w:t xml:space="preserve"> </w:t>
       </w:r>
       <w:r>
         <w:rPr>
           <w:bCs/>
           <w:b/>
         </w:rPr>
-        <w:t xml:space="preserve">Marcar como enviado</w:t>
+        <w:t xml:space="preserve">“</w:t>
       </w:r>
       <w:r>
         <w:rPr>
           <w:bCs/>
           <w:b/>
         </w:rPr>
-        <w:t xml:space="preserve">”</w:t>
-      </w:r>
-      <w:r>
-        <w:t xml:space="preserve">:</w:t>
-      </w:r>
-      <w:r>
-        <w:t xml:space="preserve"> </w:t>
-      </w:r>
-      <w:r>
-        <w:rPr>
-          <w:rStyle w:val="VerbatimChar"/>
-        </w:rPr>
-        <w:t xml:space="preserve">PATCH /admin/notificaciones/:id</w:t>
-      </w:r>
-      <w:r>
-        <w:t xml:space="preserve"> </w:t>
-      </w:r>
-      <w:r>
-        <w:rPr>
-          <w:rStyle w:val="VerbatimChar"/>
-        </w:rPr>
-        <w:t xml:space="preserve">{ estado: "enviada" }</w:t>
-      </w:r>
-      <w:r>
-        <w:t xml:space="preserve">.</w:t>
-      </w:r>
-      <w:r>
-        <w:t xml:space="preserve"> </w:t>
-      </w:r>
-      <w:r>
-        <w:t xml:space="preserve">-</w:t>
-      </w:r>
-      <w:r>
-        <w:t xml:space="preserve"> </w:t>
+        <w:t xml:space="preserve">Marcar como enviado</w:t>
       </w:r>
       <w:r>
         <w:rPr>
           <w:bCs/>
           <w:b/>
         </w:rPr>
-        <w:t xml:space="preserve">Tipos de mensaje:</w:t>
-      </w:r>
-      <w:r>
-        <w:t xml:space="preserve"> </w:t>
-      </w:r>
-      <w:r>
-        <w:rPr>
-          <w:rStyle w:val="VerbatimChar"/>
-        </w:rPr>
-        <w:t xml:space="preserve">confirmacion</w:t>
-      </w:r>
-      <w:r>
-        <w:t xml:space="preserve">,</w:t>
-      </w:r>
-      <w:r>
-        <w:t xml:space="preserve"> </w:t>
-      </w:r>
-      <w:r>
-        <w:rPr>
-          <w:rStyle w:val="VerbatimChar"/>
-        </w:rPr>
-        <w:t xml:space="preserve">reprogramacion</w:t>
-      </w:r>
-      <w:r>
-        <w:t xml:space="preserve">,</w:t>
-      </w:r>
-      <w:r>
-        <w:t xml:space="preserve"> </w:t>
-      </w:r>
-      <w:r>
-        <w:rPr>
-          <w:rStyle w:val="VerbatimChar"/>
-        </w:rPr>
-        <w:t xml:space="preserve">cancelacion</w:t>
-      </w:r>
-      <w:r>
-        <w:t xml:space="preserve">,</w:t>
-      </w:r>
-      <w:r>
-        <w:t xml:space="preserve"> </w:t>
-      </w:r>
-      <w:r>
-        <w:rPr>
-          <w:rStyle w:val="VerbatimChar"/>
-        </w:rPr>
-        <w:t xml:space="preserve">rechazo</w:t>
-      </w:r>
-      <w:r>
-        <w:t xml:space="preserve"> </w:t>
-      </w:r>
-      <w:r>
-        <w:t xml:space="preserve">y</w:t>
-      </w:r>
-      <w:r>
-        <w:t xml:space="preserve"> </w:t>
-      </w:r>
-      <w:r>
-        <w:rPr>
-          <w:rStyle w:val="VerbatimChar"/>
-        </w:rPr>
-        <w:t xml:space="preserve">recordatorio</w:t>
+        <w:t xml:space="preserve">”</w:t>
+      </w:r>
+      <w:r>
+        <w:t xml:space="preserve">:</w:t>
+      </w:r>
+      <w:r>
+        <w:t xml:space="preserve"> </w:t>
+      </w:r>
+      <w:r>
+        <w:rPr>
+          <w:rStyle w:val="VerbatimChar"/>
+        </w:rPr>
+        <w:t xml:space="preserve">PATCH /admin/notificaciones/:id</w:t>
+      </w:r>
+      <w:r>
+        <w:t xml:space="preserve"> </w:t>
+      </w:r>
+      <w:r>
+        <w:rPr>
+          <w:rStyle w:val="VerbatimChar"/>
+        </w:rPr>
+        <w:t xml:space="preserve">{ estado: "enviada" }</w:t>
       </w:r>
       <w:r>
         <w:t xml:space="preserve">.</w:t>
@@ -3758,13 +4081,58 @@
           <w:bCs/>
           <w:b/>
         </w:rPr>
-        <w:t xml:space="preserve">Recordatorio 24 horas antes:</w:t>
-      </w:r>
-      <w:r>
-        <w:t xml:space="preserve"> </w:t>
-      </w:r>
-      <w:r>
-        <w:t xml:space="preserve">el servidor revisa cada 30 minutos, dentro del horario configurado, las citas confirmadas que empiezan en las próximas 24 horas; aparecen como mensajes de tipo</w:t>
+        <w:t xml:space="preserve">Tipos de mensaje:</w:t>
+      </w:r>
+      <w:r>
+        <w:t xml:space="preserve"> </w:t>
+      </w:r>
+      <w:r>
+        <w:rPr>
+          <w:rStyle w:val="VerbatimChar"/>
+        </w:rPr>
+        <w:t xml:space="preserve">confirmacion</w:t>
+      </w:r>
+      <w:r>
+        <w:t xml:space="preserve">,</w:t>
+      </w:r>
+      <w:r>
+        <w:t xml:space="preserve"> </w:t>
+      </w:r>
+      <w:r>
+        <w:rPr>
+          <w:rStyle w:val="VerbatimChar"/>
+        </w:rPr>
+        <w:t xml:space="preserve">reprogramacion</w:t>
+      </w:r>
+      <w:r>
+        <w:t xml:space="preserve">,</w:t>
+      </w:r>
+      <w:r>
+        <w:t xml:space="preserve"> </w:t>
+      </w:r>
+      <w:r>
+        <w:rPr>
+          <w:rStyle w:val="VerbatimChar"/>
+        </w:rPr>
+        <w:t xml:space="preserve">cancelacion</w:t>
+      </w:r>
+      <w:r>
+        <w:t xml:space="preserve">,</w:t>
+      </w:r>
+      <w:r>
+        <w:t xml:space="preserve"> </w:t>
+      </w:r>
+      <w:r>
+        <w:rPr>
+          <w:rStyle w:val="VerbatimChar"/>
+        </w:rPr>
+        <w:t xml:space="preserve">rechazo</w:t>
+      </w:r>
+      <w:r>
+        <w:t xml:space="preserve"> </w:t>
+      </w:r>
+      <w:r>
+        <w:t xml:space="preserve">y</w:t>
       </w:r>
       <w:r>
         <w:t xml:space="preserve"> </w:t>
@@ -3776,124 +4144,185 @@
         <w:t xml:space="preserve">recordatorio</w:t>
       </w:r>
       <w:r>
-        <w:t xml:space="preserve"> </w:t>
-      </w:r>
-      <w:r>
-        <w:t xml:space="preserve">(sin enlace). Para generarlos ya:</w:t>
-      </w:r>
-      <w:r>
-        <w:t xml:space="preserve"> </w:t>
-      </w:r>
-      <w:r>
-        <w:rPr>
-          <w:rStyle w:val="VerbatimChar"/>
-        </w:rPr>
-        <w:t xml:space="preserve">POST /admin/recordatorios</w:t>
-      </w:r>
-      <w:r>
-        <w:t xml:space="preserve"> </w:t>
-      </w:r>
-      <w:r>
-        <w:t xml:space="preserve">→</w:t>
-      </w:r>
-      <w:r>
-        <w:t xml:space="preserve"> </w:t>
-      </w:r>
-      <w:r>
-        <w:rPr>
-          <w:rStyle w:val="VerbatimChar"/>
-        </w:rPr>
-        <w:t xml:space="preserve">{ fecha, revisadas, resultados: [{ citaId, estado }] }</w:t>
-      </w:r>
-      <w:r>
         <w:t xml:space="preserve">.</w:t>
       </w:r>
       <w:r>
         <w:t xml:space="preserve"> </w:t>
       </w:r>
       <w:r>
-        <w:t xml:space="preserve">- Conviene un contador de pendientes visible en el menú del panel.</w:t>
-      </w:r>
-    </w:p>
-    <w:p>
-      <w:pPr>
-        <w:pStyle w:val="BodyText"/>
-      </w:pPr>
+        <w:t xml:space="preserve">-</w:t>
+      </w:r>
+      <w:r>
+        <w:t xml:space="preserve"> </w:t>
+      </w:r>
       <w:r>
         <w:rPr>
           <w:bCs/>
           <w:b/>
         </w:rPr>
-        <w:t xml:space="preserve">Pacientes</w:t>
-      </w:r>
-      <w:r>
-        <w:t xml:space="preserve"> </w:t>
-      </w:r>
-      <w:r>
-        <w:t xml:space="preserve">(registro sin usuario ni contraseña)</w:t>
-      </w:r>
-      <w:r>
-        <w:t xml:space="preserve"> </w:t>
-      </w:r>
-      <w:r>
-        <w:t xml:space="preserve">-</w:t>
-      </w:r>
-      <w:r>
-        <w:t xml:space="preserve"> </w:t>
-      </w:r>
-      <w:r>
-        <w:rPr>
-          <w:rStyle w:val="VerbatimChar"/>
-        </w:rPr>
-        <w:t xml:space="preserve">POST /pacientes</w:t>
-      </w:r>
-      <w:r>
-        <w:t xml:space="preserve"> </w:t>
-      </w:r>
-      <w:r>
-        <w:rPr>
-          <w:rStyle w:val="VerbatimChar"/>
-        </w:rPr>
-        <w:t xml:space="preserve">{ nombreCompleto, documento, telefono, correo, autorizacionDatos: true }</w:t>
-      </w:r>
-      <w:r>
-        <w:t xml:space="preserve"> </w:t>
-      </w:r>
-      <w:r>
-        <w:t xml:space="preserve">→ 201</w:t>
-      </w:r>
-      <w:r>
-        <w:t xml:space="preserve"> </w:t>
-      </w:r>
-      <w:r>
-        <w:rPr>
-          <w:rStyle w:val="VerbatimChar"/>
-        </w:rPr>
-        <w:t xml:space="preserve">{ mensaje, paciente, citasVinculadas }</w:t>
-      </w:r>
-      <w:r>
-        <w:t xml:space="preserve">. Para quien llega al consultorio.</w:t>
-      </w:r>
-      <w:r>
-        <w:t xml:space="preserve"> </w:t>
-      </w:r>
-      <w:r>
-        <w:rPr>
-          <w:rStyle w:val="VerbatimChar"/>
-        </w:rPr>
-        <w:t xml:space="preserve">citasVinculadas</w:t>
-      </w:r>
-      <w:r>
-        <w:t xml:space="preserve">: citas que pidió antes por la web con el mismo documento y celular. Documento repetido →</w:t>
-      </w:r>
-      <w:r>
-        <w:t xml:space="preserve"> </w:t>
-      </w:r>
+        <w:t xml:space="preserve">Recordatorio 24 horas antes:</w:t>
+      </w:r>
+      <w:r>
+        <w:t xml:space="preserve"> </w:t>
+      </w:r>
+      <w:r>
+        <w:t xml:space="preserve">el servidor revisa cada 30 minutos, dentro del horario configurado, las citas confirmadas que empiezan en las próximas 24 horas; aparecen como mensajes de tipo</w:t>
+      </w:r>
+      <w:r>
+        <w:t xml:space="preserve"> </w:t>
+      </w:r>
+      <w:r>
+        <w:rPr>
+          <w:rStyle w:val="VerbatimChar"/>
+        </w:rPr>
+        <w:t xml:space="preserve">recordatorio</w:t>
+      </w:r>
+      <w:r>
+        <w:t xml:space="preserve"> </w:t>
+      </w:r>
+      <w:r>
+        <w:t xml:space="preserve">(sin enlace). Para generarlos ya:</w:t>
+      </w:r>
+      <w:r>
+        <w:t xml:space="preserve"> </w:t>
+      </w:r>
+      <w:r>
+        <w:rPr>
+          <w:rStyle w:val="VerbatimChar"/>
+        </w:rPr>
+        <w:t xml:space="preserve">POST /admin/recordatorios</w:t>
+      </w:r>
+      <w:r>
+        <w:t xml:space="preserve"> </w:t>
+      </w:r>
+      <w:r>
+        <w:t xml:space="preserve">→</w:t>
+      </w:r>
+      <w:r>
+        <w:t xml:space="preserve"> </w:t>
+      </w:r>
+      <w:r>
+        <w:rPr>
+          <w:rStyle w:val="VerbatimChar"/>
+        </w:rPr>
+        <w:t xml:space="preserve">{ fecha, revisadas, resultados: [{ citaId, estado }] }</w:t>
+      </w:r>
+      <w:r>
+        <w:t xml:space="preserve">.</w:t>
+      </w:r>
+      <w:r>
+        <w:t xml:space="preserve"> </w:t>
+      </w:r>
+      <w:r>
+        <w:t xml:space="preserve">- Conviene un contador de pendientes visible en el menú del panel.</w:t>
+      </w:r>
+    </w:p>
+    <w:p>
+      <w:pPr>
+        <w:pStyle w:val="BodyText"/>
+      </w:pPr>
       <w:r>
         <w:rPr>
           <w:bCs/>
           <w:b/>
         </w:rPr>
+        <w:t xml:space="preserve">Pacientes</w:t>
+      </w:r>
+      <w:r>
+        <w:t xml:space="preserve"> </w:t>
+      </w:r>
+      <w:r>
+        <w:t xml:space="preserve">(registro sin usuario ni contraseña)</w:t>
+      </w:r>
+      <w:r>
+        <w:t xml:space="preserve"> </w:t>
+      </w:r>
+      <w:r>
+        <w:t xml:space="preserve">-</w:t>
+      </w:r>
+      <w:r>
+        <w:t xml:space="preserve"> </w:t>
+      </w:r>
+      <w:r>
+        <w:rPr>
+          <w:rStyle w:val="VerbatimChar"/>
+        </w:rPr>
+        <w:t xml:space="preserve">POST /pacientes</w:t>
+      </w:r>
+      <w:r>
+        <w:t xml:space="preserve"> </w:t>
+      </w:r>
+      <w:r>
+        <w:rPr>
+          <w:rStyle w:val="VerbatimChar"/>
+        </w:rPr>
+        <w:t xml:space="preserve">{ nombres, apellidos, tipoDocumento, documento, telefono, telefonoFijo?, correo, motivoConsulta?, autorizacionDatos: true }</w:t>
+      </w:r>
+      <w:r>
+        <w:t xml:space="preserve"> </w:t>
+      </w:r>
+      <w:r>
+        <w:t xml:space="preserve">→ 201</w:t>
+      </w:r>
+      <w:r>
+        <w:t xml:space="preserve"> </w:t>
+      </w:r>
+      <w:r>
+        <w:rPr>
+          <w:rStyle w:val="VerbatimChar"/>
+        </w:rPr>
+        <w:t xml:space="preserve">{ mensaje, paciente, citasVinculadas }</w:t>
+      </w:r>
+      <w:r>
+        <w:t xml:space="preserve">. Mismas reglas de los datos que en</w:t>
+      </w:r>
+      <w:r>
+        <w:t xml:space="preserve"> </w:t>
+      </w:r>
+      <w:r>
+        <w:rPr>
+          <w:rStyle w:val="VerbatimChar"/>
+        </w:rPr>
+        <w:t xml:space="preserve">POST /citas</w:t>
+      </w:r>
+      <w:r>
+        <w:t xml:space="preserve">;</w:t>
+      </w:r>
+      <w:r>
+        <w:t xml:space="preserve"> </w:t>
+      </w:r>
+      <w:r>
+        <w:rPr>
+          <w:rStyle w:val="VerbatimChar"/>
+        </w:rPr>
+        <w:t xml:space="preserve">motivoConsulta</w:t>
+      </w:r>
+      <w:r>
+        <w:t xml:space="preserve"> </w:t>
+      </w:r>
+      <w:r>
+        <w:t xml:space="preserve">(a qué vino, hasta 500 caracteres) es opcional. Para quien llega al consultorio.</w:t>
+      </w:r>
+      <w:r>
+        <w:t xml:space="preserve"> </w:t>
+      </w:r>
+      <w:r>
+        <w:rPr>
+          <w:rStyle w:val="VerbatimChar"/>
+        </w:rPr>
+        <w:t xml:space="preserve">citasVinculadas</w:t>
+      </w:r>
+      <w:r>
+        <w:t xml:space="preserve">: citas que pidió antes por la web con el mismo documento y celular. Documento repetido →</w:t>
+      </w:r>
+      <w:r>
+        <w:t xml:space="preserve"> </w:t>
+      </w:r>
+      <w:r>
+        <w:rPr>
+          <w:bCs/>
+          <w:b/>
+        </w:rPr>
         <w:t xml:space="preserve">409</w:t>
       </w:r>
       <w:r>
@@ -3960,10 +4389,25 @@
         <w:rPr>
           <w:rStyle w:val="VerbatimChar"/>
         </w:rPr>
-        <w:t xml:space="preserve">[{ id, nombreCompleto, documento, telefono, correo, origen: "web" | "consultorio", fechaAutorizacion, creadoEn }]</w:t>
+        <w:t xml:space="preserve">[{ id, nombres, apellidos, nombreCompleto, tipoDocumento, documento, telefono, telefonoFijo, correo, origen: "web" | "consultorio", motivoConsulta, fechaAutorizacion, creadoEn }]</w:t>
       </w:r>
       <w:r>
         <w:t xml:space="preserve">; busca por nombre, documento, celular o correo.</w:t>
+      </w:r>
+      <w:r>
+        <w:t xml:space="preserve"> </w:t>
+      </w:r>
+      <w:r>
+        <w:rPr>
+          <w:rStyle w:val="VerbatimChar"/>
+        </w:rPr>
+        <w:t xml:space="preserve">nombreCompleto</w:t>
+      </w:r>
+      <w:r>
+        <w:t xml:space="preserve"> </w:t>
+      </w:r>
+      <w:r>
+        <w:t xml:space="preserve">lo calcula la base (nombres + apellidos).</w:t>
       </w:r>
     </w:p>
     <w:p>

</xml_diff>

<commit_message>
docs: el panel ya no tiene sección de Mensajes (decisión 25)
</commit_message>
<xml_diff>
--- a/docs/para-drive/Contrato de la API.docx
+++ b/docs/para-drive/Contrato de la API.docx
@@ -3909,7 +3909,72 @@
           <w:bCs/>
           <w:b/>
         </w:rPr>
-        <w:t xml:space="preserve">Mensajes de WhatsApp (modo manual)</w:t>
+        <w:t xml:space="preserve">Mensajes de WhatsApp</w:t>
+      </w:r>
+    </w:p>
+    <w:p>
+      <w:pPr>
+        <w:pStyle w:val="BlockText"/>
+      </w:pPr>
+      <w:r>
+        <w:t xml:space="preserve">Desde el 9 de octubre los mensajes se envían solos (</w:t>
+      </w:r>
+      <w:r>
+        <w:rPr>
+          <w:rStyle w:val="VerbatimChar"/>
+        </w:rPr>
+        <w:t xml:space="preserve">WHATSAPP_MODO=api</w:t>
+      </w:r>
+      <w:r>
+        <w:t xml:space="preserve">) y el panel no tiene sección de Mensajes. Inicio consulta</w:t>
+      </w:r>
+      <w:r>
+        <w:t xml:space="preserve"> </w:t>
+      </w:r>
+      <w:r>
+        <w:rPr>
+          <w:rStyle w:val="VerbatimChar"/>
+        </w:rPr>
+        <w:t xml:space="preserve">?estado=fallida</w:t>
+      </w:r>
+      <w:r>
+        <w:t xml:space="preserve"> </w:t>
+      </w:r>
+      <w:r>
+        <w:t xml:space="preserve">y</w:t>
+      </w:r>
+      <w:r>
+        <w:t xml:space="preserve"> </w:t>
+      </w:r>
+      <w:r>
+        <w:rPr>
+          <w:rStyle w:val="VerbatimChar"/>
+        </w:rPr>
+        <w:t xml:space="preserve">?estado=pendiente</w:t>
+      </w:r>
+      <w:r>
+        <w:t xml:space="preserve"> </w:t>
+      </w:r>
+      <w:r>
+        <w:t xml:space="preserve">y, solo si hay alguno, muestra</w:t>
+      </w:r>
+      <w:r>
+        <w:t xml:space="preserve"> </w:t>
+      </w:r>
+      <w:r>
+        <w:t xml:space="preserve">“</w:t>
+      </w:r>
+      <w:r>
+        <w:t xml:space="preserve">WhatsApp sin enviar</w:t>
+      </w:r>
+      <w:r>
+        <w:t xml:space="preserve">”</w:t>
+      </w:r>
+      <w:r>
+        <w:t xml:space="preserve"> </w:t>
+      </w:r>
+      <w:r>
+        <w:t xml:space="preserve">con las acciones de abajo. Las rutas siguen igual.</w:t>
       </w:r>
       <w:r>
         <w:t xml:space="preserve"> </w:t>
@@ -4219,7 +4284,7 @@
     </w:p>
     <w:p>
       <w:pPr>
-        <w:pStyle w:val="BodyText"/>
+        <w:pStyle w:val="FirstParagraph"/>
       </w:pPr>
       <w:r>
         <w:rPr>

</xml_diff>

<commit_message>
Docs: decisión 30 (dueño, correcciones con aprobación y odontograma)
Contrato de la API con las rutas del dueño y del odontograma, manual de
instalación con la migración 006, SUPERADMIN_CLAVE y npm run superadmin,
y los Word regenerados.
</commit_message>
<xml_diff>
--- a/docs/para-drive/Contrato de la API.docx
+++ b/docs/para-drive/Contrato de la API.docx
@@ -2,7 +2,7 @@
 <file path=word/document.xml><?xml version="1.0" encoding="utf-8"?>
 <w:document xmlns:w="http://schemas.openxmlformats.org/wordprocessingml/2006/main" xmlns:m="http://schemas.openxmlformats.org/officeDocument/2006/math" xmlns:r="http://schemas.openxmlformats.org/officeDocument/2006/relationships" xmlns:o="urn:schemas-microsoft-com:office:office" xmlns:v="urn:schemas-microsoft-com:vml" xmlns:w10="urn:schemas-microsoft-com:office:word" xmlns:a="http://schemas.openxmlformats.org/drawingml/2006/main" xmlns:pic="http://schemas.openxmlformats.org/drawingml/2006/picture" xmlns:wp="http://schemas.openxmlformats.org/drawingml/2006/wordprocessingDrawing">
   <w:body>
-    <w:bookmarkStart w:id="27" w:name="arte-odontológico-contrato-de-la-api-v2"/>
+    <w:bookmarkStart w:id="28" w:name="arte-odontológico-contrato-de-la-api-v2"/>
     <w:p>
       <w:pPr>
         <w:pStyle w:val="Heading1"/>
@@ -2529,13 +2529,13 @@
       </w:r>
     </w:p>
     <w:bookmarkEnd w:id="23"/>
-    <w:bookmarkStart w:id="24" w:name="sesión-solo-la-secretaria"/>
+    <w:bookmarkStart w:id="24" w:name="sesión-secretaria-y-dueño"/>
     <w:p>
       <w:pPr>
         <w:pStyle w:val="Heading2"/>
       </w:pPr>
       <w:r>
-        <w:t xml:space="preserve">3. Sesión (solo la secretaria)</w:t>
+        <w:t xml:space="preserve">3. Sesión (secretaria y dueño)</w:t>
       </w:r>
     </w:p>
     <w:p>
@@ -2815,14 +2815,89 @@
         </w:tc>
       </w:tr>
     </w:tbl>
+    <w:p>
+      <w:pPr>
+        <w:pStyle w:val="BodyText"/>
+      </w:pPr>
+      <w:r>
+        <w:rPr>
+          <w:rStyle w:val="VerbatimChar"/>
+        </w:rPr>
+        <w:t xml:space="preserve">rol</w:t>
+      </w:r>
+      <w:r>
+        <w:t xml:space="preserve"> </w:t>
+      </w:r>
+      <w:r>
+        <w:t xml:space="preserve">es</w:t>
+      </w:r>
+      <w:r>
+        <w:t xml:space="preserve"> </w:t>
+      </w:r>
+      <w:r>
+        <w:rPr>
+          <w:rStyle w:val="VerbatimChar"/>
+        </w:rPr>
+        <w:t xml:space="preserve">administrador</w:t>
+      </w:r>
+      <w:r>
+        <w:t xml:space="preserve"> </w:t>
+      </w:r>
+      <w:r>
+        <w:t xml:space="preserve">(secretaria) o</w:t>
+      </w:r>
+      <w:r>
+        <w:t xml:space="preserve"> </w:t>
+      </w:r>
+      <w:r>
+        <w:rPr>
+          <w:rStyle w:val="VerbatimChar"/>
+        </w:rPr>
+        <w:t xml:space="preserve">superadmin</w:t>
+      </w:r>
+      <w:r>
+        <w:t xml:space="preserve"> </w:t>
+      </w:r>
+      <w:r>
+        <w:t xml:space="preserve">(dueño, decisión 30). El dueño usa el mismo</w:t>
+      </w:r>
+      <w:r>
+        <w:t xml:space="preserve"> </w:t>
+      </w:r>
+      <w:r>
+        <w:rPr>
+          <w:rStyle w:val="VerbatimChar"/>
+        </w:rPr>
+        <w:t xml:space="preserve">panel-secretaria.html</w:t>
+      </w:r>
+      <w:r>
+        <w:t xml:space="preserve"> </w:t>
+      </w:r>
+      <w:r>
+        <w:t xml:space="preserve">y pasa cualquier control de rol. En cada petición el servidor confirma que el usuario sigue activo y con el mismo rol: si no,</w:t>
+      </w:r>
+      <w:r>
+        <w:t xml:space="preserve"> </w:t>
+      </w:r>
+      <w:r>
+        <w:rPr>
+          <w:bCs/>
+          <w:b/>
+        </w:rPr>
+        <w:t xml:space="preserve">401</w:t>
+      </w:r>
+      <w:r>
+        <w:t xml:space="preserve">.</w:t>
+      </w:r>
+    </w:p>
     <w:bookmarkEnd w:id="24"/>
-    <w:bookmarkStart w:id="25" w:name="X9f6c278bb6b588260d8a391646e30302db82efa"/>
+    <w:bookmarkStart w:id="25" w:name="Xe088fc24f95e68a87eeeefb67376a49abac40e9"/>
     <w:p>
       <w:pPr>
         <w:pStyle w:val="Heading2"/>
       </w:pPr>
       <w:r>
-        <w:t xml:space="preserve">4. Panel de la secretaria (todo exige rol administrador)</w:t>
+        <w:t xml:space="preserve">4. Panel de la secretaria (todo exige rol administrador o superadmin)</w:t>
       </w:r>
     </w:p>
     <w:p>
@@ -4753,7 +4828,7 @@
         <w:rPr>
           <w:rStyle w:val="VerbatimChar"/>
         </w:rPr>
-        <w:t xml:space="preserve">[{ id, fechaAtencion, especialidad, especialista, citaId, procedimiento, notas, corrigeA, correcciones: [ids], autor, creadoEn }]</w:t>
+        <w:t xml:space="preserve">[{ id, fechaAtencion, especialidad, especialista, citaId, procedimiento, notas, corrigeA, estado, correcciones: [ids], correccionPendiente, autor, creadoEn, revisor, revisadoEn, motivoRechazo }]</w:t>
       </w:r>
       <w:r>
         <w:t xml:space="preserve">.</w:t>
@@ -4762,6 +4837,75 @@
         <w:t xml:space="preserve"> </w:t>
       </w:r>
       <w:r>
+        <w:rPr>
+          <w:rStyle w:val="VerbatimChar"/>
+        </w:rPr>
+        <w:t xml:space="preserve">estado</w:t>
+      </w:r>
+      <w:r>
+        <w:t xml:space="preserve">:</w:t>
+      </w:r>
+      <w:r>
+        <w:t xml:space="preserve"> </w:t>
+      </w:r>
+      <w:r>
+        <w:rPr>
+          <w:rStyle w:val="VerbatimChar"/>
+        </w:rPr>
+        <w:t xml:space="preserve">vigente</w:t>
+      </w:r>
+      <w:r>
+        <w:t xml:space="preserve"> </w:t>
+      </w:r>
+      <w:r>
+        <w:t xml:space="preserve">|</w:t>
+      </w:r>
+      <w:r>
+        <w:t xml:space="preserve"> </w:t>
+      </w:r>
+      <w:r>
+        <w:rPr>
+          <w:rStyle w:val="VerbatimChar"/>
+        </w:rPr>
+        <w:t xml:space="preserve">pendiente</w:t>
+      </w:r>
+      <w:r>
+        <w:t xml:space="preserve"> </w:t>
+      </w:r>
+      <w:r>
+        <w:t xml:space="preserve">(corrección esperando al dueño) |</w:t>
+      </w:r>
+      <w:r>
+        <w:t xml:space="preserve"> </w:t>
+      </w:r>
+      <w:r>
+        <w:rPr>
+          <w:rStyle w:val="VerbatimChar"/>
+        </w:rPr>
+        <w:t xml:space="preserve">rechazada</w:t>
+      </w:r>
+      <w:r>
+        <w:t xml:space="preserve">.</w:t>
+      </w:r>
+      <w:r>
+        <w:t xml:space="preserve"> </w:t>
+      </w:r>
+      <w:r>
+        <w:rPr>
+          <w:rStyle w:val="VerbatimChar"/>
+        </w:rPr>
+        <w:t xml:space="preserve">correcciones</w:t>
+      </w:r>
+      <w:r>
+        <w:t xml:space="preserve"> </w:t>
+      </w:r>
+      <w:r>
+        <w:t xml:space="preserve">solo cuenta las vigentes.</w:t>
+      </w:r>
+      <w:r>
+        <w:t xml:space="preserve"> </w:t>
+      </w:r>
+      <w:r>
         <w:t xml:space="preserve">-</w:t>
       </w:r>
       <w:r>
@@ -4846,13 +4990,34 @@
         <w:t xml:space="preserve"> </w:t>
       </w:r>
       <w:r>
-        <w:t xml:space="preserve">(qué se corrige y por qué) es obligatorio.</w:t>
-      </w:r>
-      <w:r>
-        <w:t xml:space="preserve"> </w:t>
-      </w:r>
-      <w:r>
-        <w:t xml:space="preserve">-</w:t>
+        <w:t xml:space="preserve">(qué se corrige y por qué) es obligatorio. Si la pide un administrador queda</w:t>
+      </w:r>
+      <w:r>
+        <w:t xml:space="preserve"> </w:t>
+      </w:r>
+      <w:r>
+        <w:rPr>
+          <w:rStyle w:val="VerbatimChar"/>
+        </w:rPr>
+        <w:t xml:space="preserve">estado: "pendiente"</w:t>
+      </w:r>
+      <w:r>
+        <w:t xml:space="preserve"> </w:t>
+      </w:r>
+      <w:r>
+        <w:t xml:space="preserve">hasta que el dueño la apruebe; la del dueño queda</w:t>
+      </w:r>
+      <w:r>
+        <w:t xml:space="preserve"> </w:t>
+      </w:r>
+      <w:r>
+        <w:rPr>
+          <w:rStyle w:val="VerbatimChar"/>
+        </w:rPr>
+        <w:t xml:space="preserve">vigente</w:t>
+      </w:r>
+      <w:r>
+        <w:t xml:space="preserve">. Entrada no vigente o con una corrección ya pendiente →</w:t>
       </w:r>
       <w:r>
         <w:t xml:space="preserve"> </w:t>
@@ -4862,6 +5027,25 @@
           <w:bCs/>
           <w:b/>
         </w:rPr>
+        <w:t xml:space="preserve">409</w:t>
+      </w:r>
+      <w:r>
+        <w:t xml:space="preserve">.</w:t>
+      </w:r>
+      <w:r>
+        <w:t xml:space="preserve"> </w:t>
+      </w:r>
+      <w:r>
+        <w:t xml:space="preserve">-</w:t>
+      </w:r>
+      <w:r>
+        <w:t xml:space="preserve"> </w:t>
+      </w:r>
+      <w:r>
+        <w:rPr>
+          <w:bCs/>
+          <w:b/>
+        </w:rPr>
         <w:t xml:space="preserve">No hay editar ni borrar</w:t>
       </w:r>
       <w:r>
@@ -4950,10 +5134,805 @@
       </w:r>
       <w:r>
         <w:t xml:space="preserve">ya puesto.</w:t>
+      </w:r>
+    </w:p>
+    <w:p>
+      <w:pPr>
+        <w:pStyle w:val="BodyText"/>
+      </w:pPr>
+      <w:r>
+        <w:rPr>
+          <w:bCs/>
+          <w:b/>
+        </w:rPr>
+        <w:t xml:space="preserve">Odontograma</w:t>
+      </w:r>
+      <w:r>
+        <w:t xml:space="preserve"> </w:t>
+      </w:r>
+      <w:r>
+        <w:t xml:space="preserve">(FDI: 11–48 permanentes, 51–85 temporales)</w:t>
+      </w:r>
+      <w:r>
+        <w:t xml:space="preserve"> </w:t>
+      </w:r>
+      <w:r>
+        <w:t xml:space="preserve">-</w:t>
+      </w:r>
+      <w:r>
+        <w:t xml:space="preserve"> </w:t>
+      </w:r>
+      <w:r>
+        <w:rPr>
+          <w:rStyle w:val="VerbatimChar"/>
+        </w:rPr>
+        <w:t xml:space="preserve">GET /pacientes/:id/odontograma</w:t>
+      </w:r>
+      <w:r>
+        <w:t xml:space="preserve"> </w:t>
+      </w:r>
+      <w:r>
+        <w:t xml:space="preserve">→</w:t>
+      </w:r>
+      <w:r>
+        <w:t xml:space="preserve"> </w:t>
+      </w:r>
+      <w:r>
+        <w:rPr>
+          <w:rStyle w:val="VerbatimChar"/>
+        </w:rPr>
+        <w:t xml:space="preserve">{ catalogo: { hallazgos: { codigo: { nombre, alcance: "cara" | "diente" | "ambos", soloRealizado? } }, caras }, hallazgos: [{ id, diente, cara, hallazgo, estado, notas, autor, creadoEn, realizadoPor, realizadoEn, anulacion, anulacionMotivo, anulacionPedidaPor, anulacionPedidaEn, anulacionRevisadaPor, anulacionRevisadaEn, anulacionRechazo }] }</w:t>
+      </w:r>
+      <w:r>
+        <w:t xml:space="preserve">.</w:t>
+      </w:r>
+      <w:r>
+        <w:t xml:space="preserve"> </w:t>
+      </w:r>
+      <w:r>
+        <w:rPr>
+          <w:rStyle w:val="VerbatimChar"/>
+        </w:rPr>
+        <w:t xml:space="preserve">cara</w:t>
+      </w:r>
+      <w:r>
+        <w:t xml:space="preserve">:</w:t>
+      </w:r>
+      <w:r>
+        <w:t xml:space="preserve"> </w:t>
+      </w:r>
+      <w:r>
+        <w:rPr>
+          <w:rStyle w:val="VerbatimChar"/>
+        </w:rPr>
+        <w:t xml:space="preserve">completo</w:t>
+      </w:r>
+      <w:r>
+        <w:t xml:space="preserve"> </w:t>
+      </w:r>
+      <w:r>
+        <w:t xml:space="preserve">|</w:t>
+      </w:r>
+      <w:r>
+        <w:t xml:space="preserve"> </w:t>
+      </w:r>
+      <w:r>
+        <w:rPr>
+          <w:rStyle w:val="VerbatimChar"/>
+        </w:rPr>
+        <w:t xml:space="preserve">oclusal</w:t>
+      </w:r>
+      <w:r>
+        <w:t xml:space="preserve"> </w:t>
+      </w:r>
+      <w:r>
+        <w:t xml:space="preserve">|</w:t>
+      </w:r>
+      <w:r>
+        <w:t xml:space="preserve"> </w:t>
+      </w:r>
+      <w:r>
+        <w:rPr>
+          <w:rStyle w:val="VerbatimChar"/>
+        </w:rPr>
+        <w:t xml:space="preserve">mesial</w:t>
+      </w:r>
+      <w:r>
+        <w:t xml:space="preserve"> </w:t>
+      </w:r>
+      <w:r>
+        <w:t xml:space="preserve">|</w:t>
+      </w:r>
+      <w:r>
+        <w:t xml:space="preserve"> </w:t>
+      </w:r>
+      <w:r>
+        <w:rPr>
+          <w:rStyle w:val="VerbatimChar"/>
+        </w:rPr>
+        <w:t xml:space="preserve">distal</w:t>
+      </w:r>
+      <w:r>
+        <w:t xml:space="preserve"> </w:t>
+      </w:r>
+      <w:r>
+        <w:t xml:space="preserve">|</w:t>
+      </w:r>
+      <w:r>
+        <w:t xml:space="preserve"> </w:t>
+      </w:r>
+      <w:r>
+        <w:rPr>
+          <w:rStyle w:val="VerbatimChar"/>
+        </w:rPr>
+        <w:t xml:space="preserve">vestibular</w:t>
+      </w:r>
+      <w:r>
+        <w:t xml:space="preserve"> </w:t>
+      </w:r>
+      <w:r>
+        <w:t xml:space="preserve">|</w:t>
+      </w:r>
+      <w:r>
+        <w:t xml:space="preserve"> </w:t>
+      </w:r>
+      <w:r>
+        <w:rPr>
+          <w:rStyle w:val="VerbatimChar"/>
+        </w:rPr>
+        <w:t xml:space="preserve">lingual</w:t>
+      </w:r>
+      <w:r>
+        <w:t xml:space="preserve">.</w:t>
+      </w:r>
+      <w:r>
+        <w:t xml:space="preserve"> </w:t>
+      </w:r>
+      <w:r>
+        <w:rPr>
+          <w:rStyle w:val="VerbatimChar"/>
+        </w:rPr>
+        <w:t xml:space="preserve">anulacion</w:t>
+      </w:r>
+      <w:r>
+        <w:t xml:space="preserve">:</w:t>
+      </w:r>
+      <w:r>
+        <w:t xml:space="preserve"> </w:t>
+      </w:r>
+      <w:r>
+        <w:rPr>
+          <w:rStyle w:val="VerbatimChar"/>
+        </w:rPr>
+        <w:t xml:space="preserve">null</w:t>
+      </w:r>
+      <w:r>
+        <w:t xml:space="preserve"> </w:t>
+      </w:r>
+      <w:r>
+        <w:t xml:space="preserve">|</w:t>
+      </w:r>
+      <w:r>
+        <w:t xml:space="preserve"> </w:t>
+      </w:r>
+      <w:r>
+        <w:rPr>
+          <w:rStyle w:val="VerbatimChar"/>
+        </w:rPr>
+        <w:t xml:space="preserve">pendiente</w:t>
+      </w:r>
+      <w:r>
+        <w:t xml:space="preserve"> </w:t>
+      </w:r>
+      <w:r>
+        <w:t xml:space="preserve">|</w:t>
+      </w:r>
+      <w:r>
+        <w:t xml:space="preserve"> </w:t>
+      </w:r>
+      <w:r>
+        <w:rPr>
+          <w:rStyle w:val="VerbatimChar"/>
+        </w:rPr>
+        <w:t xml:space="preserve">aprobada</w:t>
+      </w:r>
+      <w:r>
+        <w:t xml:space="preserve"> </w:t>
+      </w:r>
+      <w:r>
+        <w:t xml:space="preserve">|</w:t>
+      </w:r>
+      <w:r>
+        <w:t xml:space="preserve"> </w:t>
+      </w:r>
+      <w:r>
+        <w:rPr>
+          <w:rStyle w:val="VerbatimChar"/>
+        </w:rPr>
+        <w:t xml:space="preserve">rechazada</w:t>
+      </w:r>
+      <w:r>
+        <w:t xml:space="preserve"> </w:t>
+      </w:r>
+      <w:r>
+        <w:t xml:space="preserve">(los</w:t>
+      </w:r>
+      <w:r>
+        <w:t xml:space="preserve"> </w:t>
+      </w:r>
+      <w:r>
+        <w:rPr>
+          <w:rStyle w:val="VerbatimChar"/>
+        </w:rPr>
+        <w:t xml:space="preserve">aprobada</w:t>
+      </w:r>
+      <w:r>
+        <w:t xml:space="preserve"> </w:t>
+      </w:r>
+      <w:r>
+        <w:t xml:space="preserve">no se dibujan).</w:t>
+      </w:r>
+      <w:r>
+        <w:t xml:space="preserve"> </w:t>
+      </w:r>
+      <w:r>
+        <w:t xml:space="preserve">-</w:t>
+      </w:r>
+      <w:r>
+        <w:t xml:space="preserve"> </w:t>
+      </w:r>
+      <w:r>
+        <w:rPr>
+          <w:rStyle w:val="VerbatimChar"/>
+        </w:rPr>
+        <w:t xml:space="preserve">POST /pacientes/:id/odontograma</w:t>
+      </w:r>
+      <w:r>
+        <w:t xml:space="preserve"> </w:t>
+      </w:r>
+      <w:r>
+        <w:rPr>
+          <w:rStyle w:val="VerbatimChar"/>
+        </w:rPr>
+        <w:t xml:space="preserve">{ diente, caras: ["oclusal", "mesial"] | ["completo"], hallazgo, estado: "por_hacer" | "realizado", notas? }</w:t>
+      </w:r>
+      <w:r>
+        <w:t xml:space="preserve"> </w:t>
+      </w:r>
+      <w:r>
+        <w:t xml:space="preserve">→ 201</w:t>
+      </w:r>
+      <w:r>
+        <w:t xml:space="preserve"> </w:t>
+      </w:r>
+      <w:r>
+        <w:rPr>
+          <w:rStyle w:val="VerbatimChar"/>
+        </w:rPr>
+        <w:t xml:space="preserve">{ mensaje, hallazgos }</w:t>
+      </w:r>
+      <w:r>
+        <w:t xml:space="preserve"> </w:t>
+      </w:r>
+      <w:r>
+        <w:t xml:space="preserve">(un hallazgo por cara). El catálogo dice si va por caras o en el diente completo.</w:t>
+      </w:r>
+      <w:r>
+        <w:t xml:space="preserve"> </w:t>
+      </w:r>
+      <w:r>
+        <w:t xml:space="preserve">-</w:t>
+      </w:r>
+      <w:r>
+        <w:t xml:space="preserve"> </w:t>
+      </w:r>
+      <w:r>
+        <w:rPr>
+          <w:rStyle w:val="VerbatimChar"/>
+        </w:rPr>
+        <w:t xml:space="preserve">POST /admin/odontograma/:id/realizado</w:t>
+      </w:r>
+      <w:r>
+        <w:t xml:space="preserve"> </w:t>
+      </w:r>
+      <w:r>
+        <w:t xml:space="preserve">→</w:t>
+      </w:r>
+      <w:r>
+        <w:t xml:space="preserve"> </w:t>
+      </w:r>
+      <w:r>
+        <w:rPr>
+          <w:rStyle w:val="VerbatimChar"/>
+        </w:rPr>
+        <w:t xml:space="preserve">{ mensaje, hallazgos }</w:t>
+      </w:r>
+      <w:r>
+        <w:t xml:space="preserve">. Ya realizado o anulado →</w:t>
+      </w:r>
+      <w:r>
+        <w:t xml:space="preserve"> </w:t>
+      </w:r>
+      <w:r>
+        <w:rPr>
+          <w:bCs/>
+          <w:b/>
+        </w:rPr>
+        <w:t xml:space="preserve">409</w:t>
+      </w:r>
+      <w:r>
+        <w:t xml:space="preserve">.</w:t>
+      </w:r>
+      <w:r>
+        <w:t xml:space="preserve"> </w:t>
+      </w:r>
+      <w:r>
+        <w:t xml:space="preserve">-</w:t>
+      </w:r>
+      <w:r>
+        <w:t xml:space="preserve"> </w:t>
+      </w:r>
+      <w:r>
+        <w:rPr>
+          <w:rStyle w:val="VerbatimChar"/>
+        </w:rPr>
+        <w:t xml:space="preserve">POST /admin/odontograma/:id/anular</w:t>
+      </w:r>
+      <w:r>
+        <w:t xml:space="preserve"> </w:t>
+      </w:r>
+      <w:r>
+        <w:rPr>
+          <w:rStyle w:val="VerbatimChar"/>
+        </w:rPr>
+        <w:t xml:space="preserve">{ motivo }</w:t>
+      </w:r>
+      <w:r>
+        <w:t xml:space="preserve"> </w:t>
+      </w:r>
+      <w:r>
+        <w:t xml:space="preserve">→</w:t>
+      </w:r>
+      <w:r>
+        <w:t xml:space="preserve"> </w:t>
+      </w:r>
+      <w:r>
+        <w:rPr>
+          <w:rStyle w:val="VerbatimChar"/>
+        </w:rPr>
+        <w:t xml:space="preserve">{ mensaje, hallazgos }</w:t>
+      </w:r>
+      <w:r>
+        <w:t xml:space="preserve">. Del administrador queda</w:t>
+      </w:r>
+      <w:r>
+        <w:t xml:space="preserve"> </w:t>
+      </w:r>
+      <w:r>
+        <w:rPr>
+          <w:rStyle w:val="VerbatimChar"/>
+        </w:rPr>
+        <w:t xml:space="preserve">pendiente</w:t>
+      </w:r>
+      <w:r>
+        <w:t xml:space="preserve">; del dueño,</w:t>
+      </w:r>
+      <w:r>
+        <w:t xml:space="preserve"> </w:t>
+      </w:r>
+      <w:r>
+        <w:rPr>
+          <w:rStyle w:val="VerbatimChar"/>
+        </w:rPr>
+        <w:t xml:space="preserve">aprobada</w:t>
+      </w:r>
+      <w:r>
+        <w:t xml:space="preserve">.</w:t>
       </w:r>
     </w:p>
     <w:bookmarkEnd w:id="25"/>
-    <w:bookmarkStart w:id="26" w:name="aún-no-existe"/>
+    <w:bookmarkStart w:id="26" w:name="solo-el-dueño-superadmin"/>
+    <w:p>
+      <w:pPr>
+        <w:pStyle w:val="Heading2"/>
+      </w:pPr>
+      <w:r>
+        <w:t xml:space="preserve">5. Solo el dueño (</w:t>
+      </w:r>
+      <w:r>
+        <w:rPr>
+          <w:rStyle w:val="VerbatimChar"/>
+        </w:rPr>
+        <w:t xml:space="preserve">superadmin</w:t>
+      </w:r>
+      <w:r>
+        <w:t xml:space="preserve">)</w:t>
+      </w:r>
+    </w:p>
+    <w:p>
+      <w:pPr>
+        <w:pStyle w:val="FirstParagraph"/>
+      </w:pPr>
+      <w:r>
+        <w:t xml:space="preserve">Cualquier otro rol →</w:t>
+      </w:r>
+      <w:r>
+        <w:t xml:space="preserve"> </w:t>
+      </w:r>
+      <w:r>
+        <w:rPr>
+          <w:bCs/>
+          <w:b/>
+        </w:rPr>
+        <w:t xml:space="preserve">403</w:t>
+      </w:r>
+      <w:r>
+        <w:t xml:space="preserve">.</w:t>
+      </w:r>
+    </w:p>
+    <w:p>
+      <w:pPr>
+        <w:pStyle w:val="BodyText"/>
+      </w:pPr>
+      <w:r>
+        <w:rPr>
+          <w:bCs/>
+          <w:b/>
+        </w:rPr>
+        <w:t xml:space="preserve">Solicitudes</w:t>
+      </w:r>
+      <w:r>
+        <w:t xml:space="preserve"> </w:t>
+      </w:r>
+      <w:r>
+        <w:t xml:space="preserve">-</w:t>
+      </w:r>
+      <w:r>
+        <w:t xml:space="preserve"> </w:t>
+      </w:r>
+      <w:r>
+        <w:rPr>
+          <w:rStyle w:val="VerbatimChar"/>
+        </w:rPr>
+        <w:t xml:space="preserve">GET /superadmin/solicitudes</w:t>
+      </w:r>
+      <w:r>
+        <w:t xml:space="preserve"> </w:t>
+      </w:r>
+      <w:r>
+        <w:t xml:space="preserve">→</w:t>
+      </w:r>
+      <w:r>
+        <w:t xml:space="preserve"> </w:t>
+      </w:r>
+      <w:r>
+        <w:rPr>
+          <w:rStyle w:val="VerbatimChar"/>
+        </w:rPr>
+        <w:t xml:space="preserve">{ correcciones: [{ ...entrada, pacienteId, paciente, procedimientoOriginal, notasOriginal, fechaOriginal }], anulaciones: [{ ...hallazgo, paciente }] }</w:t>
+      </w:r>
+      <w:r>
+        <w:t xml:space="preserve">, las más antiguas primero.</w:t>
+      </w:r>
+      <w:r>
+        <w:t xml:space="preserve"> </w:t>
+      </w:r>
+      <w:r>
+        <w:t xml:space="preserve">-</w:t>
+      </w:r>
+      <w:r>
+        <w:t xml:space="preserve"> </w:t>
+      </w:r>
+      <w:r>
+        <w:rPr>
+          <w:rStyle w:val="VerbatimChar"/>
+        </w:rPr>
+        <w:t xml:space="preserve">POST /superadmin/solicitudes/historia/:id/aprobar</w:t>
+      </w:r>
+      <w:r>
+        <w:t xml:space="preserve"> </w:t>
+      </w:r>
+      <w:r>
+        <w:t xml:space="preserve">·</w:t>
+      </w:r>
+      <w:r>
+        <w:t xml:space="preserve"> </w:t>
+      </w:r>
+      <w:r>
+        <w:rPr>
+          <w:rStyle w:val="VerbatimChar"/>
+        </w:rPr>
+        <w:t xml:space="preserve">POST .../rechazar</w:t>
+      </w:r>
+      <w:r>
+        <w:t xml:space="preserve"> </w:t>
+      </w:r>
+      <w:r>
+        <w:rPr>
+          <w:rStyle w:val="VerbatimChar"/>
+        </w:rPr>
+        <w:t xml:space="preserve">{ motivo }</w:t>
+      </w:r>
+      <w:r>
+        <w:t xml:space="preserve"> </w:t>
+      </w:r>
+      <w:r>
+        <w:t xml:space="preserve">(3 a 300 caracteres).</w:t>
+      </w:r>
+      <w:r>
+        <w:t xml:space="preserve"> </w:t>
+      </w:r>
+      <w:r>
+        <w:t xml:space="preserve">-</w:t>
+      </w:r>
+      <w:r>
+        <w:t xml:space="preserve"> </w:t>
+      </w:r>
+      <w:r>
+        <w:rPr>
+          <w:rStyle w:val="VerbatimChar"/>
+        </w:rPr>
+        <w:t xml:space="preserve">POST /superadmin/solicitudes/odontograma/:id/aprobar</w:t>
+      </w:r>
+      <w:r>
+        <w:t xml:space="preserve"> </w:t>
+      </w:r>
+      <w:r>
+        <w:t xml:space="preserve">·</w:t>
+      </w:r>
+      <w:r>
+        <w:t xml:space="preserve"> </w:t>
+      </w:r>
+      <w:r>
+        <w:rPr>
+          <w:rStyle w:val="VerbatimChar"/>
+        </w:rPr>
+        <w:t xml:space="preserve">POST .../rechazar</w:t>
+      </w:r>
+      <w:r>
+        <w:t xml:space="preserve"> </w:t>
+      </w:r>
+      <w:r>
+        <w:rPr>
+          <w:rStyle w:val="VerbatimChar"/>
+        </w:rPr>
+        <w:t xml:space="preserve">{ motivo }</w:t>
+      </w:r>
+      <w:r>
+        <w:t xml:space="preserve">.</w:t>
+      </w:r>
+      <w:r>
+        <w:t xml:space="preserve"> </w:t>
+      </w:r>
+      <w:r>
+        <w:t xml:space="preserve">- Ya revisada →</w:t>
+      </w:r>
+      <w:r>
+        <w:t xml:space="preserve"> </w:t>
+      </w:r>
+      <w:r>
+        <w:rPr>
+          <w:bCs/>
+          <w:b/>
+        </w:rPr>
+        <w:t xml:space="preserve">409</w:t>
+      </w:r>
+      <w:r>
+        <w:t xml:space="preserve">.</w:t>
+      </w:r>
+    </w:p>
+    <w:p>
+      <w:pPr>
+        <w:pStyle w:val="BodyText"/>
+      </w:pPr>
+      <w:r>
+        <w:rPr>
+          <w:bCs/>
+          <w:b/>
+        </w:rPr>
+        <w:t xml:space="preserve">Administradores</w:t>
+      </w:r>
+      <w:r>
+        <w:t xml:space="preserve"> </w:t>
+      </w:r>
+      <w:r>
+        <w:t xml:space="preserve">-</w:t>
+      </w:r>
+      <w:r>
+        <w:t xml:space="preserve"> </w:t>
+      </w:r>
+      <w:r>
+        <w:rPr>
+          <w:rStyle w:val="VerbatimChar"/>
+        </w:rPr>
+        <w:t xml:space="preserve">GET /superadmin/administradores</w:t>
+      </w:r>
+      <w:r>
+        <w:t xml:space="preserve"> </w:t>
+      </w:r>
+      <w:r>
+        <w:t xml:space="preserve">→</w:t>
+      </w:r>
+      <w:r>
+        <w:t xml:space="preserve"> </w:t>
+      </w:r>
+      <w:r>
+        <w:rPr>
+          <w:rStyle w:val="VerbatimChar"/>
+        </w:rPr>
+        <w:t xml:space="preserve">[{ id, nombreCompleto, documento, correo, telefono, activo, debeCambiarContrasena, creadoEn }]</w:t>
+      </w:r>
+      <w:r>
+        <w:t xml:space="preserve"> </w:t>
+      </w:r>
+      <w:r>
+        <w:t xml:space="preserve">(el dueño no aparece).</w:t>
+      </w:r>
+      <w:r>
+        <w:t xml:space="preserve"> </w:t>
+      </w:r>
+      <w:r>
+        <w:t xml:space="preserve">-</w:t>
+      </w:r>
+      <w:r>
+        <w:t xml:space="preserve"> </w:t>
+      </w:r>
+      <w:r>
+        <w:rPr>
+          <w:rStyle w:val="VerbatimChar"/>
+        </w:rPr>
+        <w:t xml:space="preserve">POST /superadmin/administradores</w:t>
+      </w:r>
+      <w:r>
+        <w:t xml:space="preserve"> </w:t>
+      </w:r>
+      <w:r>
+        <w:rPr>
+          <w:rStyle w:val="VerbatimChar"/>
+        </w:rPr>
+        <w:t xml:space="preserve">{ nombreCompleto, documento, correo, telefono }</w:t>
+      </w:r>
+      <w:r>
+        <w:t xml:space="preserve"> </w:t>
+      </w:r>
+      <w:r>
+        <w:t xml:space="preserve">→ 201</w:t>
+      </w:r>
+      <w:r>
+        <w:t xml:space="preserve"> </w:t>
+      </w:r>
+      <w:r>
+        <w:rPr>
+          <w:rStyle w:val="VerbatimChar"/>
+        </w:rPr>
+        <w:t xml:space="preserve">{ mensaje, administrador, contrasenaTemporal }</w:t>
+      </w:r>
+      <w:r>
+        <w:t xml:space="preserve">. La clave temporal se muestra</w:t>
+      </w:r>
+      <w:r>
+        <w:t xml:space="preserve"> </w:t>
+      </w:r>
+      <w:r>
+        <w:rPr>
+          <w:bCs/>
+          <w:b/>
+        </w:rPr>
+        <w:t xml:space="preserve">una sola vez</w:t>
+      </w:r>
+      <w:r>
+        <w:t xml:space="preserve">. Correo o documento repetido →</w:t>
+      </w:r>
+      <w:r>
+        <w:t xml:space="preserve"> </w:t>
+      </w:r>
+      <w:r>
+        <w:rPr>
+          <w:bCs/>
+          <w:b/>
+        </w:rPr>
+        <w:t xml:space="preserve">409</w:t>
+      </w:r>
+      <w:r>
+        <w:t xml:space="preserve">.</w:t>
+      </w:r>
+      <w:r>
+        <w:t xml:space="preserve"> </w:t>
+      </w:r>
+      <w:r>
+        <w:t xml:space="preserve">-</w:t>
+      </w:r>
+      <w:r>
+        <w:t xml:space="preserve"> </w:t>
+      </w:r>
+      <w:r>
+        <w:rPr>
+          <w:rStyle w:val="VerbatimChar"/>
+        </w:rPr>
+        <w:t xml:space="preserve">PATCH /superadmin/administradores/:id</w:t>
+      </w:r>
+      <w:r>
+        <w:t xml:space="preserve"> </w:t>
+      </w:r>
+      <w:r>
+        <w:rPr>
+          <w:rStyle w:val="VerbatimChar"/>
+        </w:rPr>
+        <w:t xml:space="preserve">{ nombreCompleto?, documento?, correo?, telefono?, activo? }</w:t>
+      </w:r>
+      <w:r>
+        <w:t xml:space="preserve">.</w:t>
+      </w:r>
+      <w:r>
+        <w:t xml:space="preserve"> </w:t>
+      </w:r>
+      <w:r>
+        <w:t xml:space="preserve">-</w:t>
+      </w:r>
+      <w:r>
+        <w:t xml:space="preserve"> </w:t>
+      </w:r>
+      <w:r>
+        <w:rPr>
+          <w:rStyle w:val="VerbatimChar"/>
+        </w:rPr>
+        <w:t xml:space="preserve">POST /superadmin/administradores/:id/restablecer</w:t>
+      </w:r>
+      <w:r>
+        <w:t xml:space="preserve"> </w:t>
+      </w:r>
+      <w:r>
+        <w:t xml:space="preserve">→</w:t>
+      </w:r>
+      <w:r>
+        <w:t xml:space="preserve"> </w:t>
+      </w:r>
+      <w:r>
+        <w:rPr>
+          <w:rStyle w:val="VerbatimChar"/>
+        </w:rPr>
+        <w:t xml:space="preserve">{ mensaje, contrasenaTemporal }</w:t>
+      </w:r>
+      <w:r>
+        <w:t xml:space="preserve">.</w:t>
+      </w:r>
+      <w:r>
+        <w:t xml:space="preserve"> </w:t>
+      </w:r>
+      <w:r>
+        <w:t xml:space="preserve">-</w:t>
+      </w:r>
+      <w:r>
+        <w:t xml:space="preserve"> </w:t>
+      </w:r>
+      <w:r>
+        <w:rPr>
+          <w:rStyle w:val="VerbatimChar"/>
+        </w:rPr>
+        <w:t xml:space="preserve">DELETE /superadmin/administradores/:id</w:t>
+      </w:r>
+      <w:r>
+        <w:t xml:space="preserve">. Si ya registró pacientes, citas o historia →</w:t>
+      </w:r>
+      <w:r>
+        <w:t xml:space="preserve"> </w:t>
+      </w:r>
+      <w:r>
+        <w:rPr>
+          <w:bCs/>
+          <w:b/>
+        </w:rPr>
+        <w:t xml:space="preserve">409</w:t>
+      </w:r>
+      <w:r>
+        <w:t xml:space="preserve"> </w:t>
+      </w:r>
+      <w:r>
+        <w:t xml:space="preserve">(se sugiere desactivarlo).</w:t>
+      </w:r>
+    </w:p>
+    <w:bookmarkEnd w:id="26"/>
+    <w:bookmarkStart w:id="27" w:name="aún-no-existe"/>
     <w:p>
       <w:pPr>
         <w:pStyle w:val="Heading2"/>
@@ -4974,8 +5953,8 @@
         <w:t xml:space="preserve">Importación desde Excel.</w:t>
       </w:r>
     </w:p>
-    <w:bookmarkEnd w:id="26"/>
     <w:bookmarkEnd w:id="27"/>
+    <w:bookmarkEnd w:id="28"/>
     <w:sectPr/>
   </w:body>
 </w:document>

</xml_diff>

<commit_message>
Docs: decisión 32 (especialistas con perfil, solo la dueña)
Contrato de la API, modelo de datos, manual técnico, manual de
instalación (migración 007) y manual de usuario (sección 5.13 con dos
capturas nuevas). Word de para-drive regenerados.
</commit_message>
<xml_diff>
--- a/docs/para-drive/Contrato de la API.docx
+++ b/docs/para-drive/Contrato de la API.docx
@@ -3041,55 +3041,7 @@
         <w:t xml:space="preserve"> </w:t>
       </w:r>
       <w:r>
-        <w:t xml:space="preserve">-</w:t>
-      </w:r>
-      <w:r>
-        <w:t xml:space="preserve"> </w:t>
-      </w:r>
-      <w:r>
-        <w:rPr>
-          <w:rStyle w:val="VerbatimChar"/>
-        </w:rPr>
-        <w:t xml:space="preserve">POST /admin/especialistas</w:t>
-      </w:r>
-      <w:r>
-        <w:t xml:space="preserve"> </w:t>
-      </w:r>
-      <w:r>
-        <w:rPr>
-          <w:rStyle w:val="VerbatimChar"/>
-        </w:rPr>
-        <w:t xml:space="preserve">{ nombre, especialidadIds: [1, 3] }</w:t>
-      </w:r>
-      <w:r>
-        <w:t xml:space="preserve"> </w:t>
-      </w:r>
-      <w:r>
-        <w:t xml:space="preserve">(al menos una) → 201</w:t>
-      </w:r>
-      <w:r>
-        <w:t xml:space="preserve"> </w:t>
-      </w:r>
-      <w:r>
-        <w:t xml:space="preserve">-</w:t>
-      </w:r>
-      <w:r>
-        <w:t xml:space="preserve"> </w:t>
-      </w:r>
-      <w:r>
-        <w:rPr>
-          <w:rStyle w:val="VerbatimChar"/>
-        </w:rPr>
-        <w:t xml:space="preserve">PATCH /admin/especialistas/:id</w:t>
-      </w:r>
-      <w:r>
-        <w:t xml:space="preserve"> </w:t>
-      </w:r>
-      <w:r>
-        <w:rPr>
-          <w:rStyle w:val="VerbatimChar"/>
-        </w:rPr>
-        <w:t xml:space="preserve">{ nombre?, activo?, especialidadIds? }</w:t>
+        <w:t xml:space="preserve">(sin perfil). Crearlos y editarlos es solo de la dueña (sección 5).</w:t>
       </w:r>
     </w:p>
     <w:p>
@@ -5929,6 +5881,223 @@
       </w:r>
       <w:r>
         <w:t xml:space="preserve">(se sugiere desactivarlo).</w:t>
+      </w:r>
+    </w:p>
+    <w:p>
+      <w:pPr>
+        <w:pStyle w:val="BodyText"/>
+      </w:pPr>
+      <w:r>
+        <w:rPr>
+          <w:bCs/>
+          <w:b/>
+        </w:rPr>
+        <w:t xml:space="preserve">Especialistas (perfil interno, decisión 32)</w:t>
+      </w:r>
+      <w:r>
+        <w:t xml:space="preserve"> </w:t>
+      </w:r>
+      <w:r>
+        <w:t xml:space="preserve">-</w:t>
+      </w:r>
+      <w:r>
+        <w:t xml:space="preserve"> </w:t>
+      </w:r>
+      <w:r>
+        <w:rPr>
+          <w:rStyle w:val="VerbatimChar"/>
+        </w:rPr>
+        <w:t xml:space="preserve">GET /superadmin/especialistas</w:t>
+      </w:r>
+      <w:r>
+        <w:t xml:space="preserve"> </w:t>
+      </w:r>
+      <w:r>
+        <w:t xml:space="preserve">→</w:t>
+      </w:r>
+      <w:r>
+        <w:t xml:space="preserve"> </w:t>
+      </w:r>
+      <w:r>
+        <w:rPr>
+          <w:rStyle w:val="VerbatimChar"/>
+        </w:rPr>
+        <w:t xml:space="preserve">[{ id, nombre, titulo, foto, activo, especialidades: [{ id, nombre }] }]</w:t>
+      </w:r>
+      <w:r>
+        <w:t xml:space="preserve">.</w:t>
+      </w:r>
+      <w:r>
+        <w:t xml:space="preserve"> </w:t>
+      </w:r>
+      <w:r>
+        <w:rPr>
+          <w:rStyle w:val="VerbatimChar"/>
+        </w:rPr>
+        <w:t xml:space="preserve">foto</w:t>
+      </w:r>
+      <w:r>
+        <w:t xml:space="preserve"> </w:t>
+      </w:r>
+      <w:r>
+        <w:t xml:space="preserve">es un data URL (</w:t>
+      </w:r>
+      <w:r>
+        <w:rPr>
+          <w:rStyle w:val="VerbatimChar"/>
+        </w:rPr>
+        <w:t xml:space="preserve">data:image/jpeg;base64,…</w:t>
+      </w:r>
+      <w:r>
+        <w:t xml:space="preserve">) o</w:t>
+      </w:r>
+      <w:r>
+        <w:t xml:space="preserve"> </w:t>
+      </w:r>
+      <w:r>
+        <w:rPr>
+          <w:rStyle w:val="VerbatimChar"/>
+        </w:rPr>
+        <w:t xml:space="preserve">null</w:t>
+      </w:r>
+      <w:r>
+        <w:t xml:space="preserve">.</w:t>
+      </w:r>
+      <w:r>
+        <w:t xml:space="preserve"> </w:t>
+      </w:r>
+      <w:r>
+        <w:t xml:space="preserve">-</w:t>
+      </w:r>
+      <w:r>
+        <w:t xml:space="preserve"> </w:t>
+      </w:r>
+      <w:r>
+        <w:rPr>
+          <w:rStyle w:val="VerbatimChar"/>
+        </w:rPr>
+        <w:t xml:space="preserve">POST /superadmin/especialistas</w:t>
+      </w:r>
+      <w:r>
+        <w:t xml:space="preserve"> </w:t>
+      </w:r>
+      <w:r>
+        <w:rPr>
+          <w:rStyle w:val="VerbatimChar"/>
+        </w:rPr>
+        <w:t xml:space="preserve">{ nombre, titulo?, especialidadIds: [1, 3] }</w:t>
+      </w:r>
+      <w:r>
+        <w:t xml:space="preserve"> </w:t>
+      </w:r>
+      <w:r>
+        <w:t xml:space="preserve">(al menos una) → 201 con el perfil.</w:t>
+      </w:r>
+      <w:r>
+        <w:t xml:space="preserve"> </w:t>
+      </w:r>
+      <w:r>
+        <w:t xml:space="preserve">-</w:t>
+      </w:r>
+      <w:r>
+        <w:t xml:space="preserve"> </w:t>
+      </w:r>
+      <w:r>
+        <w:rPr>
+          <w:rStyle w:val="VerbatimChar"/>
+        </w:rPr>
+        <w:t xml:space="preserve">PATCH /superadmin/especialistas/:id</w:t>
+      </w:r>
+      <w:r>
+        <w:t xml:space="preserve"> </w:t>
+      </w:r>
+      <w:r>
+        <w:rPr>
+          <w:rStyle w:val="VerbatimChar"/>
+        </w:rPr>
+        <w:t xml:space="preserve">{ nombre?, titulo?, activo?, especialidadIds? }</w:t>
+      </w:r>
+      <w:r>
+        <w:t xml:space="preserve">.</w:t>
+      </w:r>
+      <w:r>
+        <w:t xml:space="preserve"> </w:t>
+      </w:r>
+      <w:r>
+        <w:rPr>
+          <w:rStyle w:val="VerbatimChar"/>
+        </w:rPr>
+        <w:t xml:space="preserve">titulo: ""</w:t>
+      </w:r>
+      <w:r>
+        <w:t xml:space="preserve"> </w:t>
+      </w:r>
+      <w:r>
+        <w:t xml:space="preserve">lo borra.</w:t>
+      </w:r>
+      <w:r>
+        <w:t xml:space="preserve"> </w:t>
+      </w:r>
+      <w:r>
+        <w:t xml:space="preserve">-</w:t>
+      </w:r>
+      <w:r>
+        <w:t xml:space="preserve"> </w:t>
+      </w:r>
+      <w:r>
+        <w:rPr>
+          <w:rStyle w:val="VerbatimChar"/>
+        </w:rPr>
+        <w:t xml:space="preserve">PUT /superadmin/especialistas/:id/foto</w:t>
+      </w:r>
+      <w:r>
+        <w:t xml:space="preserve"> </w:t>
+      </w:r>
+      <w:r>
+        <w:rPr>
+          <w:rStyle w:val="VerbatimChar"/>
+        </w:rPr>
+        <w:t xml:space="preserve">{ imagen: "data:image/jpeg;base64,…" }</w:t>
+      </w:r>
+      <w:r>
+        <w:t xml:space="preserve"> </w:t>
+      </w:r>
+      <w:r>
+        <w:t xml:space="preserve">→ el perfil. JPG, PNG o WEBP; se revisan los primeros bytes; más de 300 KB →</w:t>
+      </w:r>
+      <w:r>
+        <w:t xml:space="preserve"> </w:t>
+      </w:r>
+      <w:r>
+        <w:rPr>
+          <w:bCs/>
+          <w:b/>
+        </w:rPr>
+        <w:t xml:space="preserve">413</w:t>
+      </w:r>
+      <w:r>
+        <w:t xml:space="preserve">. El panel la manda ya reducida a 400×400 px.</w:t>
+      </w:r>
+      <w:r>
+        <w:t xml:space="preserve"> </w:t>
+      </w:r>
+      <w:r>
+        <w:t xml:space="preserve">-</w:t>
+      </w:r>
+      <w:r>
+        <w:t xml:space="preserve"> </w:t>
+      </w:r>
+      <w:r>
+        <w:rPr>
+          <w:rStyle w:val="VerbatimChar"/>
+        </w:rPr>
+        <w:t xml:space="preserve">DELETE /superadmin/especialistas/:id/foto</w:t>
+      </w:r>
+      <w:r>
+        <w:t xml:space="preserve"> </w:t>
+      </w:r>
+      <w:r>
+        <w:t xml:space="preserve">→ el perfil sin foto.</w:t>
       </w:r>
     </w:p>
     <w:bookmarkEnd w:id="26"/>

</xml_diff>